<commit_message>
Add terminal pictures of each Git command to the lab report.
</commit_message>
<xml_diff>
--- a/Lab Report - Git Commands.docx
+++ b/Lab Report - Git Commands.docx
@@ -59,7 +59,6 @@
     </w:p>
     <w:p>
       <w:pPr>
-        <w:spacing w:line="240" w:lineRule="auto"/>
         <w:jc w:val="both"/>
         <w:rPr>
           <w:rFonts w:ascii="Times New Roman" w:hAnsi="Times New Roman" w:cs="Times New Roman"/>
@@ -141,7 +140,6 @@
     </w:p>
     <w:p>
       <w:pPr>
-        <w:spacing w:line="240" w:lineRule="auto"/>
         <w:jc w:val="both"/>
         <w:rPr>
           <w:rFonts w:ascii="Times New Roman" w:hAnsi="Times New Roman" w:cs="Times New Roman"/>
@@ -151,7 +149,7 @@
         <w:rPr>
           <w:rFonts w:ascii="Times New Roman" w:hAnsi="Times New Roman" w:cs="Times New Roman"/>
         </w:rPr>
-        <w:t>The aim of this lab is to write a simple C++ program and publish it to GitHub from the terminal. The program only prints a message with cout. The same repository is then updated with a cleaner version of the program, and every Git command used in that work is recorded in this report.</w:t>
+        <w:t>The aim of this lab is to write a simple C++ program and publish it to GitHub from the terminal. The program only prints a message with cout. This report lists every Git command that was used, explains what that command does, and shows a picture of the terminal output beside it.</w:t>
       </w:r>
     </w:p>
     <w:p>
@@ -175,7 +173,6 @@
     </w:p>
     <w:p>
       <w:pPr>
-        <w:spacing w:line="240" w:lineRule="auto"/>
         <w:jc w:val="both"/>
         <w:rPr>
           <w:rFonts w:ascii="Times New Roman" w:hAnsi="Times New Roman" w:cs="Times New Roman"/>
@@ -185,141 +182,11 @@
         <w:rPr>
           <w:rFonts w:ascii="Times New Roman" w:hAnsi="Times New Roman" w:cs="Times New Roman"/>
         </w:rPr>
-        <w:t>The source file is hello.cpp. It includes iostream, starts main, prints two lines with cout, and returns 0. There is no input, no menu, and no calculation.</w:t>
-      </w:r>
-    </w:p>
-    <w:p>
-      <w:pPr>
-        <w:spacing w:after="40"/>
-        <w:ind w:left="360"/>
-        <w:rPr>
-          <w:rFonts w:ascii="Consolas" w:hAnsi="Consolas"/>
-          <w:sz w:val="22"/>
-        </w:rPr>
-      </w:pPr>
-      <w:r>
-        <w:rPr>
-          <w:rFonts w:ascii="Consolas" w:hAnsi="Consolas"/>
-          <w:sz w:val="22"/>
-        </w:rPr>
-        <w:t>#include &lt;iostream&gt;</w:t>
-      </w:r>
-    </w:p>
-    <w:p>
-      <w:pPr>
-        <w:spacing w:after="40"/>
-        <w:ind w:left="360"/>
-        <w:rPr>
-          <w:rFonts w:ascii="Consolas" w:hAnsi="Consolas"/>
-          <w:sz w:val="22"/>
-        </w:rPr>
-      </w:pPr>
-      <w:r>
-        <w:rPr>
-          <w:rFonts w:ascii="Consolas" w:hAnsi="Consolas"/>
-          <w:sz w:val="22"/>
-        </w:rPr>
-        <w:t>using namespace std;</w:t>
-      </w:r>
-    </w:p>
-    <w:p>
-      <w:pPr>
-        <w:spacing w:after="40"/>
-        <w:ind w:left="360"/>
-        <w:rPr>
-          <w:rFonts w:ascii="Consolas" w:hAnsi="Consolas"/>
-          <w:sz w:val="22"/>
-        </w:rPr>
-      </w:pPr>
-    </w:p>
-    <w:p>
-      <w:pPr>
-        <w:spacing w:after="40"/>
-        <w:ind w:left="360"/>
-        <w:rPr>
-          <w:rFonts w:ascii="Consolas" w:hAnsi="Consolas"/>
-          <w:sz w:val="22"/>
-        </w:rPr>
-      </w:pPr>
-      <w:r>
-        <w:rPr>
-          <w:rFonts w:ascii="Consolas" w:hAnsi="Consolas"/>
-          <w:sz w:val="22"/>
-        </w:rPr>
-        <w:t>int main() {</w:t>
-      </w:r>
-    </w:p>
-    <w:p>
-      <w:pPr>
-        <w:spacing w:after="40"/>
-        <w:ind w:left="360"/>
-        <w:rPr>
-          <w:rFonts w:ascii="Consolas" w:hAnsi="Consolas"/>
-          <w:sz w:val="22"/>
-        </w:rPr>
-      </w:pPr>
-      <w:r>
-        <w:rPr>
-          <w:rFonts w:ascii="Consolas" w:hAnsi="Consolas"/>
-          <w:sz w:val="22"/>
-        </w:rPr>
-        <w:t xml:space="preserve">    cout &lt;&lt; "Hello, Software Construction and Development Lab!" &lt;&lt; endl;</w:t>
-      </w:r>
-    </w:p>
-    <w:p>
-      <w:pPr>
-        <w:spacing w:after="40"/>
-        <w:ind w:left="360"/>
-        <w:rPr>
-          <w:rFonts w:ascii="Consolas" w:hAnsi="Consolas"/>
-          <w:sz w:val="22"/>
-        </w:rPr>
-      </w:pPr>
-      <w:r>
-        <w:rPr>
-          <w:rFonts w:ascii="Consolas" w:hAnsi="Consolas"/>
-          <w:sz w:val="22"/>
-        </w:rPr>
-        <w:t xml:space="preserve">    cout &lt;&lt; "This is a simple C++ program." &lt;&lt; endl;</w:t>
-      </w:r>
-    </w:p>
-    <w:p>
-      <w:pPr>
-        <w:spacing w:after="40"/>
-        <w:ind w:left="360"/>
-        <w:rPr>
-          <w:rFonts w:ascii="Consolas" w:hAnsi="Consolas"/>
-          <w:sz w:val="22"/>
-        </w:rPr>
-      </w:pPr>
-      <w:r>
-        <w:rPr>
-          <w:rFonts w:ascii="Consolas" w:hAnsi="Consolas"/>
-          <w:sz w:val="22"/>
-        </w:rPr>
-        <w:t xml:space="preserve">    return 0;</w:t>
-      </w:r>
-    </w:p>
-    <w:p>
-      <w:pPr>
-        <w:spacing w:after="40"/>
-        <w:ind w:left="360"/>
-        <w:rPr>
-          <w:rFonts w:ascii="Consolas" w:hAnsi="Consolas"/>
-          <w:sz w:val="22"/>
-        </w:rPr>
-      </w:pPr>
-      <w:r>
-        <w:rPr>
-          <w:rFonts w:ascii="Consolas" w:hAnsi="Consolas"/>
-          <w:sz w:val="22"/>
-        </w:rPr>
-        <w:t>}</w:t>
-      </w:r>
-    </w:p>
-    <w:p>
-      <w:pPr>
-        <w:spacing w:line="240" w:lineRule="auto"/>
+        <w:t>The source file is hello.cpp. It prints two lines with cout and then ends.</w:t>
+      </w:r>
+    </w:p>
+    <w:p>
+      <w:pPr>
         <w:jc w:val="both"/>
         <w:rPr>
           <w:rFonts w:ascii="Times New Roman" w:hAnsi="Times New Roman" w:cs="Times New Roman"/>
@@ -329,46 +196,11 @@
         <w:rPr>
           <w:rFonts w:ascii="Times New Roman" w:hAnsi="Times New Roman" w:cs="Times New Roman"/>
         </w:rPr>
-        <w:t>Expected output:</w:t>
-      </w:r>
-    </w:p>
-    <w:p>
-      <w:pPr>
-        <w:spacing w:after="40"/>
-        <w:ind w:left="360"/>
-        <w:rPr>
-          <w:rFonts w:ascii="Consolas" w:hAnsi="Consolas"/>
-          <w:sz w:val="22"/>
-        </w:rPr>
-      </w:pPr>
-      <w:r>
-        <w:rPr>
-          <w:rFonts w:ascii="Consolas" w:hAnsi="Consolas"/>
-          <w:sz w:val="22"/>
-        </w:rPr>
-        <w:t>Hello, Software Construction and Development Lab!</w:t>
-      </w:r>
-    </w:p>
-    <w:p>
-      <w:pPr>
-        <w:spacing w:after="40"/>
-        <w:ind w:left="360"/>
-        <w:rPr>
-          <w:rFonts w:ascii="Consolas" w:hAnsi="Consolas"/>
-          <w:sz w:val="22"/>
-        </w:rPr>
-      </w:pPr>
-      <w:r>
-        <w:rPr>
-          <w:rFonts w:ascii="Consolas" w:hAnsi="Consolas"/>
-          <w:sz w:val="22"/>
-        </w:rPr>
-        <w:t>This is a simple C++ program.</w:t>
-      </w:r>
-    </w:p>
-    <w:p>
-      <w:pPr>
-        <w:spacing w:line="240" w:lineRule="auto"/>
+        <w:t>Expected output: Hello, Software Construction and Development Lab! followed by This is a simple C++ program.</w:t>
+      </w:r>
+    </w:p>
+    <w:p>
+      <w:pPr>
         <w:jc w:val="both"/>
         <w:rPr>
           <w:rFonts w:ascii="Times New Roman" w:hAnsi="Times New Roman" w:cs="Times New Roman"/>
@@ -378,56 +210,7 @@
         <w:rPr>
           <w:rFonts w:ascii="Times New Roman" w:hAnsi="Times New Roman" w:cs="Times New Roman"/>
         </w:rPr>
-        <w:t>Compile and run commands, for a machine that has g++ installed:</w:t>
-      </w:r>
-    </w:p>
-    <w:p>
-      <w:pPr>
-        <w:spacing w:after="40"/>
-        <w:ind w:left="360"/>
-        <w:rPr>
-          <w:rFonts w:ascii="Consolas" w:hAnsi="Consolas"/>
-          <w:sz w:val="22"/>
-        </w:rPr>
-      </w:pPr>
-      <w:r>
-        <w:rPr>
-          <w:rFonts w:ascii="Consolas" w:hAnsi="Consolas"/>
-          <w:sz w:val="22"/>
-        </w:rPr>
-        <w:t>g++ -o hello hello.cpp</w:t>
-      </w:r>
-    </w:p>
-    <w:p>
-      <w:pPr>
-        <w:spacing w:after="40"/>
-        <w:ind w:left="360"/>
-        <w:rPr>
-          <w:rFonts w:ascii="Consolas" w:hAnsi="Consolas"/>
-          <w:sz w:val="22"/>
-        </w:rPr>
-      </w:pPr>
-      <w:r>
-        <w:rPr>
-          <w:rFonts w:ascii="Consolas" w:hAnsi="Consolas"/>
-          <w:sz w:val="22"/>
-        </w:rPr>
-        <w:t>.\hello.exe</w:t>
-      </w:r>
-    </w:p>
-    <w:p>
-      <w:pPr>
-        <w:spacing w:line="240" w:lineRule="auto"/>
-        <w:jc w:val="both"/>
-        <w:rPr>
-          <w:rFonts w:ascii="Times New Roman" w:hAnsi="Times New Roman" w:cs="Times New Roman"/>
-        </w:rPr>
-      </w:pPr>
-      <w:r>
-        <w:rPr>
-          <w:rFonts w:ascii="Times New Roman" w:hAnsi="Times New Roman" w:cs="Times New Roman"/>
-        </w:rPr>
-        <w:t>g++ translates the source file into the program hello.exe. The second command runs that program. This computer does not have g++ installed, so the program was published as source code and was not executed here.</w:t>
+        <w:t>On a computer that has g++ installed, the compile and run commands are g++ -o hello hello.cpp and then .\hello.exe. g++ turns the source file into hello.exe. The second command runs it. This PC does not have g++ installed, so the source was published and the program was not executed here.</w:t>
       </w:r>
     </w:p>
     <w:p>
@@ -451,7 +234,6 @@
     </w:p>
     <w:p>
       <w:pPr>
-        <w:spacing w:line="240" w:lineRule="auto"/>
         <w:jc w:val="both"/>
         <w:rPr>
           <w:rFonts w:ascii="Times New Roman" w:hAnsi="Times New Roman" w:cs="Times New Roman"/>
@@ -461,7 +243,7 @@
         <w:rPr>
           <w:rFonts w:ascii="Times New Roman" w:hAnsi="Times New Roman" w:cs="Times New Roman"/>
         </w:rPr>
-        <w:t>Git keeps four places in mind. The working folder is the files you edit, such as hello.cpp. The staging area is the waiting list of changes that will go into the next save. The local repository is the history stored in the hidden .git folder on this PC. The remote repository is the copy on GitHub. A command moves work from one of these places to the next.</w:t>
+        <w:t>Git keeps four places in mind. The working folder is the files you edit, such as hello.cpp. The staging area is the waiting list of changes for the next save. The local repository is the history stored in the hidden .git folder on this PC. The remote repository is the copy on GitHub. Each command below moves work from one of these places to the next. The pictures are the terminal output from this lab.</w:t>
       </w:r>
     </w:p>
     <w:p>
@@ -480,7 +262,7 @@
           <w:b/>
           <w:sz w:val="32"/>
         </w:rPr>
-        <w:t>4. Commands and how they work</w:t>
+        <w:t>4. Commands, how they work, and their pictures</w:t>
       </w:r>
     </w:p>
     <w:p>
@@ -504,7 +286,6 @@
     </w:p>
     <w:p>
       <w:pPr>
-        <w:spacing w:line="240" w:lineRule="auto"/>
         <w:jc w:val="both"/>
         <w:rPr>
           <w:rFonts w:ascii="Times New Roman" w:hAnsi="Times New Roman" w:cs="Times New Roman"/>
@@ -514,7 +295,82 @@
         <w:rPr>
           <w:rFonts w:ascii="Times New Roman" w:hAnsi="Times New Roman" w:cs="Times New Roman"/>
         </w:rPr>
-        <w:t>Prints the installed Git version. This lab used Git 2.55.0 for Windows. It does not change any file.</w:t>
+        <w:t>Prints the installed Git version. It does not change any file. This lab used Git 2.55.0 for Windows.</w:t>
+      </w:r>
+    </w:p>
+    <w:p>
+      <w:pPr>
+        <w:spacing w:before="120" w:after="40"/>
+        <w:jc w:val="center"/>
+        <w:rPr>
+          <w:rFonts w:ascii="Times New Roman" w:hAnsi="Times New Roman" w:cs="Times New Roman"/>
+        </w:rPr>
+      </w:pPr>
+      <w:r>
+        <w:rPr>
+          <w:rFonts w:ascii="Times New Roman" w:hAnsi="Times New Roman" w:cs="Times New Roman"/>
+          <w:noProof/>
+        </w:rPr>
+        <w:drawing>
+          <wp:inline distT="0" distB="0" distL="0" distR="0" wp14:anchorId="26C15318" wp14:editId="36D6A55B">
+            <wp:extent cx="5715000" cy="841986"/>
+            <wp:effectExtent l="0" t="0" r="0" b="0"/>
+            <wp:docPr id="407034428" name="Picture 1"/>
+            <wp:cNvGraphicFramePr>
+              <a:graphicFrameLocks xmlns:a="http://schemas.openxmlformats.org/drawingml/2006/main" noChangeAspect="1"/>
+            </wp:cNvGraphicFramePr>
+            <a:graphic xmlns:a="http://schemas.openxmlformats.org/drawingml/2006/main">
+              <a:graphicData uri="http://schemas.openxmlformats.org/drawingml/2006/picture">
+                <pic:pic xmlns:pic="http://schemas.openxmlformats.org/drawingml/2006/picture">
+                  <pic:nvPicPr>
+                    <pic:cNvPr id="407034428" name=""/>
+                    <pic:cNvPicPr/>
+                  </pic:nvPicPr>
+                  <pic:blipFill>
+                    <a:blip r:embed="rId4">
+                      <a:extLst>
+                        <a:ext uri="{28A0092B-C50C-407E-A947-70E740481C1C}">
+                          <a14:useLocalDpi xmlns:a14="http://schemas.microsoft.com/office/drawing/2010/main" val="0"/>
+                        </a:ext>
+                      </a:extLst>
+                    </a:blip>
+                    <a:stretch>
+                      <a:fillRect/>
+                    </a:stretch>
+                  </pic:blipFill>
+                  <pic:spPr>
+                    <a:xfrm>
+                      <a:off x="0" y="0"/>
+                      <a:ext cx="5715000" cy="841986"/>
+                    </a:xfrm>
+                    <a:prstGeom prst="rect">
+                      <a:avLst/>
+                    </a:prstGeom>
+                  </pic:spPr>
+                </pic:pic>
+              </a:graphicData>
+            </a:graphic>
+          </wp:inline>
+        </w:drawing>
+      </w:r>
+    </w:p>
+    <w:p>
+      <w:pPr>
+        <w:spacing w:after="200"/>
+        <w:jc w:val="center"/>
+        <w:rPr>
+          <w:rFonts w:ascii="Times New Roman" w:hAnsi="Times New Roman" w:cs="Times New Roman"/>
+          <w:i/>
+          <w:sz w:val="22"/>
+        </w:rPr>
+      </w:pPr>
+      <w:r>
+        <w:rPr>
+          <w:rFonts w:ascii="Times New Roman" w:hAnsi="Times New Roman" w:cs="Times New Roman"/>
+          <w:i/>
+          <w:sz w:val="22"/>
+        </w:rPr>
+        <w:t>Figure 1. Output of git --version.</w:t>
       </w:r>
     </w:p>
     <w:p>
@@ -533,7 +389,96 @@
           <w:b/>
           <w:sz w:val="26"/>
         </w:rPr>
-        <w:t>git config --global user.name</w:t>
+        <w:t>git init -b main</w:t>
+      </w:r>
+    </w:p>
+    <w:p>
+      <w:pPr>
+        <w:jc w:val="both"/>
+        <w:rPr>
+          <w:rFonts w:ascii="Times New Roman" w:hAnsi="Times New Roman" w:cs="Times New Roman"/>
+        </w:rPr>
+      </w:pPr>
+      <w:r>
+        <w:rPr>
+          <w:rFonts w:ascii="Times New Roman" w:hAnsi="Times New Roman" w:cs="Times New Roman"/>
+        </w:rPr>
+        <w:t>Creates a new local repository in the current folder and names the first branch main. After this command, a hidden .git folder holds the history. Nothing is uploaded yet.</w:t>
+      </w:r>
+    </w:p>
+    <w:p>
+      <w:pPr>
+        <w:spacing w:before="120" w:after="40"/>
+        <w:jc w:val="center"/>
+        <w:rPr>
+          <w:rFonts w:ascii="Times New Roman" w:hAnsi="Times New Roman" w:cs="Times New Roman"/>
+        </w:rPr>
+      </w:pPr>
+      <w:r>
+        <w:rPr>
+          <w:rFonts w:ascii="Times New Roman" w:hAnsi="Times New Roman" w:cs="Times New Roman"/>
+          <w:noProof/>
+        </w:rPr>
+        <w:drawing>
+          <wp:inline distT="0" distB="0" distL="0" distR="0" wp14:anchorId="0A17AE4B" wp14:editId="6DC13604">
+            <wp:extent cx="5715000" cy="981197"/>
+            <wp:effectExtent l="0" t="0" r="0" b="9525"/>
+            <wp:docPr id="1485042984" name="Picture 2"/>
+            <wp:cNvGraphicFramePr>
+              <a:graphicFrameLocks xmlns:a="http://schemas.openxmlformats.org/drawingml/2006/main" noChangeAspect="1"/>
+            </wp:cNvGraphicFramePr>
+            <a:graphic xmlns:a="http://schemas.openxmlformats.org/drawingml/2006/main">
+              <a:graphicData uri="http://schemas.openxmlformats.org/drawingml/2006/picture">
+                <pic:pic xmlns:pic="http://schemas.openxmlformats.org/drawingml/2006/picture">
+                  <pic:nvPicPr>
+                    <pic:cNvPr id="1485042984" name=""/>
+                    <pic:cNvPicPr/>
+                  </pic:nvPicPr>
+                  <pic:blipFill>
+                    <a:blip r:embed="rId5">
+                      <a:extLst>
+                        <a:ext uri="{28A0092B-C50C-407E-A947-70E740481C1C}">
+                          <a14:useLocalDpi xmlns:a14="http://schemas.microsoft.com/office/drawing/2010/main" val="0"/>
+                        </a:ext>
+                      </a:extLst>
+                    </a:blip>
+                    <a:stretch>
+                      <a:fillRect/>
+                    </a:stretch>
+                  </pic:blipFill>
+                  <pic:spPr>
+                    <a:xfrm>
+                      <a:off x="0" y="0"/>
+                      <a:ext cx="5715000" cy="981197"/>
+                    </a:xfrm>
+                    <a:prstGeom prst="rect">
+                      <a:avLst/>
+                    </a:prstGeom>
+                  </pic:spPr>
+                </pic:pic>
+              </a:graphicData>
+            </a:graphic>
+          </wp:inline>
+        </w:drawing>
+      </w:r>
+    </w:p>
+    <w:p>
+      <w:pPr>
+        <w:spacing w:after="200"/>
+        <w:jc w:val="center"/>
+        <w:rPr>
+          <w:rFonts w:ascii="Times New Roman" w:hAnsi="Times New Roman" w:cs="Times New Roman"/>
+          <w:i/>
+          <w:sz w:val="22"/>
+        </w:rPr>
+      </w:pPr>
+      <w:r>
+        <w:rPr>
+          <w:rFonts w:ascii="Times New Roman" w:hAnsi="Times New Roman" w:cs="Times New Roman"/>
+          <w:i/>
+          <w:sz w:val="22"/>
+        </w:rPr>
+        <w:t>Figure 2. Output of git init -b main.</w:t>
       </w:r>
     </w:p>
     <w:p>
@@ -552,12 +497,11 @@
           <w:b/>
           <w:sz w:val="26"/>
         </w:rPr>
-        <w:t>git config --global user.email</w:t>
-      </w:r>
-    </w:p>
-    <w:p>
-      <w:pPr>
-        <w:spacing w:line="240" w:lineRule="auto"/>
+        <w:t>git add .</w:t>
+      </w:r>
+    </w:p>
+    <w:p>
+      <w:pPr>
         <w:jc w:val="both"/>
         <w:rPr>
           <w:rFonts w:ascii="Times New Roman" w:hAnsi="Times New Roman" w:cs="Times New Roman"/>
@@ -567,7 +511,7 @@
         <w:rPr>
           <w:rFonts w:ascii="Times New Roman" w:hAnsi="Times New Roman" w:cs="Times New Roman"/>
         </w:rPr>
-        <w:t>These two commands only read the name and email already saved in Git. Git writes that name and email on every commit so the history shows who made the change. They were used to confirm the identity before the first commit. They were not used to change the settings. The name on this PC is ali-ghiax.</w:t>
+        <w:t>Copies new and modified files into the staging area. The dot means the current folder. The first use staged .gitignore, README.md, and the original C++ file.</w:t>
       </w:r>
     </w:p>
     <w:p>
@@ -586,12 +530,11 @@
           <w:b/>
           <w:sz w:val="26"/>
         </w:rPr>
-        <w:t>git init -b main</w:t>
-      </w:r>
-    </w:p>
-    <w:p>
-      <w:pPr>
-        <w:spacing w:line="240" w:lineRule="auto"/>
+        <w:t>git status</w:t>
+      </w:r>
+    </w:p>
+    <w:p>
+      <w:pPr>
         <w:jc w:val="both"/>
         <w:rPr>
           <w:rFonts w:ascii="Times New Roman" w:hAnsi="Times New Roman" w:cs="Times New Roman"/>
@@ -601,7 +544,82 @@
         <w:rPr>
           <w:rFonts w:ascii="Times New Roman" w:hAnsi="Times New Roman" w:cs="Times New Roman"/>
         </w:rPr>
-        <w:t>Creates a new local repository in the current folder and names the first branch main. After this command, a hidden .git folder exists. That folder holds the history. The project files themselves are not uploaded yet.</w:t>
+        <w:t>Shows the current branch and lists files that are new, changed, or waiting to be committed. It only reports the state. It does not change files.</w:t>
+      </w:r>
+    </w:p>
+    <w:p>
+      <w:pPr>
+        <w:spacing w:before="120" w:after="40"/>
+        <w:jc w:val="center"/>
+        <w:rPr>
+          <w:rFonts w:ascii="Times New Roman" w:hAnsi="Times New Roman" w:cs="Times New Roman"/>
+        </w:rPr>
+      </w:pPr>
+      <w:r>
+        <w:rPr>
+          <w:rFonts w:ascii="Times New Roman" w:hAnsi="Times New Roman" w:cs="Times New Roman"/>
+          <w:noProof/>
+        </w:rPr>
+        <w:drawing>
+          <wp:inline distT="0" distB="0" distL="0" distR="0" wp14:anchorId="3D15AB75" wp14:editId="7504BD78">
+            <wp:extent cx="5715000" cy="2459404"/>
+            <wp:effectExtent l="0" t="0" r="0" b="0"/>
+            <wp:docPr id="1448779054" name="Picture 3"/>
+            <wp:cNvGraphicFramePr>
+              <a:graphicFrameLocks xmlns:a="http://schemas.openxmlformats.org/drawingml/2006/main" noChangeAspect="1"/>
+            </wp:cNvGraphicFramePr>
+            <a:graphic xmlns:a="http://schemas.openxmlformats.org/drawingml/2006/main">
+              <a:graphicData uri="http://schemas.openxmlformats.org/drawingml/2006/picture">
+                <pic:pic xmlns:pic="http://schemas.openxmlformats.org/drawingml/2006/picture">
+                  <pic:nvPicPr>
+                    <pic:cNvPr id="1448779054" name=""/>
+                    <pic:cNvPicPr/>
+                  </pic:nvPicPr>
+                  <pic:blipFill>
+                    <a:blip r:embed="rId6">
+                      <a:extLst>
+                        <a:ext uri="{28A0092B-C50C-407E-A947-70E740481C1C}">
+                          <a14:useLocalDpi xmlns:a14="http://schemas.microsoft.com/office/drawing/2010/main" val="0"/>
+                        </a:ext>
+                      </a:extLst>
+                    </a:blip>
+                    <a:stretch>
+                      <a:fillRect/>
+                    </a:stretch>
+                  </pic:blipFill>
+                  <pic:spPr>
+                    <a:xfrm>
+                      <a:off x="0" y="0"/>
+                      <a:ext cx="5715000" cy="2459404"/>
+                    </a:xfrm>
+                    <a:prstGeom prst="rect">
+                      <a:avLst/>
+                    </a:prstGeom>
+                  </pic:spPr>
+                </pic:pic>
+              </a:graphicData>
+            </a:graphic>
+          </wp:inline>
+        </w:drawing>
+      </w:r>
+    </w:p>
+    <w:p>
+      <w:pPr>
+        <w:spacing w:after="200"/>
+        <w:jc w:val="center"/>
+        <w:rPr>
+          <w:rFonts w:ascii="Times New Roman" w:hAnsi="Times New Roman" w:cs="Times New Roman"/>
+          <w:i/>
+          <w:sz w:val="22"/>
+        </w:rPr>
+      </w:pPr>
+      <w:r>
+        <w:rPr>
+          <w:rFonts w:ascii="Times New Roman" w:hAnsi="Times New Roman" w:cs="Times New Roman"/>
+          <w:i/>
+          <w:sz w:val="22"/>
+        </w:rPr>
+        <w:t>Figure 3. Output of git add . and git status before the first commit.</w:t>
       </w:r>
     </w:p>
     <w:p>
@@ -620,12 +638,11 @@
           <w:b/>
           <w:sz w:val="26"/>
         </w:rPr>
-        <w:t>git status</w:t>
-      </w:r>
-    </w:p>
-    <w:p>
-      <w:pPr>
-        <w:spacing w:line="240" w:lineRule="auto"/>
+        <w:t>git commit -m "message"</w:t>
+      </w:r>
+    </w:p>
+    <w:p>
+      <w:pPr>
         <w:jc w:val="both"/>
         <w:rPr>
           <w:rFonts w:ascii="Times New Roman" w:hAnsi="Times New Roman" w:cs="Times New Roman"/>
@@ -635,7 +652,82 @@
         <w:rPr>
           <w:rFonts w:ascii="Times New Roman" w:hAnsi="Times New Roman" w:cs="Times New Roman"/>
         </w:rPr>
-        <w:t>Shows the current branch and lists files that are new, changed, or waiting to be committed. It is a check command. It was used before each commit and again after the push to confirm that the branch matches GitHub.</w:t>
+        <w:t>Saves the staged snapshot into the local repository and stores the message with it. The first commit id is 0bdf94b.</w:t>
+      </w:r>
+    </w:p>
+    <w:p>
+      <w:pPr>
+        <w:spacing w:before="120" w:after="40"/>
+        <w:jc w:val="center"/>
+        <w:rPr>
+          <w:rFonts w:ascii="Times New Roman" w:hAnsi="Times New Roman" w:cs="Times New Roman"/>
+        </w:rPr>
+      </w:pPr>
+      <w:r>
+        <w:rPr>
+          <w:rFonts w:ascii="Times New Roman" w:hAnsi="Times New Roman" w:cs="Times New Roman"/>
+          <w:noProof/>
+        </w:rPr>
+        <w:drawing>
+          <wp:inline distT="0" distB="0" distL="0" distR="0" wp14:anchorId="1016122D" wp14:editId="123C335B">
+            <wp:extent cx="5715000" cy="1644284"/>
+            <wp:effectExtent l="0" t="0" r="0" b="0"/>
+            <wp:docPr id="2066216469" name="Picture 4"/>
+            <wp:cNvGraphicFramePr>
+              <a:graphicFrameLocks xmlns:a="http://schemas.openxmlformats.org/drawingml/2006/main" noChangeAspect="1"/>
+            </wp:cNvGraphicFramePr>
+            <a:graphic xmlns:a="http://schemas.openxmlformats.org/drawingml/2006/main">
+              <a:graphicData uri="http://schemas.openxmlformats.org/drawingml/2006/picture">
+                <pic:pic xmlns:pic="http://schemas.openxmlformats.org/drawingml/2006/picture">
+                  <pic:nvPicPr>
+                    <pic:cNvPr id="2066216469" name=""/>
+                    <pic:cNvPicPr/>
+                  </pic:nvPicPr>
+                  <pic:blipFill>
+                    <a:blip r:embed="rId7">
+                      <a:extLst>
+                        <a:ext uri="{28A0092B-C50C-407E-A947-70E740481C1C}">
+                          <a14:useLocalDpi xmlns:a14="http://schemas.microsoft.com/office/drawing/2010/main" val="0"/>
+                        </a:ext>
+                      </a:extLst>
+                    </a:blip>
+                    <a:stretch>
+                      <a:fillRect/>
+                    </a:stretch>
+                  </pic:blipFill>
+                  <pic:spPr>
+                    <a:xfrm>
+                      <a:off x="0" y="0"/>
+                      <a:ext cx="5715000" cy="1644284"/>
+                    </a:xfrm>
+                    <a:prstGeom prst="rect">
+                      <a:avLst/>
+                    </a:prstGeom>
+                  </pic:spPr>
+                </pic:pic>
+              </a:graphicData>
+            </a:graphic>
+          </wp:inline>
+        </w:drawing>
+      </w:r>
+    </w:p>
+    <w:p>
+      <w:pPr>
+        <w:spacing w:after="200"/>
+        <w:jc w:val="center"/>
+        <w:rPr>
+          <w:rFonts w:ascii="Times New Roman" w:hAnsi="Times New Roman" w:cs="Times New Roman"/>
+          <w:i/>
+          <w:sz w:val="22"/>
+        </w:rPr>
+      </w:pPr>
+      <w:r>
+        <w:rPr>
+          <w:rFonts w:ascii="Times New Roman" w:hAnsi="Times New Roman" w:cs="Times New Roman"/>
+          <w:i/>
+          <w:sz w:val="22"/>
+        </w:rPr>
+        <w:t>Figure 4. Output of the first git commit.</w:t>
       </w:r>
     </w:p>
     <w:p>
@@ -654,12 +746,11 @@
           <w:b/>
           <w:sz w:val="26"/>
         </w:rPr>
-        <w:t>git add .</w:t>
-      </w:r>
-    </w:p>
-    <w:p>
-      <w:pPr>
-        <w:spacing w:line="240" w:lineRule="auto"/>
+        <w:t>git remote add origin URL</w:t>
+      </w:r>
+    </w:p>
+    <w:p>
+      <w:pPr>
         <w:jc w:val="both"/>
         <w:rPr>
           <w:rFonts w:ascii="Times New Roman" w:hAnsi="Times New Roman" w:cs="Times New Roman"/>
@@ -669,7 +760,7 @@
         <w:rPr>
           <w:rFonts w:ascii="Times New Roman" w:hAnsi="Times New Roman" w:cs="Times New Roman"/>
         </w:rPr>
-        <w:t>Copies new and modified files into the staging area. The dot means the current folder. The first use staged .gitignore, README.md, and the original C++ file.</w:t>
+        <w:t>Saves the GitHub address under the short name origin. origin is only a nickname. The address is https://github.com/ali-ghiax/Software-Development-Contruction-Lab.git.</w:t>
       </w:r>
     </w:p>
     <w:p>
@@ -688,12 +779,11 @@
           <w:b/>
           <w:sz w:val="26"/>
         </w:rPr>
-        <w:t>git add -A</w:t>
-      </w:r>
-    </w:p>
-    <w:p>
-      <w:pPr>
-        <w:spacing w:line="240" w:lineRule="auto"/>
+        <w:t>git remote -v</w:t>
+      </w:r>
+    </w:p>
+    <w:p>
+      <w:pPr>
         <w:jc w:val="both"/>
         <w:rPr>
           <w:rFonts w:ascii="Times New Roman" w:hAnsi="Times New Roman" w:cs="Times New Roman"/>
@@ -703,7 +793,82 @@
         <w:rPr>
           <w:rFonts w:ascii="Times New Roman" w:hAnsi="Times New Roman" w:cs="Times New Roman"/>
         </w:rPr>
-        <w:t>Stages every change, including deleted files. This was required for the second update, because student_result.cpp was removed and hello.cpp was added. git add . can miss a deletion in some cases. git add -A records the deletion as well.</w:t>
+        <w:t>Lists the fetch and push addresses. It was used to confirm that origin points at the correct repository. This command prints the addresses and does not change them.</w:t>
+      </w:r>
+    </w:p>
+    <w:p>
+      <w:pPr>
+        <w:spacing w:before="120" w:after="40"/>
+        <w:jc w:val="center"/>
+        <w:rPr>
+          <w:rFonts w:ascii="Times New Roman" w:hAnsi="Times New Roman" w:cs="Times New Roman"/>
+        </w:rPr>
+      </w:pPr>
+      <w:r>
+        <w:rPr>
+          <w:rFonts w:ascii="Times New Roman" w:hAnsi="Times New Roman" w:cs="Times New Roman"/>
+          <w:noProof/>
+        </w:rPr>
+        <w:drawing>
+          <wp:inline distT="0" distB="0" distL="0" distR="0" wp14:anchorId="2587B48D" wp14:editId="0A51D2E6">
+            <wp:extent cx="5715000" cy="1340216"/>
+            <wp:effectExtent l="0" t="0" r="0" b="0"/>
+            <wp:docPr id="595142625" name="Picture 5"/>
+            <wp:cNvGraphicFramePr>
+              <a:graphicFrameLocks xmlns:a="http://schemas.openxmlformats.org/drawingml/2006/main" noChangeAspect="1"/>
+            </wp:cNvGraphicFramePr>
+            <a:graphic xmlns:a="http://schemas.openxmlformats.org/drawingml/2006/main">
+              <a:graphicData uri="http://schemas.openxmlformats.org/drawingml/2006/picture">
+                <pic:pic xmlns:pic="http://schemas.openxmlformats.org/drawingml/2006/picture">
+                  <pic:nvPicPr>
+                    <pic:cNvPr id="595142625" name=""/>
+                    <pic:cNvPicPr/>
+                  </pic:nvPicPr>
+                  <pic:blipFill>
+                    <a:blip r:embed="rId8">
+                      <a:extLst>
+                        <a:ext uri="{28A0092B-C50C-407E-A947-70E740481C1C}">
+                          <a14:useLocalDpi xmlns:a14="http://schemas.microsoft.com/office/drawing/2010/main" val="0"/>
+                        </a:ext>
+                      </a:extLst>
+                    </a:blip>
+                    <a:stretch>
+                      <a:fillRect/>
+                    </a:stretch>
+                  </pic:blipFill>
+                  <pic:spPr>
+                    <a:xfrm>
+                      <a:off x="0" y="0"/>
+                      <a:ext cx="5715000" cy="1340216"/>
+                    </a:xfrm>
+                    <a:prstGeom prst="rect">
+                      <a:avLst/>
+                    </a:prstGeom>
+                  </pic:spPr>
+                </pic:pic>
+              </a:graphicData>
+            </a:graphic>
+          </wp:inline>
+        </w:drawing>
+      </w:r>
+    </w:p>
+    <w:p>
+      <w:pPr>
+        <w:spacing w:after="200"/>
+        <w:jc w:val="center"/>
+        <w:rPr>
+          <w:rFonts w:ascii="Times New Roman" w:hAnsi="Times New Roman" w:cs="Times New Roman"/>
+          <w:i/>
+          <w:sz w:val="22"/>
+        </w:rPr>
+      </w:pPr>
+      <w:r>
+        <w:rPr>
+          <w:rFonts w:ascii="Times New Roman" w:hAnsi="Times New Roman" w:cs="Times New Roman"/>
+          <w:i/>
+          <w:sz w:val="22"/>
+        </w:rPr>
+        <w:t>Figure 5. Output of git remote add origin and git remote -v.</w:t>
       </w:r>
     </w:p>
     <w:p>
@@ -722,12 +887,11 @@
           <w:b/>
           <w:sz w:val="26"/>
         </w:rPr>
-        <w:t>git diff --cached</w:t>
-      </w:r>
-    </w:p>
-    <w:p>
-      <w:pPr>
-        <w:spacing w:line="240" w:lineRule="auto"/>
+        <w:t>git push -u origin main</w:t>
+      </w:r>
+    </w:p>
+    <w:p>
+      <w:pPr>
         <w:jc w:val="both"/>
         <w:rPr>
           <w:rFonts w:ascii="Times New Roman" w:hAnsi="Times New Roman" w:cs="Times New Roman"/>
@@ -737,7 +901,7 @@
         <w:rPr>
           <w:rFonts w:ascii="Times New Roman" w:hAnsi="Times New Roman" w:cs="Times New Roman"/>
         </w:rPr>
-        <w:t>Shows the exact staged text that the next commit will save. --stat shows only the file names and how many lines changed. This was used to review the work before committing.</w:t>
+        <w:t>Uploads the local main branch to origin. The -u flag remembers that main tracks origin/main, so later uploads can use git push. The first attempt failed because the PC could not open a connection to github.com on port 443.</w:t>
       </w:r>
     </w:p>
     <w:p>
@@ -756,12 +920,11 @@
           <w:b/>
           <w:sz w:val="26"/>
         </w:rPr>
-        <w:t>git commit -m "message"</w:t>
-      </w:r>
-    </w:p>
-    <w:p>
-      <w:pPr>
-        <w:spacing w:line="240" w:lineRule="auto"/>
+        <w:t>git -c http.version=HTTP/1.1 push -u origin main</w:t>
+      </w:r>
+    </w:p>
+    <w:p>
+      <w:pPr>
         <w:jc w:val="both"/>
         <w:rPr>
           <w:rFonts w:ascii="Times New Roman" w:hAnsi="Times New Roman" w:cs="Times New Roman"/>
@@ -771,56 +934,82 @@
         <w:rPr>
           <w:rFonts w:ascii="Times New Roman" w:hAnsi="Times New Roman" w:cs="Times New Roman"/>
         </w:rPr>
-        <w:t>Saves the staged snapshot into the local repository and attaches the message. A commit has an id, an author, a date, and the file contents. Two commits were made:</w:t>
-      </w:r>
-    </w:p>
-    <w:p>
-      <w:pPr>
-        <w:spacing w:after="40"/>
-        <w:ind w:left="360"/>
-        <w:rPr>
-          <w:rFonts w:ascii="Consolas" w:hAnsi="Consolas"/>
+        <w:t>The same upload, with one temporary setting: use HTTP version 1.1 for this command only. The -c flag does not change the saved Git settings. This attempt succeeded. Git created main on GitHub and set the local branch to track it.</w:t>
+      </w:r>
+    </w:p>
+    <w:p>
+      <w:pPr>
+        <w:spacing w:before="120" w:after="40"/>
+        <w:jc w:val="center"/>
+        <w:rPr>
+          <w:rFonts w:ascii="Times New Roman" w:hAnsi="Times New Roman" w:cs="Times New Roman"/>
+        </w:rPr>
+      </w:pPr>
+      <w:r>
+        <w:rPr>
+          <w:rFonts w:ascii="Times New Roman" w:hAnsi="Times New Roman" w:cs="Times New Roman"/>
+          <w:noProof/>
+        </w:rPr>
+        <w:drawing>
+          <wp:inline distT="0" distB="0" distL="0" distR="0" wp14:anchorId="0FC4A1C0" wp14:editId="04E391E4">
+            <wp:extent cx="5715000" cy="2307981"/>
+            <wp:effectExtent l="0" t="0" r="0" b="0"/>
+            <wp:docPr id="128006745" name="Picture 6"/>
+            <wp:cNvGraphicFramePr>
+              <a:graphicFrameLocks xmlns:a="http://schemas.openxmlformats.org/drawingml/2006/main" noChangeAspect="1"/>
+            </wp:cNvGraphicFramePr>
+            <a:graphic xmlns:a="http://schemas.openxmlformats.org/drawingml/2006/main">
+              <a:graphicData uri="http://schemas.openxmlformats.org/drawingml/2006/picture">
+                <pic:pic xmlns:pic="http://schemas.openxmlformats.org/drawingml/2006/picture">
+                  <pic:nvPicPr>
+                    <pic:cNvPr id="128006745" name=""/>
+                    <pic:cNvPicPr/>
+                  </pic:nvPicPr>
+                  <pic:blipFill>
+                    <a:blip r:embed="rId9">
+                      <a:extLst>
+                        <a:ext uri="{28A0092B-C50C-407E-A947-70E740481C1C}">
+                          <a14:useLocalDpi xmlns:a14="http://schemas.microsoft.com/office/drawing/2010/main" val="0"/>
+                        </a:ext>
+                      </a:extLst>
+                    </a:blip>
+                    <a:stretch>
+                      <a:fillRect/>
+                    </a:stretch>
+                  </pic:blipFill>
+                  <pic:spPr>
+                    <a:xfrm>
+                      <a:off x="0" y="0"/>
+                      <a:ext cx="5715000" cy="2307981"/>
+                    </a:xfrm>
+                    <a:prstGeom prst="rect">
+                      <a:avLst/>
+                    </a:prstGeom>
+                  </pic:spPr>
+                </pic:pic>
+              </a:graphicData>
+            </a:graphic>
+          </wp:inline>
+        </w:drawing>
+      </w:r>
+    </w:p>
+    <w:p>
+      <w:pPr>
+        <w:spacing w:after="200"/>
+        <w:jc w:val="center"/>
+        <w:rPr>
+          <w:rFonts w:ascii="Times New Roman" w:hAnsi="Times New Roman" w:cs="Times New Roman"/>
+          <w:i/>
           <w:sz w:val="22"/>
         </w:rPr>
       </w:pPr>
       <w:r>
         <w:rPr>
-          <w:rFonts w:ascii="Consolas" w:hAnsi="Consolas"/>
+          <w:rFonts w:ascii="Times New Roman" w:hAnsi="Times New Roman" w:cs="Times New Roman"/>
+          <w:i/>
           <w:sz w:val="22"/>
         </w:rPr>
-        <w:t>0bdf94b  Add a simple student result calculator for the lab assignment.</w:t>
-      </w:r>
-    </w:p>
-    <w:p>
-      <w:pPr>
-        <w:spacing w:after="40"/>
-        <w:ind w:left="360"/>
-        <w:rPr>
-          <w:rFonts w:ascii="Consolas" w:hAnsi="Consolas"/>
-          <w:sz w:val="22"/>
-        </w:rPr>
-      </w:pPr>
-      <w:r>
-        <w:rPr>
-          <w:rFonts w:ascii="Consolas" w:hAnsi="Consolas"/>
-          <w:sz w:val="22"/>
-        </w:rPr>
-        <w:t>d725f0c  Replace the calculator with a simple cout program.</w:t>
-      </w:r>
-    </w:p>
-    <w:p>
-      <w:pPr>
-        <w:spacing w:line="240" w:lineRule="auto"/>
-        <w:jc w:val="both"/>
-        <w:rPr>
-          <w:rFonts w:ascii="Times New Roman" w:hAnsi="Times New Roman" w:cs="Times New Roman"/>
-        </w:rPr>
-      </w:pPr>
-      <w:r>
-        <w:rPr>
-          <w:rFonts w:ascii="Times New Roman" w:hAnsi="Times New Roman" w:cs="Times New Roman"/>
-        </w:rPr>
-        <w:t>The second commit is the one that belongs to the final program. It replaced the longer calculator with hello.cpp and updated README.md.</w:t>
+        <w:t>Figure 6. The failed push, then the successful push with HTTP/1.1.</w:t>
       </w:r>
     </w:p>
     <w:p>
@@ -839,12 +1028,11 @@
           <w:b/>
           <w:sz w:val="26"/>
         </w:rPr>
-        <w:t>git log</w:t>
-      </w:r>
-    </w:p>
-    <w:p>
-      <w:pPr>
-        <w:spacing w:line="240" w:lineRule="auto"/>
+        <w:t>git add -A</w:t>
+      </w:r>
+    </w:p>
+    <w:p>
+      <w:pPr>
         <w:jc w:val="both"/>
         <w:rPr>
           <w:rFonts w:ascii="Times New Roman" w:hAnsi="Times New Roman" w:cs="Times New Roman"/>
@@ -854,7 +1042,7 @@
         <w:rPr>
           <w:rFonts w:ascii="Times New Roman" w:hAnsi="Times New Roman" w:cs="Times New Roman"/>
         </w:rPr>
-        <w:t>Prints commit history. git log -1 shows only the newest commit. git log --oneline shows one short line per commit. This was used to confirm the author, the message, and the commit id.</w:t>
+        <w:t>Stages every change, including deleted files. This was required when the program was simplified, because student_result.cpp was removed and hello.cpp was added.</w:t>
       </w:r>
     </w:p>
     <w:p>
@@ -873,12 +1061,11 @@
           <w:b/>
           <w:sz w:val="26"/>
         </w:rPr>
-        <w:t>git remote add origin URL</w:t>
-      </w:r>
-    </w:p>
-    <w:p>
-      <w:pPr>
-        <w:spacing w:line="240" w:lineRule="auto"/>
+        <w:t>Second git commit</w:t>
+      </w:r>
+    </w:p>
+    <w:p>
+      <w:pPr>
         <w:jc w:val="both"/>
         <w:rPr>
           <w:rFonts w:ascii="Times New Roman" w:hAnsi="Times New Roman" w:cs="Times New Roman"/>
@@ -888,39 +1075,82 @@
         <w:rPr>
           <w:rFonts w:ascii="Times New Roman" w:hAnsi="Times New Roman" w:cs="Times New Roman"/>
         </w:rPr>
-        <w:t>Saves the GitHub address under the short name origin. The address used is:</w:t>
-      </w:r>
-    </w:p>
-    <w:p>
-      <w:pPr>
-        <w:spacing w:after="40"/>
-        <w:ind w:left="360"/>
-        <w:rPr>
-          <w:rFonts w:ascii="Consolas" w:hAnsi="Consolas"/>
+        <w:t>The second commit, d725f0c, replaced the calculator with the cout program and updated README.md. git diff --cached --stat was used before the commit to review the size of the change: 12 lines added and 169 lines removed.</w:t>
+      </w:r>
+    </w:p>
+    <w:p>
+      <w:pPr>
+        <w:spacing w:before="120" w:after="40"/>
+        <w:jc w:val="center"/>
+        <w:rPr>
+          <w:rFonts w:ascii="Times New Roman" w:hAnsi="Times New Roman" w:cs="Times New Roman"/>
+        </w:rPr>
+      </w:pPr>
+      <w:r>
+        <w:rPr>
+          <w:rFonts w:ascii="Times New Roman" w:hAnsi="Times New Roman" w:cs="Times New Roman"/>
+          <w:noProof/>
+        </w:rPr>
+        <w:drawing>
+          <wp:inline distT="0" distB="0" distL="0" distR="0" wp14:anchorId="54779A97" wp14:editId="6113C20D">
+            <wp:extent cx="5715000" cy="3239111"/>
+            <wp:effectExtent l="0" t="0" r="0" b="0"/>
+            <wp:docPr id="206292167" name="Picture 7"/>
+            <wp:cNvGraphicFramePr>
+              <a:graphicFrameLocks xmlns:a="http://schemas.openxmlformats.org/drawingml/2006/main" noChangeAspect="1"/>
+            </wp:cNvGraphicFramePr>
+            <a:graphic xmlns:a="http://schemas.openxmlformats.org/drawingml/2006/main">
+              <a:graphicData uri="http://schemas.openxmlformats.org/drawingml/2006/picture">
+                <pic:pic xmlns:pic="http://schemas.openxmlformats.org/drawingml/2006/picture">
+                  <pic:nvPicPr>
+                    <pic:cNvPr id="206292167" name=""/>
+                    <pic:cNvPicPr/>
+                  </pic:nvPicPr>
+                  <pic:blipFill>
+                    <a:blip r:embed="rId10">
+                      <a:extLst>
+                        <a:ext uri="{28A0092B-C50C-407E-A947-70E740481C1C}">
+                          <a14:useLocalDpi xmlns:a14="http://schemas.microsoft.com/office/drawing/2010/main" val="0"/>
+                        </a:ext>
+                      </a:extLst>
+                    </a:blip>
+                    <a:stretch>
+                      <a:fillRect/>
+                    </a:stretch>
+                  </pic:blipFill>
+                  <pic:spPr>
+                    <a:xfrm>
+                      <a:off x="0" y="0"/>
+                      <a:ext cx="5715000" cy="3239111"/>
+                    </a:xfrm>
+                    <a:prstGeom prst="rect">
+                      <a:avLst/>
+                    </a:prstGeom>
+                  </pic:spPr>
+                </pic:pic>
+              </a:graphicData>
+            </a:graphic>
+          </wp:inline>
+        </w:drawing>
+      </w:r>
+    </w:p>
+    <w:p>
+      <w:pPr>
+        <w:spacing w:after="200"/>
+        <w:jc w:val="center"/>
+        <w:rPr>
+          <w:rFonts w:ascii="Times New Roman" w:hAnsi="Times New Roman" w:cs="Times New Roman"/>
+          <w:i/>
           <w:sz w:val="22"/>
         </w:rPr>
       </w:pPr>
       <w:r>
         <w:rPr>
-          <w:rFonts w:ascii="Consolas" w:hAnsi="Consolas"/>
+          <w:rFonts w:ascii="Times New Roman" w:hAnsi="Times New Roman" w:cs="Times New Roman"/>
+          <w:i/>
           <w:sz w:val="22"/>
         </w:rPr>
-        <w:t>https://github.com/ali-ghiax/Software-Development-Contruction-Lab.git</w:t>
-      </w:r>
-    </w:p>
-    <w:p>
-      <w:pPr>
-        <w:spacing w:line="240" w:lineRule="auto"/>
-        <w:jc w:val="both"/>
-        <w:rPr>
-          <w:rFonts w:ascii="Times New Roman" w:hAnsi="Times New Roman" w:cs="Times New Roman"/>
-        </w:rPr>
-      </w:pPr>
-      <w:r>
-        <w:rPr>
-          <w:rFonts w:ascii="Times New Roman" w:hAnsi="Times New Roman" w:cs="Times New Roman"/>
-        </w:rPr>
-        <w:t>origin is only a nickname. The real destination is that URL.</w:t>
+        <w:t>Figure 7. Output of git add -A, git status, and the commit that added hello.cpp.</w:t>
       </w:r>
     </w:p>
     <w:p>
@@ -939,12 +1169,11 @@
           <w:b/>
           <w:sz w:val="26"/>
         </w:rPr>
-        <w:t>git remote -v</w:t>
-      </w:r>
-    </w:p>
-    <w:p>
-      <w:pPr>
-        <w:spacing w:line="240" w:lineRule="auto"/>
+        <w:t>git log --oneline --decorate</w:t>
+      </w:r>
+    </w:p>
+    <w:p>
+      <w:pPr>
         <w:jc w:val="both"/>
         <w:rPr>
           <w:rFonts w:ascii="Times New Roman" w:hAnsi="Times New Roman" w:cs="Times New Roman"/>
@@ -954,7 +1183,82 @@
         <w:rPr>
           <w:rFonts w:ascii="Times New Roman" w:hAnsi="Times New Roman" w:cs="Times New Roman"/>
         </w:rPr>
-        <w:t>Lists the fetch and push addresses for each remote. It was used to confirm that origin points at the correct GitHub repository.</w:t>
+        <w:t>Prints the commit history, one line per commit. --decorate also shows the branch names. HEAD is the current commit. origin/main is the commit GitHub has.</w:t>
+      </w:r>
+    </w:p>
+    <w:p>
+      <w:pPr>
+        <w:spacing w:before="120" w:after="40"/>
+        <w:jc w:val="center"/>
+        <w:rPr>
+          <w:rFonts w:ascii="Times New Roman" w:hAnsi="Times New Roman" w:cs="Times New Roman"/>
+        </w:rPr>
+      </w:pPr>
+      <w:r>
+        <w:rPr>
+          <w:rFonts w:ascii="Times New Roman" w:hAnsi="Times New Roman" w:cs="Times New Roman"/>
+          <w:noProof/>
+        </w:rPr>
+        <w:drawing>
+          <wp:inline distT="0" distB="0" distL="0" distR="0" wp14:anchorId="22B62DFB" wp14:editId="5BDA53EB">
+            <wp:extent cx="5715000" cy="1300529"/>
+            <wp:effectExtent l="0" t="0" r="0" b="0"/>
+            <wp:docPr id="1596266226" name="Picture 8"/>
+            <wp:cNvGraphicFramePr>
+              <a:graphicFrameLocks xmlns:a="http://schemas.openxmlformats.org/drawingml/2006/main" noChangeAspect="1"/>
+            </wp:cNvGraphicFramePr>
+            <a:graphic xmlns:a="http://schemas.openxmlformats.org/drawingml/2006/main">
+              <a:graphicData uri="http://schemas.openxmlformats.org/drawingml/2006/picture">
+                <pic:pic xmlns:pic="http://schemas.openxmlformats.org/drawingml/2006/picture">
+                  <pic:nvPicPr>
+                    <pic:cNvPr id="1596266226" name=""/>
+                    <pic:cNvPicPr/>
+                  </pic:nvPicPr>
+                  <pic:blipFill>
+                    <a:blip r:embed="rId11">
+                      <a:extLst>
+                        <a:ext uri="{28A0092B-C50C-407E-A947-70E740481C1C}">
+                          <a14:useLocalDpi xmlns:a14="http://schemas.microsoft.com/office/drawing/2010/main" val="0"/>
+                        </a:ext>
+                      </a:extLst>
+                    </a:blip>
+                    <a:stretch>
+                      <a:fillRect/>
+                    </a:stretch>
+                  </pic:blipFill>
+                  <pic:spPr>
+                    <a:xfrm>
+                      <a:off x="0" y="0"/>
+                      <a:ext cx="5715000" cy="1300529"/>
+                    </a:xfrm>
+                    <a:prstGeom prst="rect">
+                      <a:avLst/>
+                    </a:prstGeom>
+                  </pic:spPr>
+                </pic:pic>
+              </a:graphicData>
+            </a:graphic>
+          </wp:inline>
+        </w:drawing>
+      </w:r>
+    </w:p>
+    <w:p>
+      <w:pPr>
+        <w:spacing w:after="200"/>
+        <w:jc w:val="center"/>
+        <w:rPr>
+          <w:rFonts w:ascii="Times New Roman" w:hAnsi="Times New Roman" w:cs="Times New Roman"/>
+          <w:i/>
+          <w:sz w:val="22"/>
+        </w:rPr>
+      </w:pPr>
+      <w:r>
+        <w:rPr>
+          <w:rFonts w:ascii="Times New Roman" w:hAnsi="Times New Roman" w:cs="Times New Roman"/>
+          <w:i/>
+          <w:sz w:val="22"/>
+        </w:rPr>
+        <w:t>Figure 8. Output of git log --oneline --decorate.</w:t>
       </w:r>
     </w:p>
     <w:p>
@@ -973,12 +1277,11 @@
           <w:b/>
           <w:sz w:val="26"/>
         </w:rPr>
-        <w:t>git branch -M main</w:t>
-      </w:r>
-    </w:p>
-    <w:p>
-      <w:pPr>
-        <w:spacing w:line="240" w:lineRule="auto"/>
+        <w:t>git status after the upload</w:t>
+      </w:r>
+    </w:p>
+    <w:p>
+      <w:pPr>
         <w:jc w:val="both"/>
         <w:rPr>
           <w:rFonts w:ascii="Times New Roman" w:hAnsi="Times New Roman" w:cs="Times New Roman"/>
@@ -988,7 +1291,82 @@
         <w:rPr>
           <w:rFonts w:ascii="Times New Roman" w:hAnsi="Times New Roman" w:cs="Times New Roman"/>
         </w:rPr>
-        <w:t>Renames the current branch to main. In this lab, git init -b main already created the branch with that name, so a separate rename was not required.</w:t>
+        <w:t>After the report was pushed, git status showed that main matches origin/main and that the working tree is clean. A clean tree means every saved change has already been committed.</w:t>
+      </w:r>
+    </w:p>
+    <w:p>
+      <w:pPr>
+        <w:spacing w:before="120" w:after="40"/>
+        <w:jc w:val="center"/>
+        <w:rPr>
+          <w:rFonts w:ascii="Times New Roman" w:hAnsi="Times New Roman" w:cs="Times New Roman"/>
+        </w:rPr>
+      </w:pPr>
+      <w:r>
+        <w:rPr>
+          <w:rFonts w:ascii="Times New Roman" w:hAnsi="Times New Roman" w:cs="Times New Roman"/>
+          <w:noProof/>
+        </w:rPr>
+        <w:drawing>
+          <wp:inline distT="0" distB="0" distL="0" distR="0" wp14:anchorId="77BE0262" wp14:editId="1B7E24A1">
+            <wp:extent cx="5715000" cy="1399442"/>
+            <wp:effectExtent l="0" t="0" r="0" b="0"/>
+            <wp:docPr id="236343653" name="Picture 9"/>
+            <wp:cNvGraphicFramePr>
+              <a:graphicFrameLocks xmlns:a="http://schemas.openxmlformats.org/drawingml/2006/main" noChangeAspect="1"/>
+            </wp:cNvGraphicFramePr>
+            <a:graphic xmlns:a="http://schemas.openxmlformats.org/drawingml/2006/main">
+              <a:graphicData uri="http://schemas.openxmlformats.org/drawingml/2006/picture">
+                <pic:pic xmlns:pic="http://schemas.openxmlformats.org/drawingml/2006/picture">
+                  <pic:nvPicPr>
+                    <pic:cNvPr id="236343653" name=""/>
+                    <pic:cNvPicPr/>
+                  </pic:nvPicPr>
+                  <pic:blipFill>
+                    <a:blip r:embed="rId12">
+                      <a:extLst>
+                        <a:ext uri="{28A0092B-C50C-407E-A947-70E740481C1C}">
+                          <a14:useLocalDpi xmlns:a14="http://schemas.microsoft.com/office/drawing/2010/main" val="0"/>
+                        </a:ext>
+                      </a:extLst>
+                    </a:blip>
+                    <a:stretch>
+                      <a:fillRect/>
+                    </a:stretch>
+                  </pic:blipFill>
+                  <pic:spPr>
+                    <a:xfrm>
+                      <a:off x="0" y="0"/>
+                      <a:ext cx="5715000" cy="1399442"/>
+                    </a:xfrm>
+                    <a:prstGeom prst="rect">
+                      <a:avLst/>
+                    </a:prstGeom>
+                  </pic:spPr>
+                </pic:pic>
+              </a:graphicData>
+            </a:graphic>
+          </wp:inline>
+        </w:drawing>
+      </w:r>
+    </w:p>
+    <w:p>
+      <w:pPr>
+        <w:spacing w:after="200"/>
+        <w:jc w:val="center"/>
+        <w:rPr>
+          <w:rFonts w:ascii="Times New Roman" w:hAnsi="Times New Roman" w:cs="Times New Roman"/>
+          <w:i/>
+          <w:sz w:val="22"/>
+        </w:rPr>
+      </w:pPr>
+      <w:r>
+        <w:rPr>
+          <w:rFonts w:ascii="Times New Roman" w:hAnsi="Times New Roman" w:cs="Times New Roman"/>
+          <w:i/>
+          <w:sz w:val="22"/>
+        </w:rPr>
+        <w:t>Figure 9. Output of git status after the repository was uploaded.</w:t>
       </w:r>
     </w:p>
     <w:p>
@@ -1007,12 +1385,11 @@
           <w:b/>
           <w:sz w:val="26"/>
         </w:rPr>
-        <w:t>git push -u origin main</w:t>
-      </w:r>
-    </w:p>
-    <w:p>
-      <w:pPr>
-        <w:spacing w:line="240" w:lineRule="auto"/>
+        <w:t>git ls-files</w:t>
+      </w:r>
+    </w:p>
+    <w:p>
+      <w:pPr>
         <w:jc w:val="both"/>
         <w:rPr>
           <w:rFonts w:ascii="Times New Roman" w:hAnsi="Times New Roman" w:cs="Times New Roman"/>
@@ -1022,92 +1399,82 @@
         <w:rPr>
           <w:rFonts w:ascii="Times New Roman" w:hAnsi="Times New Roman" w:cs="Times New Roman"/>
         </w:rPr>
-        <w:t>Uploads the local main branch to origin and, because of -u, remembers that main tracks origin/main. Later pushes can then use git push. The first attempt failed because the PC could not open a connection to github.com on port 443.</w:t>
-      </w:r>
-    </w:p>
-    <w:p>
-      <w:pPr>
-        <w:pStyle w:val="Heading2"/>
-        <w:spacing w:before="200"/>
-        <w:rPr>
-          <w:rFonts w:ascii="Times New Roman" w:hAnsi="Times New Roman" w:cs="Times New Roman"/>
-          <w:b/>
-          <w:sz w:val="26"/>
-        </w:rPr>
-      </w:pPr>
-      <w:r>
-        <w:rPr>
-          <w:rFonts w:ascii="Times New Roman" w:hAnsi="Times New Roman" w:cs="Times New Roman"/>
-          <w:b/>
-          <w:sz w:val="26"/>
-        </w:rPr>
-        <w:t>git -c http.version=HTTP/1.1 push -u origin main</w:t>
-      </w:r>
-    </w:p>
-    <w:p>
-      <w:pPr>
-        <w:spacing w:line="240" w:lineRule="auto"/>
-        <w:jc w:val="both"/>
-        <w:rPr>
-          <w:rFonts w:ascii="Times New Roman" w:hAnsi="Times New Roman" w:cs="Times New Roman"/>
-        </w:rPr>
-      </w:pPr>
-      <w:r>
-        <w:rPr>
-          <w:rFonts w:ascii="Times New Roman" w:hAnsi="Times New Roman" w:cs="Times New Roman"/>
-        </w:rPr>
-        <w:t>The same push, with one temporary setting: use HTTP version 1.1 for this command only. The -c flag does not change the saved Git settings. This attempt succeeded. Git reported that main was a new branch on GitHub and that the local branch now tracks origin/main.</w:t>
-      </w:r>
-    </w:p>
-    <w:p>
-      <w:pPr>
-        <w:pStyle w:val="Heading2"/>
-        <w:spacing w:before="200"/>
-        <w:rPr>
-          <w:rFonts w:ascii="Times New Roman" w:hAnsi="Times New Roman" w:cs="Times New Roman"/>
-          <w:b/>
-          <w:sz w:val="26"/>
-        </w:rPr>
-      </w:pPr>
-      <w:r>
-        <w:rPr>
-          <w:rFonts w:ascii="Times New Roman" w:hAnsi="Times New Roman" w:cs="Times New Roman"/>
-          <w:b/>
-          <w:sz w:val="26"/>
-        </w:rPr>
-        <w:t>git push origin main</w:t>
-      </w:r>
-    </w:p>
-    <w:p>
-      <w:pPr>
-        <w:spacing w:line="240" w:lineRule="auto"/>
-        <w:jc w:val="both"/>
-        <w:rPr>
-          <w:rFonts w:ascii="Times New Roman" w:hAnsi="Times New Roman" w:cs="Times New Roman"/>
-        </w:rPr>
-      </w:pPr>
-      <w:r>
-        <w:rPr>
-          <w:rFonts w:ascii="Times New Roman" w:hAnsi="Times New Roman" w:cs="Times New Roman"/>
-        </w:rPr>
-        <w:t>Uploads new commits after the first push. -u is no longer needed because tracking is already set. The simplified program and this report are uploaded with:</w:t>
-      </w:r>
-    </w:p>
-    <w:p>
-      <w:pPr>
-        <w:spacing w:after="40"/>
-        <w:ind w:left="360"/>
-        <w:rPr>
-          <w:rFonts w:ascii="Consolas" w:hAnsi="Consolas"/>
+        <w:t>Lists the files that Git is tracking. These are the files that were uploaded. Compiled programs are left out because .gitignore tells Git to skip .exe, .o, and .obj files.</w:t>
+      </w:r>
+    </w:p>
+    <w:p>
+      <w:pPr>
+        <w:spacing w:before="120" w:after="40"/>
+        <w:jc w:val="center"/>
+        <w:rPr>
+          <w:rFonts w:ascii="Times New Roman" w:hAnsi="Times New Roman" w:cs="Times New Roman"/>
+        </w:rPr>
+      </w:pPr>
+      <w:r>
+        <w:rPr>
+          <w:rFonts w:ascii="Times New Roman" w:hAnsi="Times New Roman" w:cs="Times New Roman"/>
+          <w:noProof/>
+        </w:rPr>
+        <w:drawing>
+          <wp:inline distT="0" distB="0" distL="0" distR="0" wp14:anchorId="147D0A33" wp14:editId="45CA5AFA">
+            <wp:extent cx="5715000" cy="1368913"/>
+            <wp:effectExtent l="0" t="0" r="0" b="3175"/>
+            <wp:docPr id="45232272" name="Picture 10"/>
+            <wp:cNvGraphicFramePr>
+              <a:graphicFrameLocks xmlns:a="http://schemas.openxmlformats.org/drawingml/2006/main" noChangeAspect="1"/>
+            </wp:cNvGraphicFramePr>
+            <a:graphic xmlns:a="http://schemas.openxmlformats.org/drawingml/2006/main">
+              <a:graphicData uri="http://schemas.openxmlformats.org/drawingml/2006/picture">
+                <pic:pic xmlns:pic="http://schemas.openxmlformats.org/drawingml/2006/picture">
+                  <pic:nvPicPr>
+                    <pic:cNvPr id="45232272" name=""/>
+                    <pic:cNvPicPr/>
+                  </pic:nvPicPr>
+                  <pic:blipFill>
+                    <a:blip r:embed="rId13">
+                      <a:extLst>
+                        <a:ext uri="{28A0092B-C50C-407E-A947-70E740481C1C}">
+                          <a14:useLocalDpi xmlns:a14="http://schemas.microsoft.com/office/drawing/2010/main" val="0"/>
+                        </a:ext>
+                      </a:extLst>
+                    </a:blip>
+                    <a:stretch>
+                      <a:fillRect/>
+                    </a:stretch>
+                  </pic:blipFill>
+                  <pic:spPr>
+                    <a:xfrm>
+                      <a:off x="0" y="0"/>
+                      <a:ext cx="5715000" cy="1368913"/>
+                    </a:xfrm>
+                    <a:prstGeom prst="rect">
+                      <a:avLst/>
+                    </a:prstGeom>
+                  </pic:spPr>
+                </pic:pic>
+              </a:graphicData>
+            </a:graphic>
+          </wp:inline>
+        </w:drawing>
+      </w:r>
+    </w:p>
+    <w:p>
+      <w:pPr>
+        <w:spacing w:after="200"/>
+        <w:jc w:val="center"/>
+        <w:rPr>
+          <w:rFonts w:ascii="Times New Roman" w:hAnsi="Times New Roman" w:cs="Times New Roman"/>
+          <w:i/>
           <w:sz w:val="22"/>
         </w:rPr>
       </w:pPr>
       <w:r>
         <w:rPr>
-          <w:rFonts w:ascii="Consolas" w:hAnsi="Consolas"/>
+          <w:rFonts w:ascii="Times New Roman" w:hAnsi="Times New Roman" w:cs="Times New Roman"/>
+          <w:i/>
           <w:sz w:val="22"/>
         </w:rPr>
-        <w:t>git -c http.version=HTTP/1.1 push origin main</w:t>
+        <w:t>Figure 10. Output of git ls-files.</w:t>
       </w:r>
     </w:p>
     <w:p>
@@ -1126,48 +1493,11 @@
           <w:b/>
           <w:sz w:val="32"/>
         </w:rPr>
-        <w:t>5. Steps carried out</w:t>
-      </w:r>
-    </w:p>
-    <w:p>
-      <w:pPr>
-        <w:pStyle w:val="Heading2"/>
-        <w:spacing w:before="200"/>
-        <w:rPr>
-          <w:rFonts w:ascii="Times New Roman" w:hAnsi="Times New Roman" w:cs="Times New Roman"/>
-          <w:b/>
-          <w:sz w:val="26"/>
-        </w:rPr>
-      </w:pPr>
-      <w:r>
-        <w:rPr>
-          <w:rFonts w:ascii="Times New Roman" w:hAnsi="Times New Roman" w:cs="Times New Roman"/>
-          <w:b/>
-          <w:sz w:val="26"/>
-        </w:rPr>
-        <w:t>Step 1. Create the repository</w:t>
-      </w:r>
-    </w:p>
-    <w:p>
-      <w:pPr>
-        <w:spacing w:after="40"/>
-        <w:ind w:left="360"/>
-        <w:rPr>
-          <w:rFonts w:ascii="Consolas" w:hAnsi="Consolas"/>
-          <w:sz w:val="22"/>
-        </w:rPr>
-      </w:pPr>
-      <w:r>
-        <w:rPr>
-          <w:rFonts w:ascii="Consolas" w:hAnsi="Consolas"/>
-          <w:sz w:val="22"/>
-        </w:rPr>
-        <w:t>git init -b main</w:t>
-      </w:r>
-    </w:p>
-    <w:p>
-      <w:pPr>
-        <w:spacing w:line="240" w:lineRule="auto"/>
+        <w:t>5. Files in the repository</w:t>
+      </w:r>
+    </w:p>
+    <w:p>
+      <w:pPr>
         <w:jc w:val="both"/>
         <w:rPr>
           <w:rFonts w:ascii="Times New Roman" w:hAnsi="Times New Roman" w:cs="Times New Roman"/>
@@ -1177,481 +1507,7 @@
         <w:rPr>
           <w:rFonts w:ascii="Times New Roman" w:hAnsi="Times New Roman" w:cs="Times New Roman"/>
         </w:rPr>
-        <w:t>Result: Initialized empty Git repository in the lab folder, on branch main.</w:t>
-      </w:r>
-    </w:p>
-    <w:p>
-      <w:pPr>
-        <w:pStyle w:val="Heading2"/>
-        <w:spacing w:before="200"/>
-        <w:rPr>
-          <w:rFonts w:ascii="Times New Roman" w:hAnsi="Times New Roman" w:cs="Times New Roman"/>
-          <w:b/>
-          <w:sz w:val="26"/>
-        </w:rPr>
-      </w:pPr>
-      <w:r>
-        <w:rPr>
-          <w:rFonts w:ascii="Times New Roman" w:hAnsi="Times New Roman" w:cs="Times New Roman"/>
-          <w:b/>
-          <w:sz w:val="26"/>
-        </w:rPr>
-        <w:t>Step 2. Stage and review the first files</w:t>
-      </w:r>
-    </w:p>
-    <w:p>
-      <w:pPr>
-        <w:spacing w:after="40"/>
-        <w:ind w:left="360"/>
-        <w:rPr>
-          <w:rFonts w:ascii="Consolas" w:hAnsi="Consolas"/>
-          <w:sz w:val="22"/>
-        </w:rPr>
-      </w:pPr>
-      <w:r>
-        <w:rPr>
-          <w:rFonts w:ascii="Consolas" w:hAnsi="Consolas"/>
-          <w:sz w:val="22"/>
-        </w:rPr>
-        <w:t>git add .</w:t>
-      </w:r>
-    </w:p>
-    <w:p>
-      <w:pPr>
-        <w:spacing w:after="40"/>
-        <w:ind w:left="360"/>
-        <w:rPr>
-          <w:rFonts w:ascii="Consolas" w:hAnsi="Consolas"/>
-          <w:sz w:val="22"/>
-        </w:rPr>
-      </w:pPr>
-      <w:r>
-        <w:rPr>
-          <w:rFonts w:ascii="Consolas" w:hAnsi="Consolas"/>
-          <w:sz w:val="22"/>
-        </w:rPr>
-        <w:t>git status</w:t>
-      </w:r>
-    </w:p>
-    <w:p>
-      <w:pPr>
-        <w:spacing w:after="40"/>
-        <w:ind w:left="360"/>
-        <w:rPr>
-          <w:rFonts w:ascii="Consolas" w:hAnsi="Consolas"/>
-          <w:sz w:val="22"/>
-        </w:rPr>
-      </w:pPr>
-      <w:r>
-        <w:rPr>
-          <w:rFonts w:ascii="Consolas" w:hAnsi="Consolas"/>
-          <w:sz w:val="22"/>
-        </w:rPr>
-        <w:t>git diff --cached</w:t>
-      </w:r>
-    </w:p>
-    <w:p>
-      <w:pPr>
-        <w:spacing w:line="240" w:lineRule="auto"/>
-        <w:jc w:val="both"/>
-        <w:rPr>
-          <w:rFonts w:ascii="Times New Roman" w:hAnsi="Times New Roman" w:cs="Times New Roman"/>
-        </w:rPr>
-      </w:pPr>
-      <w:r>
-        <w:rPr>
-          <w:rFonts w:ascii="Times New Roman" w:hAnsi="Times New Roman" w:cs="Times New Roman"/>
-        </w:rPr>
-        <w:t>Result: .gitignore, README.md, and student_result.cpp were staged. git status listed them as new files.</w:t>
-      </w:r>
-    </w:p>
-    <w:p>
-      <w:pPr>
-        <w:pStyle w:val="Heading2"/>
-        <w:spacing w:before="200"/>
-        <w:rPr>
-          <w:rFonts w:ascii="Times New Roman" w:hAnsi="Times New Roman" w:cs="Times New Roman"/>
-          <w:b/>
-          <w:sz w:val="26"/>
-        </w:rPr>
-      </w:pPr>
-      <w:r>
-        <w:rPr>
-          <w:rFonts w:ascii="Times New Roman" w:hAnsi="Times New Roman" w:cs="Times New Roman"/>
-          <w:b/>
-          <w:sz w:val="26"/>
-        </w:rPr>
-        <w:t>Step 3. Save the first commit</w:t>
-      </w:r>
-    </w:p>
-    <w:p>
-      <w:pPr>
-        <w:spacing w:after="40"/>
-        <w:ind w:left="360"/>
-        <w:rPr>
-          <w:rFonts w:ascii="Consolas" w:hAnsi="Consolas"/>
-          <w:sz w:val="22"/>
-        </w:rPr>
-      </w:pPr>
-      <w:r>
-        <w:rPr>
-          <w:rFonts w:ascii="Consolas" w:hAnsi="Consolas"/>
-          <w:sz w:val="22"/>
-        </w:rPr>
-        <w:t>git commit -m "Add a simple student result calculator for the lab assignment."</w:t>
-      </w:r>
-    </w:p>
-    <w:p>
-      <w:pPr>
-        <w:spacing w:after="40"/>
-        <w:ind w:left="360"/>
-        <w:rPr>
-          <w:rFonts w:ascii="Consolas" w:hAnsi="Consolas"/>
-          <w:sz w:val="22"/>
-        </w:rPr>
-      </w:pPr>
-      <w:r>
-        <w:rPr>
-          <w:rFonts w:ascii="Consolas" w:hAnsi="Consolas"/>
-          <w:sz w:val="22"/>
-        </w:rPr>
-        <w:t>git log -1</w:t>
-      </w:r>
-    </w:p>
-    <w:p>
-      <w:pPr>
-        <w:spacing w:line="240" w:lineRule="auto"/>
-        <w:jc w:val="both"/>
-        <w:rPr>
-          <w:rFonts w:ascii="Times New Roman" w:hAnsi="Times New Roman" w:cs="Times New Roman"/>
-        </w:rPr>
-      </w:pPr>
-      <w:r>
-        <w:rPr>
-          <w:rFonts w:ascii="Times New Roman" w:hAnsi="Times New Roman" w:cs="Times New Roman"/>
-        </w:rPr>
-        <w:t>Result: commit 0bdf94b on main. Three files were stored. The author recorded by Git is ali-ghiax.</w:t>
-      </w:r>
-    </w:p>
-    <w:p>
-      <w:pPr>
-        <w:pStyle w:val="Heading2"/>
-        <w:spacing w:before="200"/>
-        <w:rPr>
-          <w:rFonts w:ascii="Times New Roman" w:hAnsi="Times New Roman" w:cs="Times New Roman"/>
-          <w:b/>
-          <w:sz w:val="26"/>
-        </w:rPr>
-      </w:pPr>
-      <w:r>
-        <w:rPr>
-          <w:rFonts w:ascii="Times New Roman" w:hAnsi="Times New Roman" w:cs="Times New Roman"/>
-          <w:b/>
-          <w:sz w:val="26"/>
-        </w:rPr>
-        <w:t>Step 4. Connect GitHub and upload</w:t>
-      </w:r>
-    </w:p>
-    <w:p>
-      <w:pPr>
-        <w:spacing w:after="40"/>
-        <w:ind w:left="360"/>
-        <w:rPr>
-          <w:rFonts w:ascii="Consolas" w:hAnsi="Consolas"/>
-          <w:sz w:val="22"/>
-        </w:rPr>
-      </w:pPr>
-      <w:r>
-        <w:rPr>
-          <w:rFonts w:ascii="Consolas" w:hAnsi="Consolas"/>
-          <w:sz w:val="22"/>
-        </w:rPr>
-        <w:t>git remote add origin https://github.com/ali-ghiax/Software-Development-Contruction-Lab.git</w:t>
-      </w:r>
-    </w:p>
-    <w:p>
-      <w:pPr>
-        <w:spacing w:after="40"/>
-        <w:ind w:left="360"/>
-        <w:rPr>
-          <w:rFonts w:ascii="Consolas" w:hAnsi="Consolas"/>
-          <w:sz w:val="22"/>
-        </w:rPr>
-      </w:pPr>
-      <w:r>
-        <w:rPr>
-          <w:rFonts w:ascii="Consolas" w:hAnsi="Consolas"/>
-          <w:sz w:val="22"/>
-        </w:rPr>
-        <w:t>git remote -v</w:t>
-      </w:r>
-    </w:p>
-    <w:p>
-      <w:pPr>
-        <w:spacing w:after="40"/>
-        <w:ind w:left="360"/>
-        <w:rPr>
-          <w:rFonts w:ascii="Consolas" w:hAnsi="Consolas"/>
-          <w:sz w:val="22"/>
-        </w:rPr>
-      </w:pPr>
-      <w:r>
-        <w:rPr>
-          <w:rFonts w:ascii="Consolas" w:hAnsi="Consolas"/>
-          <w:sz w:val="22"/>
-        </w:rPr>
-        <w:t>git push -u origin main</w:t>
-      </w:r>
-    </w:p>
-    <w:p>
-      <w:pPr>
-        <w:spacing w:after="40"/>
-        <w:ind w:left="360"/>
-        <w:rPr>
-          <w:rFonts w:ascii="Consolas" w:hAnsi="Consolas"/>
-          <w:sz w:val="22"/>
-        </w:rPr>
-      </w:pPr>
-      <w:r>
-        <w:rPr>
-          <w:rFonts w:ascii="Consolas" w:hAnsi="Consolas"/>
-          <w:sz w:val="22"/>
-        </w:rPr>
-        <w:t>git -c http.version=HTTP/1.1 push -u origin main</w:t>
-      </w:r>
-    </w:p>
-    <w:p>
-      <w:pPr>
-        <w:spacing w:line="240" w:lineRule="auto"/>
-        <w:jc w:val="both"/>
-        <w:rPr>
-          <w:rFonts w:ascii="Times New Roman" w:hAnsi="Times New Roman" w:cs="Times New Roman"/>
-        </w:rPr>
-      </w:pPr>
-      <w:r>
-        <w:rPr>
-          <w:rFonts w:ascii="Times New Roman" w:hAnsi="Times New Roman" w:cs="Times New Roman"/>
-        </w:rPr>
-        <w:t>Result: the first push could not connect. The second push created main on GitHub. git status afterwards showed main...origin/main, which means the local branch and GitHub match.</w:t>
-      </w:r>
-    </w:p>
-    <w:p>
-      <w:pPr>
-        <w:pStyle w:val="Heading2"/>
-        <w:spacing w:before="200"/>
-        <w:rPr>
-          <w:rFonts w:ascii="Times New Roman" w:hAnsi="Times New Roman" w:cs="Times New Roman"/>
-          <w:b/>
-          <w:sz w:val="26"/>
-        </w:rPr>
-      </w:pPr>
-      <w:r>
-        <w:rPr>
-          <w:rFonts w:ascii="Times New Roman" w:hAnsi="Times New Roman" w:cs="Times New Roman"/>
-          <w:b/>
-          <w:sz w:val="26"/>
-        </w:rPr>
-        <w:t>Step 5. Replace the program with cout only</w:t>
-      </w:r>
-    </w:p>
-    <w:p>
-      <w:pPr>
-        <w:spacing w:line="240" w:lineRule="auto"/>
-        <w:jc w:val="both"/>
-        <w:rPr>
-          <w:rFonts w:ascii="Times New Roman" w:hAnsi="Times New Roman" w:cs="Times New Roman"/>
-        </w:rPr>
-      </w:pPr>
-      <w:r>
-        <w:rPr>
-          <w:rFonts w:ascii="Times New Roman" w:hAnsi="Times New Roman" w:cs="Times New Roman"/>
-        </w:rPr>
-        <w:t>hello.cpp was added. README.md was rewritten so the compile instructions match hello.cpp. student_result.cpp was deleted so the repository contains only the simple program.</w:t>
-      </w:r>
-    </w:p>
-    <w:p>
-      <w:pPr>
-        <w:spacing w:after="40"/>
-        <w:ind w:left="360"/>
-        <w:rPr>
-          <w:rFonts w:ascii="Consolas" w:hAnsi="Consolas"/>
-          <w:sz w:val="22"/>
-        </w:rPr>
-      </w:pPr>
-      <w:r>
-        <w:rPr>
-          <w:rFonts w:ascii="Consolas" w:hAnsi="Consolas"/>
-          <w:sz w:val="22"/>
-        </w:rPr>
-        <w:t>git add -A</w:t>
-      </w:r>
-    </w:p>
-    <w:p>
-      <w:pPr>
-        <w:spacing w:after="40"/>
-        <w:ind w:left="360"/>
-        <w:rPr>
-          <w:rFonts w:ascii="Consolas" w:hAnsi="Consolas"/>
-          <w:sz w:val="22"/>
-        </w:rPr>
-      </w:pPr>
-      <w:r>
-        <w:rPr>
-          <w:rFonts w:ascii="Consolas" w:hAnsi="Consolas"/>
-          <w:sz w:val="22"/>
-        </w:rPr>
-        <w:t>git status</w:t>
-      </w:r>
-    </w:p>
-    <w:p>
-      <w:pPr>
-        <w:spacing w:after="40"/>
-        <w:ind w:left="360"/>
-        <w:rPr>
-          <w:rFonts w:ascii="Consolas" w:hAnsi="Consolas"/>
-          <w:sz w:val="22"/>
-        </w:rPr>
-      </w:pPr>
-      <w:r>
-        <w:rPr>
-          <w:rFonts w:ascii="Consolas" w:hAnsi="Consolas"/>
-          <w:sz w:val="22"/>
-        </w:rPr>
-        <w:t>git diff --cached --stat</w:t>
-      </w:r>
-    </w:p>
-    <w:p>
-      <w:pPr>
-        <w:spacing w:after="40"/>
-        <w:ind w:left="360"/>
-        <w:rPr>
-          <w:rFonts w:ascii="Consolas" w:hAnsi="Consolas"/>
-          <w:sz w:val="22"/>
-        </w:rPr>
-      </w:pPr>
-      <w:r>
-        <w:rPr>
-          <w:rFonts w:ascii="Consolas" w:hAnsi="Consolas"/>
-          <w:sz w:val="22"/>
-        </w:rPr>
-        <w:t>git commit -m "Replace the calculator with a simple cout program."</w:t>
-      </w:r>
-    </w:p>
-    <w:p>
-      <w:pPr>
-        <w:spacing w:after="40"/>
-        <w:ind w:left="360"/>
-        <w:rPr>
-          <w:rFonts w:ascii="Consolas" w:hAnsi="Consolas"/>
-          <w:sz w:val="22"/>
-        </w:rPr>
-      </w:pPr>
-      <w:r>
-        <w:rPr>
-          <w:rFonts w:ascii="Consolas" w:hAnsi="Consolas"/>
-          <w:sz w:val="22"/>
-        </w:rPr>
-        <w:t>git log --oneline</w:t>
-      </w:r>
-    </w:p>
-    <w:p>
-      <w:pPr>
-        <w:spacing w:line="240" w:lineRule="auto"/>
-        <w:jc w:val="both"/>
-        <w:rPr>
-          <w:rFonts w:ascii="Times New Roman" w:hAnsi="Times New Roman" w:cs="Times New Roman"/>
-        </w:rPr>
-      </w:pPr>
-      <w:r>
-        <w:rPr>
-          <w:rFonts w:ascii="Times New Roman" w:hAnsi="Times New Roman" w:cs="Times New Roman"/>
-        </w:rPr>
-        <w:t>Result: commit d725f0c. The summary was 12 lines added and 169 lines removed.</w:t>
-      </w:r>
-    </w:p>
-    <w:p>
-      <w:pPr>
-        <w:pStyle w:val="Heading2"/>
-        <w:spacing w:before="200"/>
-        <w:rPr>
-          <w:rFonts w:ascii="Times New Roman" w:hAnsi="Times New Roman" w:cs="Times New Roman"/>
-          <w:b/>
-          <w:sz w:val="26"/>
-        </w:rPr>
-      </w:pPr>
-      <w:r>
-        <w:rPr>
-          <w:rFonts w:ascii="Times New Roman" w:hAnsi="Times New Roman" w:cs="Times New Roman"/>
-          <w:b/>
-          <w:sz w:val="26"/>
-        </w:rPr>
-        <w:t>Step 6. Add this report and push</w:t>
-      </w:r>
-    </w:p>
-    <w:p>
-      <w:pPr>
-        <w:spacing w:after="40"/>
-        <w:ind w:left="360"/>
-        <w:rPr>
-          <w:rFonts w:ascii="Consolas" w:hAnsi="Consolas"/>
-          <w:sz w:val="22"/>
-        </w:rPr>
-      </w:pPr>
-      <w:r>
-        <w:rPr>
-          <w:rFonts w:ascii="Consolas" w:hAnsi="Consolas"/>
-          <w:sz w:val="22"/>
-        </w:rPr>
-        <w:t>git add "Lab Report - Git Commands.docx"</w:t>
-      </w:r>
-    </w:p>
-    <w:p>
-      <w:pPr>
-        <w:spacing w:after="40"/>
-        <w:ind w:left="360"/>
-        <w:rPr>
-          <w:rFonts w:ascii="Consolas" w:hAnsi="Consolas"/>
-          <w:sz w:val="22"/>
-        </w:rPr>
-      </w:pPr>
-      <w:r>
-        <w:rPr>
-          <w:rFonts w:ascii="Consolas" w:hAnsi="Consolas"/>
-          <w:sz w:val="22"/>
-        </w:rPr>
-        <w:t>git commit -m "Add the lab report that explains the Git commands."</w:t>
-      </w:r>
-    </w:p>
-    <w:p>
-      <w:pPr>
-        <w:spacing w:after="40"/>
-        <w:ind w:left="360"/>
-        <w:rPr>
-          <w:rFonts w:ascii="Consolas" w:hAnsi="Consolas"/>
-          <w:sz w:val="22"/>
-        </w:rPr>
-      </w:pPr>
-      <w:r>
-        <w:rPr>
-          <w:rFonts w:ascii="Consolas" w:hAnsi="Consolas"/>
-          <w:sz w:val="22"/>
-        </w:rPr>
-        <w:t>git -c http.version=HTTP/1.1 push origin main</w:t>
-      </w:r>
-    </w:p>
-    <w:p>
-      <w:pPr>
-        <w:spacing w:line="240" w:lineRule="auto"/>
-        <w:jc w:val="both"/>
-        <w:rPr>
-          <w:rFonts w:ascii="Times New Roman" w:hAnsi="Times New Roman" w:cs="Times New Roman"/>
-        </w:rPr>
-      </w:pPr>
-      <w:r>
-        <w:rPr>
-          <w:rFonts w:ascii="Times New Roman" w:hAnsi="Times New Roman" w:cs="Times New Roman"/>
-        </w:rPr>
-        <w:t>This step uploads both the simplified program and this report to the same GitHub repository.</w:t>
+        <w:t>hello.cpp is the program. README.md explains what it prints and how to compile it. .gitignore keeps compiled files out of GitHub. This report explains the commands and includes a picture of each command's output.</w:t>
       </w:r>
     </w:p>
     <w:p>
@@ -1670,12 +1526,11 @@
           <w:b/>
           <w:sz w:val="32"/>
         </w:rPr>
-        <w:t>6. Files in the repository</w:t>
-      </w:r>
-    </w:p>
-    <w:p>
-      <w:pPr>
-        <w:spacing w:line="240" w:lineRule="auto"/>
+        <w:t>6. Conclusion</w:t>
+      </w:r>
+    </w:p>
+    <w:p>
+      <w:pPr>
         <w:jc w:val="both"/>
         <w:rPr>
           <w:rFonts w:ascii="Times New Roman" w:hAnsi="Times New Roman" w:cs="Times New Roman"/>
@@ -1685,46 +1540,11 @@
         <w:rPr>
           <w:rFonts w:ascii="Times New Roman" w:hAnsi="Times New Roman" w:cs="Times New Roman"/>
         </w:rPr>
-        <w:t>hello.cpp is the program. README.md explains what the program does and how to compile it. .gitignore tells Git to skip compiled files such as .exe, .o, and .obj, so only source files are published. This report explains the commands.</w:t>
-      </w:r>
-    </w:p>
-    <w:p>
-      <w:pPr>
-        <w:pStyle w:val="Heading1"/>
-        <w:spacing w:before="240" w:after="120"/>
-        <w:rPr>
-          <w:rFonts w:ascii="Times New Roman" w:hAnsi="Times New Roman" w:cs="Times New Roman"/>
-          <w:b/>
-          <w:sz w:val="32"/>
-        </w:rPr>
-      </w:pPr>
-      <w:r>
-        <w:rPr>
-          <w:rFonts w:ascii="Times New Roman" w:hAnsi="Times New Roman" w:cs="Times New Roman"/>
-          <w:b/>
-          <w:sz w:val="32"/>
-        </w:rPr>
-        <w:t>7. Conclusion</w:t>
-      </w:r>
-    </w:p>
-    <w:p>
-      <w:pPr>
-        <w:spacing w:line="240" w:lineRule="auto"/>
-        <w:jc w:val="both"/>
-        <w:rPr>
-          <w:rFonts w:ascii="Times New Roman" w:hAnsi="Times New Roman" w:cs="Times New Roman"/>
-        </w:rPr>
-      </w:pPr>
-      <w:r>
-        <w:rPr>
-          <w:rFonts w:ascii="Times New Roman" w:hAnsi="Times New Roman" w:cs="Times New Roman"/>
-        </w:rPr>
-        <w:t>A simple C++ program that prints two lines with cout is stored in hello.cpp. Git was used to create a local repository, review changes, save two commits, connect the folder to GitHub, and upload the main branch. The first push failed on the network connection. The retry with HTTP/1.1 completed the upload. The repository address is https://github.com/ali-ghiax/Software-Development-Contruction-Lab.</w:t>
-      </w:r>
-    </w:p>
-    <w:p>
-      <w:pPr>
-        <w:spacing w:line="240" w:lineRule="auto"/>
+        <w:t>A simple C++ program that prints two lines with cout is stored in hello.cpp. Git was used to create a local repository, review the files, save the commits, connect the folder to GitHub, and upload the main branch. The first push failed on the network connection. The retry with HTTP/1.1 completed the upload. Each command in this report is shown with the terminal picture of the output it produced. The repository address is https://github.com/ali-ghiax/Software-Development-Contruction-Lab.</w:t>
+      </w:r>
+    </w:p>
+    <w:p>
+      <w:pPr>
         <w:jc w:val="both"/>
         <w:rPr>
           <w:rFonts w:ascii="Times New Roman" w:hAnsi="Times New Roman" w:cs="Times New Roman"/>
@@ -2149,7 +1969,7 @@
     <w:link w:val="Heading1Char"/>
     <w:uiPriority w:val="9"/>
     <w:qFormat/>
-    <w:rsid w:val="003F3EA8"/>
+    <w:rsid w:val="00D10F0D"/>
     <w:pPr>
       <w:keepNext/>
       <w:keepLines/>
@@ -2171,7 +1991,7 @@
     <w:uiPriority w:val="9"/>
     <w:unhideWhenUsed/>
     <w:qFormat/>
-    <w:rsid w:val="003F3EA8"/>
+    <w:rsid w:val="00D10F0D"/>
     <w:pPr>
       <w:keepNext/>
       <w:keepLines/>
@@ -2194,7 +2014,7 @@
     <w:semiHidden/>
     <w:unhideWhenUsed/>
     <w:qFormat/>
-    <w:rsid w:val="003F3EA8"/>
+    <w:rsid w:val="00D10F0D"/>
     <w:pPr>
       <w:keepNext/>
       <w:keepLines/>
@@ -2217,7 +2037,7 @@
     <w:semiHidden/>
     <w:unhideWhenUsed/>
     <w:qFormat/>
-    <w:rsid w:val="003F3EA8"/>
+    <w:rsid w:val="00D10F0D"/>
     <w:pPr>
       <w:keepNext/>
       <w:keepLines/>
@@ -2240,7 +2060,7 @@
     <w:semiHidden/>
     <w:unhideWhenUsed/>
     <w:qFormat/>
-    <w:rsid w:val="003F3EA8"/>
+    <w:rsid w:val="00D10F0D"/>
     <w:pPr>
       <w:keepNext/>
       <w:keepLines/>
@@ -2261,7 +2081,7 @@
     <w:semiHidden/>
     <w:unhideWhenUsed/>
     <w:qFormat/>
-    <w:rsid w:val="003F3EA8"/>
+    <w:rsid w:val="00D10F0D"/>
     <w:pPr>
       <w:keepNext/>
       <w:keepLines/>
@@ -2284,7 +2104,7 @@
     <w:semiHidden/>
     <w:unhideWhenUsed/>
     <w:qFormat/>
-    <w:rsid w:val="003F3EA8"/>
+    <w:rsid w:val="00D10F0D"/>
     <w:pPr>
       <w:keepNext/>
       <w:keepLines/>
@@ -2305,7 +2125,7 @@
     <w:semiHidden/>
     <w:unhideWhenUsed/>
     <w:qFormat/>
-    <w:rsid w:val="003F3EA8"/>
+    <w:rsid w:val="00D10F0D"/>
     <w:pPr>
       <w:keepNext/>
       <w:keepLines/>
@@ -2328,7 +2148,7 @@
     <w:semiHidden/>
     <w:unhideWhenUsed/>
     <w:qFormat/>
-    <w:rsid w:val="003F3EA8"/>
+    <w:rsid w:val="00D10F0D"/>
     <w:pPr>
       <w:keepNext/>
       <w:keepLines/>
@@ -2372,7 +2192,7 @@
     <w:basedOn w:val="DefaultParagraphFont"/>
     <w:link w:val="Heading1"/>
     <w:uiPriority w:val="9"/>
-    <w:rsid w:val="003F3EA8"/>
+    <w:rsid w:val="00D10F0D"/>
     <w:rPr>
       <w:rFonts w:asciiTheme="majorHAnsi" w:eastAsiaTheme="majorEastAsia" w:hAnsiTheme="majorHAnsi" w:cstheme="majorBidi"/>
       <w:color w:val="0F4761" w:themeColor="accent1" w:themeShade="BF"/>
@@ -2385,7 +2205,7 @@
     <w:basedOn w:val="DefaultParagraphFont"/>
     <w:link w:val="Heading2"/>
     <w:uiPriority w:val="9"/>
-    <w:rsid w:val="003F3EA8"/>
+    <w:rsid w:val="00D10F0D"/>
     <w:rPr>
       <w:rFonts w:asciiTheme="majorHAnsi" w:eastAsiaTheme="majorEastAsia" w:hAnsiTheme="majorHAnsi" w:cstheme="majorBidi"/>
       <w:color w:val="0F4761" w:themeColor="accent1" w:themeShade="BF"/>
@@ -2399,7 +2219,7 @@
     <w:link w:val="Heading3"/>
     <w:uiPriority w:val="9"/>
     <w:semiHidden/>
-    <w:rsid w:val="003F3EA8"/>
+    <w:rsid w:val="00D10F0D"/>
     <w:rPr>
       <w:rFonts w:eastAsiaTheme="majorEastAsia" w:cstheme="majorBidi"/>
       <w:color w:val="0F4761" w:themeColor="accent1" w:themeShade="BF"/>
@@ -2413,7 +2233,7 @@
     <w:link w:val="Heading4"/>
     <w:uiPriority w:val="9"/>
     <w:semiHidden/>
-    <w:rsid w:val="003F3EA8"/>
+    <w:rsid w:val="00D10F0D"/>
     <w:rPr>
       <w:rFonts w:eastAsiaTheme="majorEastAsia" w:cstheme="majorBidi"/>
       <w:i/>
@@ -2427,7 +2247,7 @@
     <w:link w:val="Heading5"/>
     <w:uiPriority w:val="9"/>
     <w:semiHidden/>
-    <w:rsid w:val="003F3EA8"/>
+    <w:rsid w:val="00D10F0D"/>
     <w:rPr>
       <w:rFonts w:eastAsiaTheme="majorEastAsia" w:cstheme="majorBidi"/>
       <w:color w:val="0F4761" w:themeColor="accent1" w:themeShade="BF"/>
@@ -2439,7 +2259,7 @@
     <w:link w:val="Heading6"/>
     <w:uiPriority w:val="9"/>
     <w:semiHidden/>
-    <w:rsid w:val="003F3EA8"/>
+    <w:rsid w:val="00D10F0D"/>
     <w:rPr>
       <w:rFonts w:eastAsiaTheme="majorEastAsia" w:cstheme="majorBidi"/>
       <w:i/>
@@ -2453,7 +2273,7 @@
     <w:link w:val="Heading7"/>
     <w:uiPriority w:val="9"/>
     <w:semiHidden/>
-    <w:rsid w:val="003F3EA8"/>
+    <w:rsid w:val="00D10F0D"/>
     <w:rPr>
       <w:rFonts w:eastAsiaTheme="majorEastAsia" w:cstheme="majorBidi"/>
       <w:color w:val="595959" w:themeColor="text1" w:themeTint="A6"/>
@@ -2465,7 +2285,7 @@
     <w:link w:val="Heading8"/>
     <w:uiPriority w:val="9"/>
     <w:semiHidden/>
-    <w:rsid w:val="003F3EA8"/>
+    <w:rsid w:val="00D10F0D"/>
     <w:rPr>
       <w:rFonts w:eastAsiaTheme="majorEastAsia" w:cstheme="majorBidi"/>
       <w:i/>
@@ -2479,7 +2299,7 @@
     <w:link w:val="Heading9"/>
     <w:uiPriority w:val="9"/>
     <w:semiHidden/>
-    <w:rsid w:val="003F3EA8"/>
+    <w:rsid w:val="00D10F0D"/>
     <w:rPr>
       <w:rFonts w:eastAsiaTheme="majorEastAsia" w:cstheme="majorBidi"/>
       <w:color w:val="272727" w:themeColor="text1" w:themeTint="D8"/>
@@ -2492,7 +2312,7 @@
     <w:link w:val="TitleChar"/>
     <w:uiPriority w:val="10"/>
     <w:qFormat/>
-    <w:rsid w:val="003F3EA8"/>
+    <w:rsid w:val="00D10F0D"/>
     <w:pPr>
       <w:spacing w:after="80" w:line="240" w:lineRule="auto"/>
       <w:contextualSpacing/>
@@ -2510,7 +2330,7 @@
     <w:basedOn w:val="DefaultParagraphFont"/>
     <w:link w:val="Title"/>
     <w:uiPriority w:val="10"/>
-    <w:rsid w:val="003F3EA8"/>
+    <w:rsid w:val="00D10F0D"/>
     <w:rPr>
       <w:rFonts w:asciiTheme="majorHAnsi" w:eastAsiaTheme="majorEastAsia" w:hAnsiTheme="majorHAnsi" w:cstheme="majorBidi"/>
       <w:spacing w:val="-10"/>
@@ -2526,7 +2346,7 @@
     <w:link w:val="SubtitleChar"/>
     <w:uiPriority w:val="11"/>
     <w:qFormat/>
-    <w:rsid w:val="003F3EA8"/>
+    <w:rsid w:val="00D10F0D"/>
     <w:pPr>
       <w:numPr>
         <w:ilvl w:val="1"/>
@@ -2545,7 +2365,7 @@
     <w:basedOn w:val="DefaultParagraphFont"/>
     <w:link w:val="Subtitle"/>
     <w:uiPriority w:val="11"/>
-    <w:rsid w:val="003F3EA8"/>
+    <w:rsid w:val="00D10F0D"/>
     <w:rPr>
       <w:rFonts w:eastAsiaTheme="majorEastAsia" w:cstheme="majorBidi"/>
       <w:color w:val="595959" w:themeColor="text1" w:themeTint="A6"/>
@@ -2561,7 +2381,7 @@
     <w:link w:val="QuoteChar"/>
     <w:uiPriority w:val="29"/>
     <w:qFormat/>
-    <w:rsid w:val="003F3EA8"/>
+    <w:rsid w:val="00D10F0D"/>
     <w:pPr>
       <w:spacing w:before="160"/>
       <w:jc w:val="center"/>
@@ -2577,7 +2397,7 @@
     <w:basedOn w:val="DefaultParagraphFont"/>
     <w:link w:val="Quote"/>
     <w:uiPriority w:val="29"/>
-    <w:rsid w:val="003F3EA8"/>
+    <w:rsid w:val="00D10F0D"/>
     <w:rPr>
       <w:i/>
       <w:iCs/>
@@ -2589,7 +2409,7 @@
     <w:basedOn w:val="Normal"/>
     <w:uiPriority w:val="34"/>
     <w:qFormat/>
-    <w:rsid w:val="003F3EA8"/>
+    <w:rsid w:val="00D10F0D"/>
     <w:pPr>
       <w:ind w:left="720"/>
       <w:contextualSpacing/>
@@ -2600,7 +2420,7 @@
     <w:basedOn w:val="DefaultParagraphFont"/>
     <w:uiPriority w:val="21"/>
     <w:qFormat/>
-    <w:rsid w:val="003F3EA8"/>
+    <w:rsid w:val="00D10F0D"/>
     <w:rPr>
       <w:i/>
       <w:iCs/>
@@ -2614,7 +2434,7 @@
     <w:link w:val="IntenseQuoteChar"/>
     <w:uiPriority w:val="30"/>
     <w:qFormat/>
-    <w:rsid w:val="003F3EA8"/>
+    <w:rsid w:val="00D10F0D"/>
     <w:pPr>
       <w:pBdr>
         <w:top w:val="single" w:sz="4" w:space="10" w:color="0F4761" w:themeColor="accent1" w:themeShade="BF"/>
@@ -2635,7 +2455,7 @@
     <w:basedOn w:val="DefaultParagraphFont"/>
     <w:link w:val="IntenseQuote"/>
     <w:uiPriority w:val="30"/>
-    <w:rsid w:val="003F3EA8"/>
+    <w:rsid w:val="00D10F0D"/>
     <w:rPr>
       <w:i/>
       <w:iCs/>
@@ -2647,7 +2467,7 @@
     <w:basedOn w:val="DefaultParagraphFont"/>
     <w:uiPriority w:val="32"/>
     <w:qFormat/>
-    <w:rsid w:val="003F3EA8"/>
+    <w:rsid w:val="00D10F0D"/>
     <w:rPr>
       <w:b/>
       <w:bCs/>

</xml_diff>

<commit_message>
Add the branch, pull request, and merge conflict lab to the report.
</commit_message>
<xml_diff>
--- a/Lab Report - Git Commands.docx
+++ b/Lab Report - Git Commands.docx
@@ -4,120 +4,476 @@
   <w:body>
     <w:p>
       <w:pPr>
-        <w:spacing w:after="120"/>
+        <w:spacing w:before="100" w:beforeAutospacing="1" w:after="100" w:afterAutospacing="1" w:line="240" w:lineRule="auto"/>
+        <w:rPr>
+          <w:rFonts w:ascii="Calabri" w:eastAsia="Times New Roman" w:hAnsi="Calabri" w:cs="Times New Roman"/>
+          <w:b/>
+          <w:bCs/>
+        </w:rPr>
+      </w:pPr>
+    </w:p>
+    <w:p>
+      <w:pPr>
+        <w:pStyle w:val="StyleCentered"/>
+        <w:spacing w:line="240" w:lineRule="auto"/>
+        <w:ind w:right="180"/>
+        <w:rPr>
+          <w:rFonts w:ascii="Times New Roman" w:hAnsi="Times New Roman"/>
+          <w:bCs/>
+          <w:sz w:val="48"/>
+          <w:szCs w:val="48"/>
+        </w:rPr>
+      </w:pPr>
+      <w:r>
+        <w:rPr>
+          <w:rFonts w:ascii="Times New Roman" w:hAnsi="Times New Roman"/>
+          <w:b/>
+          <w:bCs/>
+          <w:sz w:val="48"/>
+          <w:szCs w:val="48"/>
+        </w:rPr>
+        <w:t>Lab Class Report</w:t>
+      </w:r>
+    </w:p>
+    <w:p>
+      <w:pPr>
+        <w:pStyle w:val="StyleCentered"/>
+        <w:spacing w:line="240" w:lineRule="auto"/>
+        <w:ind w:right="180"/>
+        <w:rPr>
+          <w:rFonts w:ascii="Times New Roman" w:hAnsi="Times New Roman"/>
+          <w:b/>
+          <w:bCs/>
+          <w:sz w:val="48"/>
+          <w:szCs w:val="48"/>
+        </w:rPr>
+      </w:pPr>
+      <w:r>
+        <w:rPr>
+          <w:rFonts w:ascii="Times New Roman" w:hAnsi="Times New Roman"/>
+          <w:bCs/>
+          <w:sz w:val="48"/>
+          <w:szCs w:val="48"/>
+        </w:rPr>
+        <w:br/>
+      </w:r>
+    </w:p>
+    <w:p>
+      <w:pPr>
+        <w:pStyle w:val="StyleCentered"/>
+        <w:spacing w:line="240" w:lineRule="auto"/>
+        <w:ind w:right="180"/>
+        <w:rPr>
+          <w:rFonts w:ascii="Times New Roman" w:hAnsi="Times New Roman"/>
+          <w:sz w:val="40"/>
+          <w:szCs w:val="40"/>
+        </w:rPr>
+      </w:pPr>
+      <w:r>
+        <w:rPr>
+          <w:noProof/>
+        </w:rPr>
+        <w:drawing>
+          <wp:inline distT="0" distB="0" distL="0" distR="0" wp14:anchorId="5FC9CEC8" wp14:editId="5C0EC33E">
+            <wp:extent cx="2876550" cy="2009160"/>
+            <wp:effectExtent l="0" t="0" r="0" b="0"/>
+            <wp:docPr id="1" name="Picture 1" descr="8b873860-90ea-4ca7-aecf-329570c19525"/>
+            <wp:cNvGraphicFramePr>
+              <a:graphicFrameLocks xmlns:a="http://schemas.openxmlformats.org/drawingml/2006/main" noChangeAspect="1"/>
+            </wp:cNvGraphicFramePr>
+            <a:graphic xmlns:a="http://schemas.openxmlformats.org/drawingml/2006/main">
+              <a:graphicData uri="http://schemas.openxmlformats.org/drawingml/2006/picture">
+                <pic:pic xmlns:pic="http://schemas.openxmlformats.org/drawingml/2006/picture">
+                  <pic:nvPicPr>
+                    <pic:cNvPr id="0" name="Picture 1" descr="8b873860-90ea-4ca7-aecf-329570c19525"/>
+                    <pic:cNvPicPr>
+                      <a:picLocks noChangeAspect="1" noChangeArrowheads="1"/>
+                    </pic:cNvPicPr>
+                  </pic:nvPicPr>
+                  <pic:blipFill>
+                    <a:blip r:embed="rId7" cstate="print">
+                      <a:extLst>
+                        <a:ext uri="{28A0092B-C50C-407E-A947-70E740481C1C}">
+                          <a14:useLocalDpi xmlns:a14="http://schemas.microsoft.com/office/drawing/2010/main" val="0"/>
+                        </a:ext>
+                      </a:extLst>
+                    </a:blip>
+                    <a:srcRect/>
+                    <a:stretch>
+                      <a:fillRect/>
+                    </a:stretch>
+                  </pic:blipFill>
+                  <pic:spPr bwMode="auto">
+                    <a:xfrm>
+                      <a:off x="0" y="0"/>
+                      <a:ext cx="2882621" cy="2013400"/>
+                    </a:xfrm>
+                    <a:prstGeom prst="rect">
+                      <a:avLst/>
+                    </a:prstGeom>
+                    <a:noFill/>
+                    <a:ln>
+                      <a:noFill/>
+                    </a:ln>
+                  </pic:spPr>
+                </pic:pic>
+              </a:graphicData>
+            </a:graphic>
+          </wp:inline>
+        </w:drawing>
+      </w:r>
+    </w:p>
+    <w:p>
+      <w:pPr>
+        <w:pStyle w:val="StyleCentered"/>
+        <w:spacing w:line="240" w:lineRule="auto"/>
+        <w:ind w:right="180"/>
+        <w:jc w:val="left"/>
+        <w:rPr>
+          <w:rFonts w:ascii="Times New Roman" w:hAnsi="Times New Roman"/>
+          <w:sz w:val="40"/>
+          <w:szCs w:val="40"/>
+        </w:rPr>
+      </w:pPr>
+    </w:p>
+    <w:p>
+      <w:pPr>
+        <w:pStyle w:val="StyleCentered"/>
+        <w:spacing w:line="240" w:lineRule="auto"/>
+        <w:ind w:right="180"/>
+        <w:rPr>
+          <w:rFonts w:ascii="Times New Roman" w:hAnsi="Times New Roman"/>
+          <w:sz w:val="40"/>
+          <w:szCs w:val="40"/>
+        </w:rPr>
+      </w:pPr>
+    </w:p>
+    <w:p>
+      <w:pPr>
+        <w:pStyle w:val="StyleCentered"/>
+        <w:spacing w:line="240" w:lineRule="auto"/>
+        <w:ind w:right="180"/>
+        <w:rPr>
+          <w:rFonts w:ascii="Times New Roman" w:hAnsi="Times New Roman"/>
+          <w:b/>
+          <w:bCs/>
+          <w:sz w:val="40"/>
+          <w:szCs w:val="40"/>
+        </w:rPr>
+      </w:pPr>
+      <w:r>
+        <w:rPr>
+          <w:rFonts w:ascii="Times New Roman" w:hAnsi="Times New Roman"/>
+          <w:b/>
+          <w:bCs/>
+          <w:sz w:val="40"/>
+          <w:szCs w:val="40"/>
+        </w:rPr>
+        <w:t>By</w:t>
+      </w:r>
+    </w:p>
+    <w:p>
+      <w:pPr>
+        <w:pStyle w:val="StyleCentered"/>
+        <w:spacing w:line="240" w:lineRule="auto"/>
+        <w:ind w:right="180"/>
+        <w:rPr>
+          <w:rFonts w:ascii="Times New Roman" w:hAnsi="Times New Roman"/>
+          <w:sz w:val="36"/>
+          <w:szCs w:val="36"/>
+        </w:rPr>
+      </w:pPr>
+      <w:r>
+        <w:rPr>
+          <w:rFonts w:ascii="Times New Roman" w:hAnsi="Times New Roman"/>
+          <w:sz w:val="36"/>
+          <w:szCs w:val="36"/>
+        </w:rPr>
+        <w:t>Muhammad Ali Ghias</w:t>
+      </w:r>
+    </w:p>
+    <w:p>
+      <w:pPr>
+        <w:pStyle w:val="StyleCentered"/>
+        <w:spacing w:line="240" w:lineRule="auto"/>
+        <w:ind w:right="180"/>
+        <w:rPr>
+          <w:rFonts w:ascii="Times New Roman" w:hAnsi="Times New Roman"/>
+          <w:sz w:val="36"/>
+          <w:szCs w:val="36"/>
+        </w:rPr>
+      </w:pPr>
+      <w:r>
+        <w:rPr>
+          <w:rFonts w:ascii="Times New Roman" w:hAnsi="Times New Roman"/>
+          <w:sz w:val="36"/>
+          <w:szCs w:val="36"/>
+        </w:rPr>
+        <w:t>Yamaan</w:t>
+      </w:r>
+    </w:p>
+    <w:p>
+      <w:pPr>
+        <w:pStyle w:val="StyleCentered"/>
+        <w:spacing w:line="240" w:lineRule="auto"/>
+        <w:ind w:right="180"/>
+        <w:rPr>
+          <w:rFonts w:ascii="Times New Roman" w:hAnsi="Times New Roman"/>
+          <w:sz w:val="36"/>
+          <w:szCs w:val="36"/>
+        </w:rPr>
+      </w:pPr>
+      <w:r>
+        <w:rPr>
+          <w:rFonts w:ascii="Times New Roman" w:hAnsi="Times New Roman"/>
+          <w:sz w:val="36"/>
+          <w:szCs w:val="36"/>
+        </w:rPr>
+        <w:t>Moize Zafar</w:t>
+      </w:r>
+    </w:p>
+    <w:p>
+      <w:pPr>
+        <w:pStyle w:val="StyleCentered"/>
+        <w:spacing w:line="240" w:lineRule="auto"/>
+        <w:ind w:right="180"/>
+        <w:jc w:val="left"/>
+        <w:rPr>
+          <w:rFonts w:ascii="Times New Roman" w:hAnsi="Times New Roman"/>
+          <w:sz w:val="36"/>
+          <w:szCs w:val="36"/>
+        </w:rPr>
+      </w:pPr>
+    </w:p>
+    <w:p>
+      <w:pPr>
+        <w:pStyle w:val="StyleCentered"/>
+        <w:spacing w:line="240" w:lineRule="auto"/>
+        <w:ind w:right="180"/>
+        <w:rPr>
+          <w:rFonts w:ascii="Times New Roman" w:hAnsi="Times New Roman"/>
+          <w:b/>
+          <w:bCs/>
+          <w:sz w:val="36"/>
+          <w:szCs w:val="36"/>
+        </w:rPr>
+      </w:pPr>
+      <w:r>
+        <w:rPr>
+          <w:rFonts w:ascii="Times New Roman" w:hAnsi="Times New Roman"/>
+          <w:b/>
+          <w:bCs/>
+          <w:sz w:val="36"/>
+          <w:szCs w:val="36"/>
+        </w:rPr>
+        <w:t>Submitted to:</w:t>
+      </w:r>
+    </w:p>
+    <w:p>
+      <w:pPr>
+        <w:pStyle w:val="StyleCentered"/>
+        <w:spacing w:line="240" w:lineRule="auto"/>
+        <w:rPr>
+          <w:rFonts w:ascii="Times New Roman" w:hAnsi="Times New Roman"/>
+          <w:sz w:val="36"/>
+          <w:szCs w:val="36"/>
+        </w:rPr>
+      </w:pPr>
+      <w:r>
+        <w:rPr>
+          <w:rFonts w:ascii="Times New Roman" w:hAnsi="Times New Roman"/>
+          <w:sz w:val="36"/>
+          <w:szCs w:val="36"/>
+        </w:rPr>
+        <w:t>Ma’am Manahil Shah</w:t>
+      </w:r>
+    </w:p>
+    <w:p>
+      <w:pPr>
+        <w:pStyle w:val="StyleCentered"/>
+        <w:spacing w:line="240" w:lineRule="auto"/>
+        <w:rPr>
+          <w:rFonts w:ascii="Times New Roman" w:hAnsi="Times New Roman"/>
+          <w:b/>
+          <w:bCs/>
+          <w:sz w:val="36"/>
+          <w:szCs w:val="36"/>
+        </w:rPr>
+      </w:pPr>
+    </w:p>
+    <w:p>
+      <w:pPr>
+        <w:pStyle w:val="StyleCentered"/>
+        <w:spacing w:line="240" w:lineRule="auto"/>
+        <w:rPr>
+          <w:rFonts w:ascii="Times New Roman" w:hAnsi="Times New Roman"/>
+          <w:sz w:val="36"/>
+          <w:szCs w:val="36"/>
+        </w:rPr>
+      </w:pPr>
+    </w:p>
+    <w:p>
+      <w:pPr>
+        <w:pStyle w:val="StyleCentered"/>
+        <w:spacing w:line="240" w:lineRule="auto"/>
+        <w:ind w:right="180"/>
+        <w:jc w:val="left"/>
+        <w:rPr>
+          <w:rFonts w:ascii="Times New Roman" w:hAnsi="Times New Roman"/>
+          <w:sz w:val="36"/>
+          <w:szCs w:val="36"/>
+        </w:rPr>
+      </w:pPr>
+    </w:p>
+    <w:p>
+      <w:pPr>
+        <w:pStyle w:val="StyleCentered"/>
+        <w:spacing w:line="240" w:lineRule="auto"/>
+        <w:ind w:right="180"/>
+        <w:jc w:val="left"/>
+        <w:rPr>
+          <w:rFonts w:ascii="Times New Roman" w:hAnsi="Times New Roman"/>
+          <w:sz w:val="36"/>
+          <w:szCs w:val="36"/>
+        </w:rPr>
+      </w:pPr>
+      <w:r>
+        <w:rPr>
+          <w:rFonts w:ascii="Times New Roman" w:hAnsi="Times New Roman"/>
+          <w:sz w:val="36"/>
+          <w:szCs w:val="36"/>
+        </w:rPr>
+        <w:t xml:space="preserve">                    </w:t>
+      </w:r>
+    </w:p>
+    <w:p>
+      <w:pPr>
+        <w:pStyle w:val="StyleCentered"/>
+        <w:spacing w:line="240" w:lineRule="auto"/>
+        <w:ind w:right="180"/>
+        <w:rPr>
+          <w:rFonts w:ascii="Times New Roman" w:hAnsi="Times New Roman"/>
+          <w:b/>
+          <w:bCs/>
+          <w:sz w:val="36"/>
+          <w:szCs w:val="36"/>
+        </w:rPr>
+      </w:pPr>
+      <w:r>
+        <w:rPr>
+          <w:rFonts w:ascii="Times New Roman" w:hAnsi="Times New Roman"/>
+          <w:b/>
+          <w:bCs/>
+          <w:sz w:val="36"/>
+          <w:szCs w:val="36"/>
+        </w:rPr>
+        <w:t>Department of Computer Science</w:t>
+      </w:r>
+    </w:p>
+    <w:p>
+      <w:pPr>
+        <w:pStyle w:val="StyleCentered"/>
+        <w:spacing w:line="240" w:lineRule="auto"/>
+        <w:ind w:right="180" w:hanging="540"/>
+        <w:rPr>
+          <w:rFonts w:ascii="Times New Roman" w:hAnsi="Times New Roman"/>
+          <w:b/>
+          <w:bCs/>
+          <w:sz w:val="36"/>
+          <w:szCs w:val="36"/>
+        </w:rPr>
+      </w:pPr>
+      <w:r>
+        <w:rPr>
+          <w:rFonts w:ascii="Times New Roman" w:hAnsi="Times New Roman"/>
+          <w:b/>
+          <w:bCs/>
+          <w:sz w:val="36"/>
+          <w:szCs w:val="36"/>
+        </w:rPr>
+        <w:t>City University of Science and Information Technology</w:t>
+      </w:r>
+    </w:p>
+    <w:p>
+      <w:pPr>
+        <w:pStyle w:val="StyleCentered"/>
+        <w:spacing w:line="240" w:lineRule="auto"/>
+        <w:ind w:right="180"/>
+        <w:rPr>
+          <w:rFonts w:ascii="Times New Roman" w:hAnsi="Times New Roman"/>
+          <w:b/>
+          <w:bCs/>
+          <w:sz w:val="36"/>
+          <w:szCs w:val="36"/>
+        </w:rPr>
+      </w:pPr>
+      <w:r>
+        <w:rPr>
+          <w:rFonts w:ascii="Times New Roman" w:hAnsi="Times New Roman"/>
+          <w:b/>
+          <w:bCs/>
+          <w:sz w:val="36"/>
+          <w:szCs w:val="36"/>
+        </w:rPr>
+        <w:t>Peshawar, Pakistan</w:t>
+      </w:r>
+    </w:p>
+    <w:p>
+      <w:pPr>
         <w:jc w:val="center"/>
         <w:rPr>
           <w:rFonts w:ascii="Times New Roman" w:hAnsi="Times New Roman" w:cs="Times New Roman"/>
           <w:b/>
-          <w:sz w:val="40"/>
-        </w:rPr>
-      </w:pPr>
-      <w:r>
-        <w:rPr>
-          <w:rFonts w:ascii="Times New Roman" w:hAnsi="Times New Roman" w:cs="Times New Roman"/>
-          <w:b/>
-          <w:sz w:val="40"/>
-        </w:rPr>
-        <w:t>Software Construction and Development Lab</w:t>
-      </w:r>
-    </w:p>
-    <w:p>
-      <w:pPr>
-        <w:spacing w:after="120"/>
-        <w:jc w:val="center"/>
-        <w:rPr>
-          <w:rFonts w:ascii="Times New Roman" w:hAnsi="Times New Roman" w:cs="Times New Roman"/>
-          <w:b/>
-          <w:sz w:val="32"/>
-        </w:rPr>
-      </w:pPr>
-      <w:r>
-        <w:rPr>
-          <w:rFonts w:ascii="Times New Roman" w:hAnsi="Times New Roman" w:cs="Times New Roman"/>
-          <w:b/>
-          <w:sz w:val="32"/>
-        </w:rPr>
-        <w:t>Lab Report</w:t>
-      </w:r>
-    </w:p>
-    <w:p>
-      <w:pPr>
-        <w:spacing w:after="120"/>
-        <w:jc w:val="center"/>
-        <w:rPr>
-          <w:rFonts w:ascii="Times New Roman" w:hAnsi="Times New Roman" w:cs="Times New Roman"/>
-          <w:sz w:val="28"/>
-        </w:rPr>
-      </w:pPr>
-      <w:r>
-        <w:rPr>
-          <w:rFonts w:ascii="Times New Roman" w:hAnsi="Times New Roman" w:cs="Times New Roman"/>
-          <w:sz w:val="28"/>
-        </w:rPr>
-        <w:t>A Simple C++ Program and GitHub Commands</w:t>
-      </w:r>
-    </w:p>
-    <w:p>
-      <w:pPr>
-        <w:jc w:val="both"/>
-        <w:rPr>
-          <w:rFonts w:ascii="Times New Roman" w:hAnsi="Times New Roman" w:cs="Times New Roman"/>
-        </w:rPr>
-      </w:pPr>
-    </w:p>
-    <w:p>
-      <w:pPr>
-        <w:spacing w:after="120"/>
-        <w:jc w:val="center"/>
-        <w:rPr>
-          <w:rFonts w:ascii="Times New Roman" w:hAnsi="Times New Roman" w:cs="Times New Roman"/>
-        </w:rPr>
-      </w:pPr>
-      <w:r>
-        <w:rPr>
-          <w:rFonts w:ascii="Times New Roman" w:hAnsi="Times New Roman" w:cs="Times New Roman"/>
-        </w:rPr>
-        <w:t>Date: 15 October 2026</w:t>
-      </w:r>
-    </w:p>
-    <w:p>
-      <w:pPr>
-        <w:spacing w:after="120"/>
-        <w:jc w:val="center"/>
-        <w:rPr>
-          <w:rFonts w:ascii="Times New Roman" w:hAnsi="Times New Roman" w:cs="Times New Roman"/>
-        </w:rPr>
-      </w:pPr>
-      <w:r>
-        <w:rPr>
-          <w:rFonts w:ascii="Times New Roman" w:hAnsi="Times New Roman" w:cs="Times New Roman"/>
-        </w:rPr>
-        <w:t>Repository: ali-ghiax/Software-Development-Contruction-Lab</w:t>
-      </w:r>
-    </w:p>
-    <w:p>
-      <w:pPr>
-        <w:spacing w:after="120"/>
-        <w:jc w:val="center"/>
-        <w:rPr>
-          <w:rFonts w:ascii="Times New Roman" w:hAnsi="Times New Roman" w:cs="Times New Roman"/>
-        </w:rPr>
-      </w:pPr>
-      <w:r>
-        <w:rPr>
-          <w:rFonts w:ascii="Times New Roman" w:hAnsi="Times New Roman" w:cs="Times New Roman"/>
-        </w:rPr>
-        <w:t>Branch: main</w:t>
-      </w:r>
-    </w:p>
-    <w:p>
-      <w:pPr>
-        <w:spacing w:after="120"/>
-        <w:jc w:val="center"/>
-        <w:rPr>
-          <w:rFonts w:ascii="Times New Roman" w:hAnsi="Times New Roman" w:cs="Times New Roman"/>
-        </w:rPr>
-      </w:pPr>
+          <w:sz w:val="36"/>
+          <w:szCs w:val="36"/>
+        </w:rPr>
+      </w:pPr>
+      <w:r>
+        <w:rPr>
+          <w:rFonts w:ascii="Times New Roman" w:hAnsi="Times New Roman" w:cs="Times New Roman"/>
+          <w:b/>
+          <w:sz w:val="36"/>
+          <w:szCs w:val="36"/>
+        </w:rPr>
+        <w:fldChar w:fldCharType="begin"/>
+      </w:r>
+      <w:r>
+        <w:rPr>
+          <w:rFonts w:ascii="Times New Roman" w:hAnsi="Times New Roman" w:cs="Times New Roman"/>
+          <w:b/>
+          <w:sz w:val="36"/>
+          <w:szCs w:val="36"/>
+        </w:rPr>
+        <w:instrText xml:space="preserve"> DATE  \@ "MMMM, YYYY"  \* MERGEFORMAT </w:instrText>
+      </w:r>
+      <w:r>
+        <w:rPr>
+          <w:rFonts w:ascii="Times New Roman" w:hAnsi="Times New Roman" w:cs="Times New Roman"/>
+          <w:b/>
+          <w:sz w:val="36"/>
+          <w:szCs w:val="36"/>
+        </w:rPr>
+        <w:fldChar w:fldCharType="separate"/>
+      </w:r>
+      <w:r>
+        <w:rPr>
+          <w:rFonts w:ascii="Times New Roman" w:hAnsi="Times New Roman" w:cs="Times New Roman"/>
+          <w:b/>
+          <w:noProof/>
+          <w:sz w:val="36"/>
+          <w:szCs w:val="36"/>
+        </w:rPr>
+        <w:t>October, 2026</w:t>
+      </w:r>
+      <w:r>
+        <w:rPr>
+          <w:rFonts w:ascii="Times New Roman" w:hAnsi="Times New Roman" w:cs="Times New Roman"/>
+          <w:b/>
+          <w:sz w:val="36"/>
+          <w:szCs w:val="36"/>
+        </w:rPr>
+        <w:fldChar w:fldCharType="end"/>
+      </w:r>
     </w:p>
     <w:p>
       <w:pPr>
@@ -135,6 +491,7 @@
           <w:b/>
           <w:sz w:val="32"/>
         </w:rPr>
+        <w:lastRenderedPageBreak/>
         <w:t>1. Aim</w:t>
       </w:r>
     </w:p>
@@ -312,8 +669,8 @@
           <w:noProof/>
         </w:rPr>
         <w:drawing>
-          <wp:inline distT="0" distB="0" distL="0" distR="0" wp14:anchorId="26C15318" wp14:editId="36D6A55B">
-            <wp:extent cx="5715000" cy="841986"/>
+          <wp:inline distT="0" distB="0" distL="0" distR="0" wp14:anchorId="26C15318" wp14:editId="5020CCC5">
+            <wp:extent cx="5543550" cy="555625"/>
             <wp:effectExtent l="0" t="0" r="0" b="0"/>
             <wp:docPr id="407034428" name="Picture 1"/>
             <wp:cNvGraphicFramePr>
@@ -326,8 +683,1648 @@
                     <pic:cNvPr id="407034428" name=""/>
                     <pic:cNvPicPr/>
                   </pic:nvPicPr>
+                  <pic:blipFill rotWithShape="1">
+                    <a:blip r:embed="rId8">
+                      <a:extLst>
+                        <a:ext uri="{28A0092B-C50C-407E-A947-70E740481C1C}">
+                          <a14:useLocalDpi xmlns:a14="http://schemas.microsoft.com/office/drawing/2010/main" val="0"/>
+                        </a:ext>
+                      </a:extLst>
+                    </a:blip>
+                    <a:srcRect t="33962" r="2930"/>
+                    <a:stretch>
+                      <a:fillRect/>
+                    </a:stretch>
+                  </pic:blipFill>
+                  <pic:spPr bwMode="auto">
+                    <a:xfrm>
+                      <a:off x="0" y="0"/>
+                      <a:ext cx="5547576" cy="556028"/>
+                    </a:xfrm>
+                    <a:prstGeom prst="rect">
+                      <a:avLst/>
+                    </a:prstGeom>
+                    <a:ln>
+                      <a:noFill/>
+                    </a:ln>
+                    <a:extLst>
+                      <a:ext uri="{53640926-AAD7-44D8-BBD7-CCE9431645EC}">
+                        <a14:shadowObscured xmlns:a14="http://schemas.microsoft.com/office/drawing/2010/main"/>
+                      </a:ext>
+                    </a:extLst>
+                  </pic:spPr>
+                </pic:pic>
+              </a:graphicData>
+            </a:graphic>
+          </wp:inline>
+        </w:drawing>
+      </w:r>
+    </w:p>
+    <w:p>
+      <w:pPr>
+        <w:spacing w:after="200"/>
+        <w:jc w:val="center"/>
+        <w:rPr>
+          <w:rFonts w:ascii="Times New Roman" w:hAnsi="Times New Roman" w:cs="Times New Roman"/>
+          <w:i/>
+          <w:sz w:val="22"/>
+        </w:rPr>
+      </w:pPr>
+      <w:r>
+        <w:rPr>
+          <w:rFonts w:ascii="Times New Roman" w:hAnsi="Times New Roman" w:cs="Times New Roman"/>
+          <w:i/>
+          <w:sz w:val="22"/>
+        </w:rPr>
+        <w:t>Figure 1. Output of git --version.</w:t>
+      </w:r>
+    </w:p>
+    <w:p>
+      <w:pPr>
+        <w:pStyle w:val="Heading2"/>
+        <w:spacing w:before="200"/>
+        <w:rPr>
+          <w:rFonts w:ascii="Times New Roman" w:hAnsi="Times New Roman" w:cs="Times New Roman"/>
+          <w:b/>
+          <w:sz w:val="26"/>
+        </w:rPr>
+      </w:pPr>
+      <w:r>
+        <w:rPr>
+          <w:rFonts w:ascii="Times New Roman" w:hAnsi="Times New Roman" w:cs="Times New Roman"/>
+          <w:b/>
+          <w:sz w:val="26"/>
+        </w:rPr>
+        <w:t>git init -b main</w:t>
+      </w:r>
+    </w:p>
+    <w:p>
+      <w:pPr>
+        <w:jc w:val="both"/>
+        <w:rPr>
+          <w:rFonts w:ascii="Times New Roman" w:hAnsi="Times New Roman" w:cs="Times New Roman"/>
+        </w:rPr>
+      </w:pPr>
+      <w:r>
+        <w:rPr>
+          <w:rFonts w:ascii="Times New Roman" w:hAnsi="Times New Roman" w:cs="Times New Roman"/>
+        </w:rPr>
+        <w:t>Creates a new local repository in the current folder and names the first branch main. After this command, a hidden .git folder holds the history. Nothing is uploaded yet.</w:t>
+      </w:r>
+    </w:p>
+    <w:p>
+      <w:pPr>
+        <w:spacing w:before="120" w:after="40"/>
+        <w:jc w:val="center"/>
+        <w:rPr>
+          <w:rFonts w:ascii="Times New Roman" w:hAnsi="Times New Roman" w:cs="Times New Roman"/>
+          <w:noProof/>
+        </w:rPr>
+      </w:pPr>
+    </w:p>
+    <w:p>
+      <w:pPr>
+        <w:spacing w:before="120" w:after="40"/>
+        <w:jc w:val="center"/>
+        <w:rPr>
+          <w:rFonts w:ascii="Times New Roman" w:hAnsi="Times New Roman" w:cs="Times New Roman"/>
+        </w:rPr>
+      </w:pPr>
+      <w:r>
+        <w:rPr>
+          <w:rFonts w:ascii="Times New Roman" w:hAnsi="Times New Roman" w:cs="Times New Roman"/>
+          <w:noProof/>
+        </w:rPr>
+        <w:lastRenderedPageBreak/>
+        <w:drawing>
+          <wp:inline distT="0" distB="0" distL="0" distR="0" wp14:anchorId="0A17AE4B" wp14:editId="317E19F5">
+            <wp:extent cx="5619750" cy="695325"/>
+            <wp:effectExtent l="0" t="0" r="0" b="9525"/>
+            <wp:docPr id="1485042984" name="Picture 2"/>
+            <wp:cNvGraphicFramePr>
+              <a:graphicFrameLocks xmlns:a="http://schemas.openxmlformats.org/drawingml/2006/main" noChangeAspect="1"/>
+            </wp:cNvGraphicFramePr>
+            <a:graphic xmlns:a="http://schemas.openxmlformats.org/drawingml/2006/main">
+              <a:graphicData uri="http://schemas.openxmlformats.org/drawingml/2006/picture">
+                <pic:pic xmlns:pic="http://schemas.openxmlformats.org/drawingml/2006/picture">
+                  <pic:nvPicPr>
+                    <pic:cNvPr id="1485042984" name=""/>
+                    <pic:cNvPicPr/>
+                  </pic:nvPicPr>
+                  <pic:blipFill rotWithShape="1">
+                    <a:blip r:embed="rId9">
+                      <a:extLst>
+                        <a:ext uri="{28A0092B-C50C-407E-A947-70E740481C1C}">
+                          <a14:useLocalDpi xmlns:a14="http://schemas.microsoft.com/office/drawing/2010/main" val="0"/>
+                        </a:ext>
+                      </a:extLst>
+                    </a:blip>
+                    <a:srcRect t="29126" r="1654"/>
+                    <a:stretch>
+                      <a:fillRect/>
+                    </a:stretch>
+                  </pic:blipFill>
+                  <pic:spPr bwMode="auto">
+                    <a:xfrm>
+                      <a:off x="0" y="0"/>
+                      <a:ext cx="5620449" cy="695411"/>
+                    </a:xfrm>
+                    <a:prstGeom prst="rect">
+                      <a:avLst/>
+                    </a:prstGeom>
+                    <a:ln>
+                      <a:noFill/>
+                    </a:ln>
+                    <a:extLst>
+                      <a:ext uri="{53640926-AAD7-44D8-BBD7-CCE9431645EC}">
+                        <a14:shadowObscured xmlns:a14="http://schemas.microsoft.com/office/drawing/2010/main"/>
+                      </a:ext>
+                    </a:extLst>
+                  </pic:spPr>
+                </pic:pic>
+              </a:graphicData>
+            </a:graphic>
+          </wp:inline>
+        </w:drawing>
+      </w:r>
+    </w:p>
+    <w:p>
+      <w:pPr>
+        <w:spacing w:after="200"/>
+        <w:jc w:val="center"/>
+        <w:rPr>
+          <w:rFonts w:ascii="Times New Roman" w:hAnsi="Times New Roman" w:cs="Times New Roman"/>
+          <w:i/>
+          <w:sz w:val="22"/>
+        </w:rPr>
+      </w:pPr>
+      <w:r>
+        <w:rPr>
+          <w:rFonts w:ascii="Times New Roman" w:hAnsi="Times New Roman" w:cs="Times New Roman"/>
+          <w:i/>
+          <w:sz w:val="22"/>
+        </w:rPr>
+        <w:t>Figure 2. Output of git init -b main.</w:t>
+      </w:r>
+    </w:p>
+    <w:p>
+      <w:pPr>
+        <w:pStyle w:val="Heading2"/>
+        <w:spacing w:before="200"/>
+        <w:rPr>
+          <w:rFonts w:ascii="Times New Roman" w:hAnsi="Times New Roman" w:cs="Times New Roman"/>
+          <w:b/>
+          <w:sz w:val="26"/>
+        </w:rPr>
+      </w:pPr>
+      <w:r>
+        <w:rPr>
+          <w:rFonts w:ascii="Times New Roman" w:hAnsi="Times New Roman" w:cs="Times New Roman"/>
+          <w:b/>
+          <w:sz w:val="26"/>
+        </w:rPr>
+        <w:t>git add .</w:t>
+      </w:r>
+    </w:p>
+    <w:p>
+      <w:pPr>
+        <w:jc w:val="both"/>
+        <w:rPr>
+          <w:rFonts w:ascii="Times New Roman" w:hAnsi="Times New Roman" w:cs="Times New Roman"/>
+        </w:rPr>
+      </w:pPr>
+      <w:r>
+        <w:rPr>
+          <w:rFonts w:ascii="Times New Roman" w:hAnsi="Times New Roman" w:cs="Times New Roman"/>
+        </w:rPr>
+        <w:t>Copies new and modified files into the staging area. The dot means the current folder. The first use staged .gitignore, README.md, and the original C++ file.</w:t>
+      </w:r>
+    </w:p>
+    <w:p>
+      <w:pPr>
+        <w:pStyle w:val="Heading2"/>
+        <w:spacing w:before="200"/>
+        <w:rPr>
+          <w:rFonts w:ascii="Times New Roman" w:hAnsi="Times New Roman" w:cs="Times New Roman"/>
+          <w:b/>
+          <w:sz w:val="26"/>
+        </w:rPr>
+      </w:pPr>
+      <w:r>
+        <w:rPr>
+          <w:rFonts w:ascii="Times New Roman" w:hAnsi="Times New Roman" w:cs="Times New Roman"/>
+          <w:b/>
+          <w:sz w:val="26"/>
+        </w:rPr>
+        <w:t>git status</w:t>
+      </w:r>
+    </w:p>
+    <w:p>
+      <w:pPr>
+        <w:jc w:val="both"/>
+        <w:rPr>
+          <w:rFonts w:ascii="Times New Roman" w:hAnsi="Times New Roman" w:cs="Times New Roman"/>
+        </w:rPr>
+      </w:pPr>
+      <w:r>
+        <w:rPr>
+          <w:rFonts w:ascii="Times New Roman" w:hAnsi="Times New Roman" w:cs="Times New Roman"/>
+        </w:rPr>
+        <w:t>Shows the current branch and lists files that are new, changed, or waiting to be committed. It only reports the state. It does not change files.</w:t>
+      </w:r>
+    </w:p>
+    <w:p>
+      <w:pPr>
+        <w:spacing w:before="120" w:after="40"/>
+        <w:jc w:val="center"/>
+        <w:rPr>
+          <w:rFonts w:ascii="Times New Roman" w:hAnsi="Times New Roman" w:cs="Times New Roman"/>
+          <w:noProof/>
+        </w:rPr>
+      </w:pPr>
+    </w:p>
+    <w:p>
+      <w:pPr>
+        <w:spacing w:before="120" w:after="40"/>
+        <w:jc w:val="center"/>
+        <w:rPr>
+          <w:rFonts w:ascii="Times New Roman" w:hAnsi="Times New Roman" w:cs="Times New Roman"/>
+        </w:rPr>
+      </w:pPr>
+      <w:r>
+        <w:rPr>
+          <w:rFonts w:ascii="Times New Roman" w:hAnsi="Times New Roman" w:cs="Times New Roman"/>
+          <w:noProof/>
+        </w:rPr>
+        <w:drawing>
+          <wp:inline distT="0" distB="0" distL="0" distR="0" wp14:anchorId="3D15AB75" wp14:editId="58C9B4B0">
+            <wp:extent cx="5686425" cy="2173605"/>
+            <wp:effectExtent l="0" t="0" r="9525" b="0"/>
+            <wp:docPr id="1448779054" name="Picture 3"/>
+            <wp:cNvGraphicFramePr>
+              <a:graphicFrameLocks xmlns:a="http://schemas.openxmlformats.org/drawingml/2006/main" noChangeAspect="1"/>
+            </wp:cNvGraphicFramePr>
+            <a:graphic xmlns:a="http://schemas.openxmlformats.org/drawingml/2006/main">
+              <a:graphicData uri="http://schemas.openxmlformats.org/drawingml/2006/picture">
+                <pic:pic xmlns:pic="http://schemas.openxmlformats.org/drawingml/2006/picture">
+                  <pic:nvPicPr>
+                    <pic:cNvPr id="1448779054" name=""/>
+                    <pic:cNvPicPr/>
+                  </pic:nvPicPr>
+                  <pic:blipFill rotWithShape="1">
+                    <a:blip r:embed="rId10">
+                      <a:extLst>
+                        <a:ext uri="{28A0092B-C50C-407E-A947-70E740481C1C}">
+                          <a14:useLocalDpi xmlns:a14="http://schemas.microsoft.com/office/drawing/2010/main" val="0"/>
+                        </a:ext>
+                      </a:extLst>
+                    </a:blip>
+                    <a:srcRect t="11619" r="498"/>
+                    <a:stretch>
+                      <a:fillRect/>
+                    </a:stretch>
+                  </pic:blipFill>
+                  <pic:spPr bwMode="auto">
+                    <a:xfrm>
+                      <a:off x="0" y="0"/>
+                      <a:ext cx="5686538" cy="2173648"/>
+                    </a:xfrm>
+                    <a:prstGeom prst="rect">
+                      <a:avLst/>
+                    </a:prstGeom>
+                    <a:ln>
+                      <a:noFill/>
+                    </a:ln>
+                    <a:extLst>
+                      <a:ext uri="{53640926-AAD7-44D8-BBD7-CCE9431645EC}">
+                        <a14:shadowObscured xmlns:a14="http://schemas.microsoft.com/office/drawing/2010/main"/>
+                      </a:ext>
+                    </a:extLst>
+                  </pic:spPr>
+                </pic:pic>
+              </a:graphicData>
+            </a:graphic>
+          </wp:inline>
+        </w:drawing>
+      </w:r>
+    </w:p>
+    <w:p>
+      <w:pPr>
+        <w:spacing w:after="200"/>
+        <w:jc w:val="center"/>
+        <w:rPr>
+          <w:rFonts w:ascii="Times New Roman" w:hAnsi="Times New Roman" w:cs="Times New Roman"/>
+          <w:i/>
+          <w:sz w:val="22"/>
+        </w:rPr>
+      </w:pPr>
+      <w:r>
+        <w:rPr>
+          <w:rFonts w:ascii="Times New Roman" w:hAnsi="Times New Roman" w:cs="Times New Roman"/>
+          <w:i/>
+          <w:sz w:val="22"/>
+        </w:rPr>
+        <w:t>Figure 3. Output of git add . and git status before the first commit.</w:t>
+      </w:r>
+    </w:p>
+    <w:p>
+      <w:pPr>
+        <w:pStyle w:val="Heading2"/>
+        <w:spacing w:before="200"/>
+        <w:rPr>
+          <w:rFonts w:ascii="Times New Roman" w:hAnsi="Times New Roman" w:cs="Times New Roman"/>
+          <w:b/>
+          <w:sz w:val="26"/>
+        </w:rPr>
+      </w:pPr>
+      <w:r>
+        <w:rPr>
+          <w:rFonts w:ascii="Times New Roman" w:hAnsi="Times New Roman" w:cs="Times New Roman"/>
+          <w:b/>
+          <w:sz w:val="26"/>
+        </w:rPr>
+        <w:t>git commit -m "message"</w:t>
+      </w:r>
+    </w:p>
+    <w:p>
+      <w:pPr>
+        <w:jc w:val="both"/>
+        <w:rPr>
+          <w:rFonts w:ascii="Times New Roman" w:hAnsi="Times New Roman" w:cs="Times New Roman"/>
+        </w:rPr>
+      </w:pPr>
+      <w:r>
+        <w:rPr>
+          <w:rFonts w:ascii="Times New Roman" w:hAnsi="Times New Roman" w:cs="Times New Roman"/>
+        </w:rPr>
+        <w:t>Saves the staged snapshot into the local repository and stores the message with it. The first commit id is 0bdf94b.</w:t>
+      </w:r>
+    </w:p>
+    <w:p>
+      <w:pPr>
+        <w:spacing w:before="120" w:after="40"/>
+        <w:jc w:val="center"/>
+        <w:rPr>
+          <w:rFonts w:ascii="Times New Roman" w:hAnsi="Times New Roman" w:cs="Times New Roman"/>
+          <w:noProof/>
+        </w:rPr>
+      </w:pPr>
+    </w:p>
+    <w:p>
+      <w:pPr>
+        <w:spacing w:before="120" w:after="40"/>
+        <w:jc w:val="center"/>
+        <w:rPr>
+          <w:rFonts w:ascii="Times New Roman" w:hAnsi="Times New Roman" w:cs="Times New Roman"/>
+        </w:rPr>
+      </w:pPr>
+      <w:r>
+        <w:rPr>
+          <w:rFonts w:ascii="Times New Roman" w:hAnsi="Times New Roman" w:cs="Times New Roman"/>
+          <w:noProof/>
+        </w:rPr>
+        <w:drawing>
+          <wp:inline distT="0" distB="0" distL="0" distR="0" wp14:anchorId="1016122D" wp14:editId="3A5555C0">
+            <wp:extent cx="5724525" cy="1367790"/>
+            <wp:effectExtent l="0" t="0" r="9525" b="3810"/>
+            <wp:docPr id="2066216469" name="Picture 4"/>
+            <wp:cNvGraphicFramePr>
+              <a:graphicFrameLocks xmlns:a="http://schemas.openxmlformats.org/drawingml/2006/main" noChangeAspect="1"/>
+            </wp:cNvGraphicFramePr>
+            <a:graphic xmlns:a="http://schemas.openxmlformats.org/drawingml/2006/main">
+              <a:graphicData uri="http://schemas.openxmlformats.org/drawingml/2006/picture">
+                <pic:pic xmlns:pic="http://schemas.openxmlformats.org/drawingml/2006/picture">
+                  <pic:nvPicPr>
+                    <pic:cNvPr id="2066216469" name=""/>
+                    <pic:cNvPicPr/>
+                  </pic:nvPicPr>
+                  <pic:blipFill rotWithShape="1">
+                    <a:blip r:embed="rId11">
+                      <a:extLst>
+                        <a:ext uri="{28A0092B-C50C-407E-A947-70E740481C1C}">
+                          <a14:useLocalDpi xmlns:a14="http://schemas.microsoft.com/office/drawing/2010/main" val="0"/>
+                        </a:ext>
+                      </a:extLst>
+                    </a:blip>
+                    <a:srcRect l="-1" t="16802" r="-183"/>
+                    <a:stretch>
+                      <a:fillRect/>
+                    </a:stretch>
+                  </pic:blipFill>
+                  <pic:spPr bwMode="auto">
+                    <a:xfrm>
+                      <a:off x="0" y="0"/>
+                      <a:ext cx="5725462" cy="1368014"/>
+                    </a:xfrm>
+                    <a:prstGeom prst="rect">
+                      <a:avLst/>
+                    </a:prstGeom>
+                    <a:ln>
+                      <a:noFill/>
+                    </a:ln>
+                    <a:extLst>
+                      <a:ext uri="{53640926-AAD7-44D8-BBD7-CCE9431645EC}">
+                        <a14:shadowObscured xmlns:a14="http://schemas.microsoft.com/office/drawing/2010/main"/>
+                      </a:ext>
+                    </a:extLst>
+                  </pic:spPr>
+                </pic:pic>
+              </a:graphicData>
+            </a:graphic>
+          </wp:inline>
+        </w:drawing>
+      </w:r>
+    </w:p>
+    <w:p>
+      <w:pPr>
+        <w:spacing w:after="200"/>
+        <w:jc w:val="center"/>
+        <w:rPr>
+          <w:rFonts w:ascii="Times New Roman" w:hAnsi="Times New Roman" w:cs="Times New Roman"/>
+          <w:i/>
+          <w:sz w:val="22"/>
+        </w:rPr>
+      </w:pPr>
+      <w:r>
+        <w:rPr>
+          <w:rFonts w:ascii="Times New Roman" w:hAnsi="Times New Roman" w:cs="Times New Roman"/>
+          <w:i/>
+          <w:sz w:val="22"/>
+        </w:rPr>
+        <w:t>Figure 4. Output of the first git commit.</w:t>
+      </w:r>
+    </w:p>
+    <w:p>
+      <w:pPr>
+        <w:pStyle w:val="Heading2"/>
+        <w:spacing w:before="200"/>
+        <w:rPr>
+          <w:rFonts w:ascii="Times New Roman" w:hAnsi="Times New Roman" w:cs="Times New Roman"/>
+          <w:b/>
+          <w:sz w:val="26"/>
+        </w:rPr>
+      </w:pPr>
+      <w:r>
+        <w:rPr>
+          <w:rFonts w:ascii="Times New Roman" w:hAnsi="Times New Roman" w:cs="Times New Roman"/>
+          <w:b/>
+          <w:sz w:val="26"/>
+        </w:rPr>
+        <w:lastRenderedPageBreak/>
+        <w:t>git remote add origin URL</w:t>
+      </w:r>
+    </w:p>
+    <w:p>
+      <w:pPr>
+        <w:jc w:val="both"/>
+        <w:rPr>
+          <w:rFonts w:ascii="Times New Roman" w:hAnsi="Times New Roman" w:cs="Times New Roman"/>
+        </w:rPr>
+      </w:pPr>
+      <w:r>
+        <w:rPr>
+          <w:rFonts w:ascii="Times New Roman" w:hAnsi="Times New Roman" w:cs="Times New Roman"/>
+        </w:rPr>
+        <w:t>Saves the GitHub address under the short name origin. origin is only a nickname. The address is https://github.com/ali-ghiax/Software-Development-Contruction-Lab.git.</w:t>
+      </w:r>
+    </w:p>
+    <w:p>
+      <w:pPr>
+        <w:pStyle w:val="Heading2"/>
+        <w:spacing w:before="200"/>
+        <w:rPr>
+          <w:rFonts w:ascii="Times New Roman" w:hAnsi="Times New Roman" w:cs="Times New Roman"/>
+          <w:b/>
+          <w:sz w:val="26"/>
+        </w:rPr>
+      </w:pPr>
+      <w:r>
+        <w:rPr>
+          <w:rFonts w:ascii="Times New Roman" w:hAnsi="Times New Roman" w:cs="Times New Roman"/>
+          <w:b/>
+          <w:sz w:val="26"/>
+        </w:rPr>
+        <w:t>git remote -v</w:t>
+      </w:r>
+    </w:p>
+    <w:p>
+      <w:pPr>
+        <w:jc w:val="both"/>
+        <w:rPr>
+          <w:rFonts w:ascii="Times New Roman" w:hAnsi="Times New Roman" w:cs="Times New Roman"/>
+        </w:rPr>
+      </w:pPr>
+      <w:r>
+        <w:rPr>
+          <w:rFonts w:ascii="Times New Roman" w:hAnsi="Times New Roman" w:cs="Times New Roman"/>
+        </w:rPr>
+        <w:t>Lists the fetch and push addresses. It was used to confirm that origin points at the correct repository. This command prints the addresses and does not change them.</w:t>
+      </w:r>
+    </w:p>
+    <w:p>
+      <w:pPr>
+        <w:spacing w:before="120" w:after="40"/>
+        <w:jc w:val="center"/>
+        <w:rPr>
+          <w:rFonts w:ascii="Times New Roman" w:hAnsi="Times New Roman" w:cs="Times New Roman"/>
+          <w:noProof/>
+        </w:rPr>
+      </w:pPr>
+    </w:p>
+    <w:p>
+      <w:pPr>
+        <w:spacing w:before="120" w:after="40"/>
+        <w:jc w:val="center"/>
+        <w:rPr>
+          <w:rFonts w:ascii="Times New Roman" w:hAnsi="Times New Roman" w:cs="Times New Roman"/>
+        </w:rPr>
+      </w:pPr>
+      <w:r>
+        <w:rPr>
+          <w:rFonts w:ascii="Times New Roman" w:hAnsi="Times New Roman" w:cs="Times New Roman"/>
+          <w:noProof/>
+        </w:rPr>
+        <w:drawing>
+          <wp:inline distT="0" distB="0" distL="0" distR="0" wp14:anchorId="2587B48D" wp14:editId="24127EF5">
+            <wp:extent cx="5876925" cy="1073150"/>
+            <wp:effectExtent l="0" t="0" r="0" b="0"/>
+            <wp:docPr id="595142625" name="Picture 5"/>
+            <wp:cNvGraphicFramePr>
+              <a:graphicFrameLocks xmlns:a="http://schemas.openxmlformats.org/drawingml/2006/main" noChangeAspect="1"/>
+            </wp:cNvGraphicFramePr>
+            <a:graphic xmlns:a="http://schemas.openxmlformats.org/drawingml/2006/main">
+              <a:graphicData uri="http://schemas.openxmlformats.org/drawingml/2006/picture">
+                <pic:pic xmlns:pic="http://schemas.openxmlformats.org/drawingml/2006/picture">
+                  <pic:nvPicPr>
+                    <pic:cNvPr id="595142625" name=""/>
+                    <pic:cNvPicPr/>
+                  </pic:nvPicPr>
+                  <pic:blipFill rotWithShape="1">
+                    <a:blip r:embed="rId12">
+                      <a:extLst>
+                        <a:ext uri="{28A0092B-C50C-407E-A947-70E740481C1C}">
+                          <a14:useLocalDpi xmlns:a14="http://schemas.microsoft.com/office/drawing/2010/main" val="0"/>
+                        </a:ext>
+                      </a:extLst>
+                    </a:blip>
+                    <a:srcRect t="19905" r="-2862"/>
+                    <a:stretch>
+                      <a:fillRect/>
+                    </a:stretch>
+                  </pic:blipFill>
+                  <pic:spPr bwMode="auto">
+                    <a:xfrm>
+                      <a:off x="0" y="0"/>
+                      <a:ext cx="5878530" cy="1073443"/>
+                    </a:xfrm>
+                    <a:prstGeom prst="rect">
+                      <a:avLst/>
+                    </a:prstGeom>
+                    <a:ln>
+                      <a:noFill/>
+                    </a:ln>
+                    <a:extLst>
+                      <a:ext uri="{53640926-AAD7-44D8-BBD7-CCE9431645EC}">
+                        <a14:shadowObscured xmlns:a14="http://schemas.microsoft.com/office/drawing/2010/main"/>
+                      </a:ext>
+                    </a:extLst>
+                  </pic:spPr>
+                </pic:pic>
+              </a:graphicData>
+            </a:graphic>
+          </wp:inline>
+        </w:drawing>
+      </w:r>
+    </w:p>
+    <w:p>
+      <w:pPr>
+        <w:spacing w:after="200"/>
+        <w:jc w:val="center"/>
+        <w:rPr>
+          <w:rFonts w:ascii="Times New Roman" w:hAnsi="Times New Roman" w:cs="Times New Roman"/>
+          <w:i/>
+          <w:sz w:val="22"/>
+        </w:rPr>
+      </w:pPr>
+      <w:r>
+        <w:rPr>
+          <w:rFonts w:ascii="Times New Roman" w:hAnsi="Times New Roman" w:cs="Times New Roman"/>
+          <w:i/>
+          <w:sz w:val="22"/>
+        </w:rPr>
+        <w:t>Figure 5. Output of git remote add origin and git remote -v.</w:t>
+      </w:r>
+    </w:p>
+    <w:p>
+      <w:pPr>
+        <w:pStyle w:val="Heading2"/>
+        <w:spacing w:before="200"/>
+        <w:rPr>
+          <w:rFonts w:ascii="Times New Roman" w:hAnsi="Times New Roman" w:cs="Times New Roman"/>
+          <w:b/>
+          <w:sz w:val="26"/>
+        </w:rPr>
+      </w:pPr>
+      <w:r>
+        <w:rPr>
+          <w:rFonts w:ascii="Times New Roman" w:hAnsi="Times New Roman" w:cs="Times New Roman"/>
+          <w:b/>
+          <w:sz w:val="26"/>
+        </w:rPr>
+        <w:t>git push -u origin main</w:t>
+      </w:r>
+    </w:p>
+    <w:p>
+      <w:pPr>
+        <w:jc w:val="both"/>
+        <w:rPr>
+          <w:rFonts w:ascii="Times New Roman" w:hAnsi="Times New Roman" w:cs="Times New Roman"/>
+        </w:rPr>
+      </w:pPr>
+      <w:r>
+        <w:rPr>
+          <w:rFonts w:ascii="Times New Roman" w:hAnsi="Times New Roman" w:cs="Times New Roman"/>
+        </w:rPr>
+        <w:t>Uploads the local main branch to origin. The -u flag remembers that main tracks origin/main, so later uploads can use git push. The first attempt failed because the PC could not open a connection to github.com on port 443.</w:t>
+      </w:r>
+    </w:p>
+    <w:p>
+      <w:pPr>
+        <w:pStyle w:val="Heading2"/>
+        <w:spacing w:before="200"/>
+        <w:rPr>
+          <w:rFonts w:ascii="Times New Roman" w:hAnsi="Times New Roman" w:cs="Times New Roman"/>
+          <w:b/>
+          <w:sz w:val="26"/>
+        </w:rPr>
+      </w:pPr>
+      <w:r>
+        <w:rPr>
+          <w:rFonts w:ascii="Times New Roman" w:hAnsi="Times New Roman" w:cs="Times New Roman"/>
+          <w:b/>
+          <w:sz w:val="26"/>
+        </w:rPr>
+        <w:t>git -c http.version=HTTP/1.1 push -u origin main</w:t>
+      </w:r>
+    </w:p>
+    <w:p>
+      <w:pPr>
+        <w:jc w:val="both"/>
+        <w:rPr>
+          <w:rFonts w:ascii="Times New Roman" w:hAnsi="Times New Roman" w:cs="Times New Roman"/>
+        </w:rPr>
+      </w:pPr>
+      <w:r>
+        <w:rPr>
+          <w:rFonts w:ascii="Times New Roman" w:hAnsi="Times New Roman" w:cs="Times New Roman"/>
+        </w:rPr>
+        <w:t>The same upload, with one temporary setting: use HTTP version 1.1 for this command only. The -c flag does not change the saved Git settings. This attempt succeeded. Git created main on GitHub and set the local branch to track it.</w:t>
+      </w:r>
+    </w:p>
+    <w:p>
+      <w:pPr>
+        <w:spacing w:before="120" w:after="40"/>
+        <w:jc w:val="center"/>
+        <w:rPr>
+          <w:rFonts w:ascii="Times New Roman" w:hAnsi="Times New Roman" w:cs="Times New Roman"/>
+          <w:noProof/>
+        </w:rPr>
+      </w:pPr>
+    </w:p>
+    <w:p>
+      <w:pPr>
+        <w:spacing w:before="120" w:after="40"/>
+        <w:jc w:val="center"/>
+        <w:rPr>
+          <w:rFonts w:ascii="Times New Roman" w:hAnsi="Times New Roman" w:cs="Times New Roman"/>
+        </w:rPr>
+      </w:pPr>
+      <w:r>
+        <w:rPr>
+          <w:rFonts w:ascii="Times New Roman" w:hAnsi="Times New Roman" w:cs="Times New Roman"/>
+          <w:noProof/>
+        </w:rPr>
+        <w:drawing>
+          <wp:inline distT="0" distB="0" distL="0" distR="0" wp14:anchorId="0FC4A1C0" wp14:editId="34AD78F1">
+            <wp:extent cx="5705475" cy="2040890"/>
+            <wp:effectExtent l="0" t="0" r="9525" b="0"/>
+            <wp:docPr id="128006745" name="Picture 6"/>
+            <wp:cNvGraphicFramePr>
+              <a:graphicFrameLocks xmlns:a="http://schemas.openxmlformats.org/drawingml/2006/main" noChangeAspect="1"/>
+            </wp:cNvGraphicFramePr>
+            <a:graphic xmlns:a="http://schemas.openxmlformats.org/drawingml/2006/main">
+              <a:graphicData uri="http://schemas.openxmlformats.org/drawingml/2006/picture">
+                <pic:pic xmlns:pic="http://schemas.openxmlformats.org/drawingml/2006/picture">
+                  <pic:nvPicPr>
+                    <pic:cNvPr id="128006745" name=""/>
+                    <pic:cNvPicPr/>
+                  </pic:nvPicPr>
+                  <pic:blipFill rotWithShape="1">
+                    <a:blip r:embed="rId13">
+                      <a:extLst>
+                        <a:ext uri="{28A0092B-C50C-407E-A947-70E740481C1C}">
+                          <a14:useLocalDpi xmlns:a14="http://schemas.microsoft.com/office/drawing/2010/main" val="0"/>
+                        </a:ext>
+                      </a:extLst>
+                    </a:blip>
+                    <a:srcRect t="11558" r="150"/>
+                    <a:stretch>
+                      <a:fillRect/>
+                    </a:stretch>
+                  </pic:blipFill>
+                  <pic:spPr bwMode="auto">
+                    <a:xfrm>
+                      <a:off x="0" y="0"/>
+                      <a:ext cx="5706442" cy="2041236"/>
+                    </a:xfrm>
+                    <a:prstGeom prst="rect">
+                      <a:avLst/>
+                    </a:prstGeom>
+                    <a:ln>
+                      <a:noFill/>
+                    </a:ln>
+                    <a:extLst>
+                      <a:ext uri="{53640926-AAD7-44D8-BBD7-CCE9431645EC}">
+                        <a14:shadowObscured xmlns:a14="http://schemas.microsoft.com/office/drawing/2010/main"/>
+                      </a:ext>
+                    </a:extLst>
+                  </pic:spPr>
+                </pic:pic>
+              </a:graphicData>
+            </a:graphic>
+          </wp:inline>
+        </w:drawing>
+      </w:r>
+    </w:p>
+    <w:p>
+      <w:pPr>
+        <w:spacing w:after="200"/>
+        <w:jc w:val="center"/>
+        <w:rPr>
+          <w:rFonts w:ascii="Times New Roman" w:hAnsi="Times New Roman" w:cs="Times New Roman"/>
+          <w:i/>
+          <w:sz w:val="22"/>
+        </w:rPr>
+      </w:pPr>
+      <w:r>
+        <w:rPr>
+          <w:rFonts w:ascii="Times New Roman" w:hAnsi="Times New Roman" w:cs="Times New Roman"/>
+          <w:i/>
+          <w:sz w:val="22"/>
+        </w:rPr>
+        <w:t>Figure 6. The failed push, then the successful push with HTTP/1.1.</w:t>
+      </w:r>
+    </w:p>
+    <w:p>
+      <w:pPr>
+        <w:pStyle w:val="Heading2"/>
+        <w:spacing w:before="200"/>
+        <w:rPr>
+          <w:rFonts w:ascii="Times New Roman" w:hAnsi="Times New Roman" w:cs="Times New Roman"/>
+          <w:b/>
+          <w:sz w:val="26"/>
+        </w:rPr>
+      </w:pPr>
+      <w:r>
+        <w:rPr>
+          <w:rFonts w:ascii="Times New Roman" w:hAnsi="Times New Roman" w:cs="Times New Roman"/>
+          <w:b/>
+          <w:sz w:val="26"/>
+        </w:rPr>
+        <w:lastRenderedPageBreak/>
+        <w:t>git add -A</w:t>
+      </w:r>
+    </w:p>
+    <w:p>
+      <w:pPr>
+        <w:jc w:val="both"/>
+        <w:rPr>
+          <w:rFonts w:ascii="Times New Roman" w:hAnsi="Times New Roman" w:cs="Times New Roman"/>
+        </w:rPr>
+      </w:pPr>
+      <w:r>
+        <w:rPr>
+          <w:rFonts w:ascii="Times New Roman" w:hAnsi="Times New Roman" w:cs="Times New Roman"/>
+        </w:rPr>
+        <w:t>Stages every change, including deleted files. This was required when the program was simplified, because student_result.cpp was removed and hello.cpp was added.</w:t>
+      </w:r>
+    </w:p>
+    <w:p>
+      <w:pPr>
+        <w:pStyle w:val="Heading2"/>
+        <w:spacing w:before="200"/>
+        <w:rPr>
+          <w:rFonts w:ascii="Times New Roman" w:hAnsi="Times New Roman" w:cs="Times New Roman"/>
+          <w:b/>
+          <w:sz w:val="26"/>
+        </w:rPr>
+      </w:pPr>
+      <w:r>
+        <w:rPr>
+          <w:rFonts w:ascii="Times New Roman" w:hAnsi="Times New Roman" w:cs="Times New Roman"/>
+          <w:b/>
+          <w:sz w:val="26"/>
+        </w:rPr>
+        <w:t>Second git commit</w:t>
+      </w:r>
+    </w:p>
+    <w:p>
+      <w:pPr>
+        <w:jc w:val="both"/>
+        <w:rPr>
+          <w:rFonts w:ascii="Times New Roman" w:hAnsi="Times New Roman" w:cs="Times New Roman"/>
+        </w:rPr>
+      </w:pPr>
+      <w:r>
+        <w:rPr>
+          <w:rFonts w:ascii="Times New Roman" w:hAnsi="Times New Roman" w:cs="Times New Roman"/>
+        </w:rPr>
+        <w:t>The second commit, d725f0c, replaced the calculator with the cout program and updated README.md. git diff --cached --stat was used before the commit to review the size of the change: 12 lines added and 169 lines removed.</w:t>
+      </w:r>
+    </w:p>
+    <w:p>
+      <w:pPr>
+        <w:spacing w:before="120" w:after="40"/>
+        <w:jc w:val="center"/>
+        <w:rPr>
+          <w:rFonts w:ascii="Times New Roman" w:hAnsi="Times New Roman" w:cs="Times New Roman"/>
+          <w:noProof/>
+        </w:rPr>
+      </w:pPr>
+    </w:p>
+    <w:p>
+      <w:pPr>
+        <w:spacing w:before="120" w:after="40"/>
+        <w:jc w:val="center"/>
+        <w:rPr>
+          <w:rFonts w:ascii="Times New Roman" w:hAnsi="Times New Roman" w:cs="Times New Roman"/>
+        </w:rPr>
+      </w:pPr>
+      <w:r>
+        <w:rPr>
+          <w:rFonts w:ascii="Times New Roman" w:hAnsi="Times New Roman" w:cs="Times New Roman"/>
+          <w:noProof/>
+        </w:rPr>
+        <w:drawing>
+          <wp:inline distT="0" distB="0" distL="0" distR="0" wp14:anchorId="54779A97" wp14:editId="664B5164">
+            <wp:extent cx="5780597" cy="2933700"/>
+            <wp:effectExtent l="0" t="0" r="0" b="0"/>
+            <wp:docPr id="206292167" name="Picture 7"/>
+            <wp:cNvGraphicFramePr>
+              <a:graphicFrameLocks xmlns:a="http://schemas.openxmlformats.org/drawingml/2006/main" noChangeAspect="1"/>
+            </wp:cNvGraphicFramePr>
+            <a:graphic xmlns:a="http://schemas.openxmlformats.org/drawingml/2006/main">
+              <a:graphicData uri="http://schemas.openxmlformats.org/drawingml/2006/picture">
+                <pic:pic xmlns:pic="http://schemas.openxmlformats.org/drawingml/2006/picture">
+                  <pic:nvPicPr>
+                    <pic:cNvPr id="206292167" name=""/>
+                    <pic:cNvPicPr/>
+                  </pic:nvPicPr>
+                  <pic:blipFill rotWithShape="1">
+                    <a:blip r:embed="rId14">
+                      <a:extLst>
+                        <a:ext uri="{28A0092B-C50C-407E-A947-70E740481C1C}">
+                          <a14:useLocalDpi xmlns:a14="http://schemas.microsoft.com/office/drawing/2010/main" val="0"/>
+                        </a:ext>
+                      </a:extLst>
+                    </a:blip>
+                    <a:srcRect l="-1167" t="9412"/>
+                    <a:stretch>
+                      <a:fillRect/>
+                    </a:stretch>
+                  </pic:blipFill>
+                  <pic:spPr bwMode="auto">
+                    <a:xfrm>
+                      <a:off x="0" y="0"/>
+                      <a:ext cx="5781688" cy="2934253"/>
+                    </a:xfrm>
+                    <a:prstGeom prst="rect">
+                      <a:avLst/>
+                    </a:prstGeom>
+                    <a:ln>
+                      <a:noFill/>
+                    </a:ln>
+                    <a:extLst>
+                      <a:ext uri="{53640926-AAD7-44D8-BBD7-CCE9431645EC}">
+                        <a14:shadowObscured xmlns:a14="http://schemas.microsoft.com/office/drawing/2010/main"/>
+                      </a:ext>
+                    </a:extLst>
+                  </pic:spPr>
+                </pic:pic>
+              </a:graphicData>
+            </a:graphic>
+          </wp:inline>
+        </w:drawing>
+      </w:r>
+    </w:p>
+    <w:p>
+      <w:pPr>
+        <w:spacing w:after="200"/>
+        <w:jc w:val="center"/>
+        <w:rPr>
+          <w:rFonts w:ascii="Times New Roman" w:hAnsi="Times New Roman" w:cs="Times New Roman"/>
+          <w:i/>
+          <w:sz w:val="22"/>
+        </w:rPr>
+      </w:pPr>
+      <w:r>
+        <w:rPr>
+          <w:rFonts w:ascii="Times New Roman" w:hAnsi="Times New Roman" w:cs="Times New Roman"/>
+          <w:i/>
+          <w:sz w:val="22"/>
+        </w:rPr>
+        <w:t>Figure 7. Output of git add -A, git status, and the commit that added hello.cpp.</w:t>
+      </w:r>
+    </w:p>
+    <w:p>
+      <w:pPr>
+        <w:pStyle w:val="Heading2"/>
+        <w:spacing w:before="200"/>
+        <w:rPr>
+          <w:rFonts w:ascii="Times New Roman" w:hAnsi="Times New Roman" w:cs="Times New Roman"/>
+          <w:b/>
+          <w:sz w:val="26"/>
+        </w:rPr>
+      </w:pPr>
+      <w:r>
+        <w:rPr>
+          <w:rFonts w:ascii="Times New Roman" w:hAnsi="Times New Roman" w:cs="Times New Roman"/>
+          <w:b/>
+          <w:sz w:val="26"/>
+        </w:rPr>
+        <w:t>git log --oneline --decorate</w:t>
+      </w:r>
+    </w:p>
+    <w:p>
+      <w:pPr>
+        <w:jc w:val="both"/>
+        <w:rPr>
+          <w:rFonts w:ascii="Times New Roman" w:hAnsi="Times New Roman" w:cs="Times New Roman"/>
+        </w:rPr>
+      </w:pPr>
+      <w:r>
+        <w:rPr>
+          <w:rFonts w:ascii="Times New Roman" w:hAnsi="Times New Roman" w:cs="Times New Roman"/>
+        </w:rPr>
+        <w:t>Prints the commit history, one line per commit. --decorate also shows the branch names. HEAD is the current commit. origin/main is the commit GitHub has.</w:t>
+      </w:r>
+    </w:p>
+    <w:p>
+      <w:pPr>
+        <w:spacing w:before="120" w:after="40"/>
+        <w:jc w:val="center"/>
+        <w:rPr>
+          <w:rFonts w:ascii="Times New Roman" w:hAnsi="Times New Roman" w:cs="Times New Roman"/>
+          <w:noProof/>
+        </w:rPr>
+      </w:pPr>
+    </w:p>
+    <w:p>
+      <w:pPr>
+        <w:spacing w:before="120" w:after="40"/>
+        <w:jc w:val="center"/>
+        <w:rPr>
+          <w:rFonts w:ascii="Times New Roman" w:hAnsi="Times New Roman" w:cs="Times New Roman"/>
+        </w:rPr>
+      </w:pPr>
+      <w:r>
+        <w:rPr>
+          <w:rFonts w:ascii="Times New Roman" w:hAnsi="Times New Roman" w:cs="Times New Roman"/>
+          <w:noProof/>
+        </w:rPr>
+        <w:drawing>
+          <wp:inline distT="0" distB="0" distL="0" distR="0" wp14:anchorId="22B62DFB" wp14:editId="033C0264">
+            <wp:extent cx="5705475" cy="1043305"/>
+            <wp:effectExtent l="0" t="0" r="9525" b="4445"/>
+            <wp:docPr id="1596266226" name="Picture 8"/>
+            <wp:cNvGraphicFramePr>
+              <a:graphicFrameLocks xmlns:a="http://schemas.openxmlformats.org/drawingml/2006/main" noChangeAspect="1"/>
+            </wp:cNvGraphicFramePr>
+            <a:graphic xmlns:a="http://schemas.openxmlformats.org/drawingml/2006/main">
+              <a:graphicData uri="http://schemas.openxmlformats.org/drawingml/2006/picture">
+                <pic:pic xmlns:pic="http://schemas.openxmlformats.org/drawingml/2006/picture">
+                  <pic:nvPicPr>
+                    <pic:cNvPr id="1596266226" name=""/>
+                    <pic:cNvPicPr/>
+                  </pic:nvPicPr>
+                  <pic:blipFill rotWithShape="1">
+                    <a:blip r:embed="rId15">
+                      <a:extLst>
+                        <a:ext uri="{28A0092B-C50C-407E-A947-70E740481C1C}">
+                          <a14:useLocalDpi xmlns:a14="http://schemas.microsoft.com/office/drawing/2010/main" val="0"/>
+                        </a:ext>
+                      </a:extLst>
+                    </a:blip>
+                    <a:srcRect l="-1" t="19775" r="163"/>
+                    <a:stretch>
+                      <a:fillRect/>
+                    </a:stretch>
+                  </pic:blipFill>
+                  <pic:spPr bwMode="auto">
+                    <a:xfrm>
+                      <a:off x="0" y="0"/>
+                      <a:ext cx="5705690" cy="1043344"/>
+                    </a:xfrm>
+                    <a:prstGeom prst="rect">
+                      <a:avLst/>
+                    </a:prstGeom>
+                    <a:ln>
+                      <a:noFill/>
+                    </a:ln>
+                    <a:extLst>
+                      <a:ext uri="{53640926-AAD7-44D8-BBD7-CCE9431645EC}">
+                        <a14:shadowObscured xmlns:a14="http://schemas.microsoft.com/office/drawing/2010/main"/>
+                      </a:ext>
+                    </a:extLst>
+                  </pic:spPr>
+                </pic:pic>
+              </a:graphicData>
+            </a:graphic>
+          </wp:inline>
+        </w:drawing>
+      </w:r>
+    </w:p>
+    <w:p>
+      <w:pPr>
+        <w:spacing w:after="200"/>
+        <w:jc w:val="center"/>
+        <w:rPr>
+          <w:rFonts w:ascii="Times New Roman" w:hAnsi="Times New Roman" w:cs="Times New Roman"/>
+          <w:i/>
+          <w:sz w:val="22"/>
+        </w:rPr>
+      </w:pPr>
+      <w:r>
+        <w:rPr>
+          <w:rFonts w:ascii="Times New Roman" w:hAnsi="Times New Roman" w:cs="Times New Roman"/>
+          <w:i/>
+          <w:sz w:val="22"/>
+        </w:rPr>
+        <w:t>Figure 8. Output of git log --oneline --decorate.</w:t>
+      </w:r>
+    </w:p>
+    <w:p>
+      <w:pPr>
+        <w:pStyle w:val="Heading2"/>
+        <w:spacing w:before="200"/>
+        <w:rPr>
+          <w:rFonts w:ascii="Times New Roman" w:hAnsi="Times New Roman" w:cs="Times New Roman"/>
+          <w:b/>
+          <w:sz w:val="26"/>
+        </w:rPr>
+      </w:pPr>
+      <w:r>
+        <w:rPr>
+          <w:rFonts w:ascii="Times New Roman" w:hAnsi="Times New Roman" w:cs="Times New Roman"/>
+          <w:b/>
+          <w:sz w:val="26"/>
+        </w:rPr>
+        <w:lastRenderedPageBreak/>
+        <w:t>git status after the upload</w:t>
+      </w:r>
+    </w:p>
+    <w:p>
+      <w:pPr>
+        <w:jc w:val="both"/>
+        <w:rPr>
+          <w:rFonts w:ascii="Times New Roman" w:hAnsi="Times New Roman" w:cs="Times New Roman"/>
+        </w:rPr>
+      </w:pPr>
+      <w:r>
+        <w:rPr>
+          <w:rFonts w:ascii="Times New Roman" w:hAnsi="Times New Roman" w:cs="Times New Roman"/>
+        </w:rPr>
+        <w:t>After the report was pushed, git status showed that main matches origin/main and that the working tree is clean. A clean tree means every saved change has already been committed.</w:t>
+      </w:r>
+    </w:p>
+    <w:p>
+      <w:pPr>
+        <w:spacing w:before="120" w:after="40"/>
+        <w:jc w:val="center"/>
+        <w:rPr>
+          <w:rFonts w:ascii="Times New Roman" w:hAnsi="Times New Roman" w:cs="Times New Roman"/>
+          <w:noProof/>
+        </w:rPr>
+      </w:pPr>
+    </w:p>
+    <w:p>
+      <w:pPr>
+        <w:spacing w:before="120" w:after="40"/>
+        <w:jc w:val="center"/>
+        <w:rPr>
+          <w:rFonts w:ascii="Times New Roman" w:hAnsi="Times New Roman" w:cs="Times New Roman"/>
+        </w:rPr>
+      </w:pPr>
+      <w:r>
+        <w:rPr>
+          <w:rFonts w:ascii="Times New Roman" w:hAnsi="Times New Roman" w:cs="Times New Roman"/>
+          <w:noProof/>
+        </w:rPr>
+        <w:drawing>
+          <wp:inline distT="0" distB="0" distL="0" distR="0" wp14:anchorId="77BE0262" wp14:editId="7DB78DD0">
+            <wp:extent cx="5772150" cy="1122680"/>
+            <wp:effectExtent l="0" t="0" r="0" b="1270"/>
+            <wp:docPr id="236343653" name="Picture 9"/>
+            <wp:cNvGraphicFramePr>
+              <a:graphicFrameLocks xmlns:a="http://schemas.openxmlformats.org/drawingml/2006/main" noChangeAspect="1"/>
+            </wp:cNvGraphicFramePr>
+            <a:graphic xmlns:a="http://schemas.openxmlformats.org/drawingml/2006/main">
+              <a:graphicData uri="http://schemas.openxmlformats.org/drawingml/2006/picture">
+                <pic:pic xmlns:pic="http://schemas.openxmlformats.org/drawingml/2006/picture">
+                  <pic:nvPicPr>
+                    <pic:cNvPr id="236343653" name=""/>
+                    <pic:cNvPicPr/>
+                  </pic:nvPicPr>
+                  <pic:blipFill rotWithShape="1">
+                    <a:blip r:embed="rId16">
+                      <a:extLst>
+                        <a:ext uri="{28A0092B-C50C-407E-A947-70E740481C1C}">
+                          <a14:useLocalDpi xmlns:a14="http://schemas.microsoft.com/office/drawing/2010/main" val="0"/>
+                        </a:ext>
+                      </a:extLst>
+                    </a:blip>
+                    <a:srcRect t="19746" r="-1039"/>
+                    <a:stretch>
+                      <a:fillRect/>
+                    </a:stretch>
+                  </pic:blipFill>
+                  <pic:spPr bwMode="auto">
+                    <a:xfrm>
+                      <a:off x="0" y="0"/>
+                      <a:ext cx="5774366" cy="1123111"/>
+                    </a:xfrm>
+                    <a:prstGeom prst="rect">
+                      <a:avLst/>
+                    </a:prstGeom>
+                    <a:ln>
+                      <a:noFill/>
+                    </a:ln>
+                    <a:extLst>
+                      <a:ext uri="{53640926-AAD7-44D8-BBD7-CCE9431645EC}">
+                        <a14:shadowObscured xmlns:a14="http://schemas.microsoft.com/office/drawing/2010/main"/>
+                      </a:ext>
+                    </a:extLst>
+                  </pic:spPr>
+                </pic:pic>
+              </a:graphicData>
+            </a:graphic>
+          </wp:inline>
+        </w:drawing>
+      </w:r>
+    </w:p>
+    <w:p>
+      <w:pPr>
+        <w:spacing w:after="200"/>
+        <w:jc w:val="center"/>
+        <w:rPr>
+          <w:rFonts w:ascii="Times New Roman" w:hAnsi="Times New Roman" w:cs="Times New Roman"/>
+          <w:i/>
+          <w:sz w:val="22"/>
+        </w:rPr>
+      </w:pPr>
+      <w:r>
+        <w:rPr>
+          <w:rFonts w:ascii="Times New Roman" w:hAnsi="Times New Roman" w:cs="Times New Roman"/>
+          <w:i/>
+          <w:sz w:val="22"/>
+        </w:rPr>
+        <w:t>Figure 9. Output of git status after the repository was uploaded.</w:t>
+      </w:r>
+    </w:p>
+    <w:p>
+      <w:pPr>
+        <w:pStyle w:val="Heading2"/>
+        <w:spacing w:before="200"/>
+        <w:rPr>
+          <w:rFonts w:ascii="Times New Roman" w:hAnsi="Times New Roman" w:cs="Times New Roman"/>
+          <w:b/>
+          <w:sz w:val="26"/>
+        </w:rPr>
+      </w:pPr>
+      <w:r>
+        <w:rPr>
+          <w:rFonts w:ascii="Times New Roman" w:hAnsi="Times New Roman" w:cs="Times New Roman"/>
+          <w:b/>
+          <w:sz w:val="26"/>
+        </w:rPr>
+        <w:t>git ls-files</w:t>
+      </w:r>
+    </w:p>
+    <w:p>
+      <w:pPr>
+        <w:jc w:val="both"/>
+        <w:rPr>
+          <w:rFonts w:ascii="Times New Roman" w:hAnsi="Times New Roman" w:cs="Times New Roman"/>
+        </w:rPr>
+      </w:pPr>
+      <w:r>
+        <w:rPr>
+          <w:rFonts w:ascii="Times New Roman" w:hAnsi="Times New Roman" w:cs="Times New Roman"/>
+        </w:rPr>
+        <w:t>Lists the files that Git is tracking. These are the files that were uploaded. Compiled programs are left out because .gitignore tells Git to skip .exe, .o, and .obj files.</w:t>
+      </w:r>
+    </w:p>
+    <w:p>
+      <w:pPr>
+        <w:spacing w:before="120" w:after="40"/>
+        <w:jc w:val="center"/>
+        <w:rPr>
+          <w:rFonts w:ascii="Times New Roman" w:hAnsi="Times New Roman" w:cs="Times New Roman"/>
+          <w:noProof/>
+        </w:rPr>
+      </w:pPr>
+    </w:p>
+    <w:p>
+      <w:pPr>
+        <w:spacing w:before="120" w:after="40"/>
+        <w:jc w:val="center"/>
+        <w:rPr>
+          <w:rFonts w:ascii="Times New Roman" w:hAnsi="Times New Roman" w:cs="Times New Roman"/>
+        </w:rPr>
+      </w:pPr>
+      <w:r>
+        <w:rPr>
+          <w:rFonts w:ascii="Times New Roman" w:hAnsi="Times New Roman" w:cs="Times New Roman"/>
+          <w:noProof/>
+        </w:rPr>
+        <w:drawing>
+          <wp:inline distT="0" distB="0" distL="0" distR="0" wp14:anchorId="147D0A33" wp14:editId="7BD219B2">
+            <wp:extent cx="5724525" cy="1082675"/>
+            <wp:effectExtent l="0" t="0" r="9525" b="3175"/>
+            <wp:docPr id="45232272" name="Picture 10"/>
+            <wp:cNvGraphicFramePr>
+              <a:graphicFrameLocks xmlns:a="http://schemas.openxmlformats.org/drawingml/2006/main" noChangeAspect="1"/>
+            </wp:cNvGraphicFramePr>
+            <a:graphic xmlns:a="http://schemas.openxmlformats.org/drawingml/2006/main">
+              <a:graphicData uri="http://schemas.openxmlformats.org/drawingml/2006/picture">
+                <pic:pic xmlns:pic="http://schemas.openxmlformats.org/drawingml/2006/picture">
+                  <pic:nvPicPr>
+                    <pic:cNvPr id="45232272" name=""/>
+                    <pic:cNvPicPr/>
+                  </pic:nvPicPr>
+                  <pic:blipFill rotWithShape="1">
+                    <a:blip r:embed="rId17">
+                      <a:extLst>
+                        <a:ext uri="{28A0092B-C50C-407E-A947-70E740481C1C}">
+                          <a14:useLocalDpi xmlns:a14="http://schemas.microsoft.com/office/drawing/2010/main" val="0"/>
+                        </a:ext>
+                      </a:extLst>
+                    </a:blip>
+                    <a:srcRect t="20882" r="-202"/>
+                    <a:stretch>
+                      <a:fillRect/>
+                    </a:stretch>
+                  </pic:blipFill>
+                  <pic:spPr bwMode="auto">
+                    <a:xfrm>
+                      <a:off x="0" y="0"/>
+                      <a:ext cx="5726566" cy="1083061"/>
+                    </a:xfrm>
+                    <a:prstGeom prst="rect">
+                      <a:avLst/>
+                    </a:prstGeom>
+                    <a:ln>
+                      <a:noFill/>
+                    </a:ln>
+                    <a:extLst>
+                      <a:ext uri="{53640926-AAD7-44D8-BBD7-CCE9431645EC}">
+                        <a14:shadowObscured xmlns:a14="http://schemas.microsoft.com/office/drawing/2010/main"/>
+                      </a:ext>
+                    </a:extLst>
+                  </pic:spPr>
+                </pic:pic>
+              </a:graphicData>
+            </a:graphic>
+          </wp:inline>
+        </w:drawing>
+      </w:r>
+    </w:p>
+    <w:p>
+      <w:pPr>
+        <w:spacing w:after="200"/>
+        <w:jc w:val="center"/>
+        <w:rPr>
+          <w:rFonts w:ascii="Times New Roman" w:hAnsi="Times New Roman" w:cs="Times New Roman"/>
+          <w:i/>
+          <w:sz w:val="22"/>
+        </w:rPr>
+      </w:pPr>
+      <w:r>
+        <w:rPr>
+          <w:rFonts w:ascii="Times New Roman" w:hAnsi="Times New Roman" w:cs="Times New Roman"/>
+          <w:i/>
+          <w:sz w:val="22"/>
+        </w:rPr>
+        <w:t>Figure 10. Output of git ls-files.</w:t>
+      </w:r>
+    </w:p>
+    <w:p>
+      <w:pPr>
+        <w:pStyle w:val="Heading1"/>
+        <w:spacing w:before="240" w:after="120"/>
+        <w:rPr>
+          <w:rFonts w:ascii="Times New Roman" w:hAnsi="Times New Roman" w:cs="Times New Roman"/>
+          <w:b/>
+          <w:sz w:val="32"/>
+        </w:rPr>
+      </w:pPr>
+      <w:r>
+        <w:rPr>
+          <w:rFonts w:ascii="Times New Roman" w:hAnsi="Times New Roman" w:cs="Times New Roman"/>
+          <w:b/>
+          <w:sz w:val="32"/>
+        </w:rPr>
+        <w:t>5. Files in the repository</w:t>
+      </w:r>
+    </w:p>
+    <w:p>
+      <w:pPr>
+        <w:jc w:val="both"/>
+        <w:rPr>
+          <w:rFonts w:ascii="Times New Roman" w:hAnsi="Times New Roman" w:cs="Times New Roman"/>
+        </w:rPr>
+      </w:pPr>
+      <w:r>
+        <w:rPr>
+          <w:rFonts w:ascii="Times New Roman" w:hAnsi="Times New Roman" w:cs="Times New Roman"/>
+        </w:rPr>
+        <w:t>hello.cpp is the program. README.md explains what it prints and how to compile it. .gitignore keeps compiled files out of GitHub. This report explains the commands and includes a picture of each command's output.</w:t>
+      </w:r>
+    </w:p>
+    <w:p>
+      <w:pPr>
+        <w:pStyle w:val="Heading1"/>
+        <w:spacing w:before="240" w:after="120"/>
+        <w:rPr>
+          <w:rFonts w:ascii="Times New Roman" w:hAnsi="Times New Roman" w:cs="Times New Roman"/>
+          <w:b/>
+          <w:sz w:val="32"/>
+        </w:rPr>
+      </w:pPr>
+      <w:r>
+        <w:rPr>
+          <w:rFonts w:ascii="Times New Roman" w:hAnsi="Times New Roman" w:cs="Times New Roman"/>
+          <w:b/>
+          <w:sz w:val="32"/>
+        </w:rPr>
+        <w:t>6. Conclusion</w:t>
+      </w:r>
+    </w:p>
+    <w:p>
+      <w:pPr>
+        <w:jc w:val="both"/>
+        <w:rPr>
+          <w:rFonts w:ascii="Times New Roman" w:hAnsi="Times New Roman" w:cs="Times New Roman"/>
+        </w:rPr>
+      </w:pPr>
+      <w:r>
+        <w:rPr>
+          <w:rFonts w:ascii="Times New Roman" w:hAnsi="Times New Roman" w:cs="Times New Roman"/>
+        </w:rPr>
+        <w:t>A simple C++ program that prints two lines with cout is stored in hello.cpp. Git was used to create a local repository, review the files, save the commits, connect the folder to GitHub, and upload the main branch. The first push failed on the network connection. The retry with HTTP/1.1 completed the upload. Each command in this report is shown with the terminal picture of the output it produced. The repository address is https://github.com/ali-ghiax/Software-Development-Contruction-Lab.</w:t>
+      </w:r>
+    </w:p>
+    <w:p>
+      <w:pPr>
+        <w:rPr>
+          <w:rFonts w:ascii="Times New Roman" w:hAnsi="Times New Roman" w:cs="Times New Roman"/>
+        </w:rPr>
+      </w:pPr>
+      <w:r>
+        <w:rPr>
+          <w:rFonts w:ascii="Times New Roman" w:hAnsi="Times New Roman" w:cs="Times New Roman"/>
+        </w:rPr>
+        <w:br w:type="page"/>
+      </w:r>
+    </w:p>
+    <w:p>
+      <w:pPr>
+        <w:pStyle w:val="Heading1"/>
+        <w:spacing w:before="240" w:after="120"/>
+        <w:rPr>
+          <w:rFonts w:ascii="Times New Roman" w:hAnsi="Times New Roman" w:cs="Times New Roman"/>
+          <w:b/>
+          <w:sz w:val="32"/>
+        </w:rPr>
+      </w:pPr>
+      <w:r>
+        <w:rPr>
+          <w:rFonts w:ascii="Times New Roman" w:hAnsi="Times New Roman" w:cs="Times New Roman"/>
+          <w:b/>
+          <w:sz w:val="32"/>
+        </w:rPr>
+        <w:t>7. Individual and team workflow lab</w:t>
+      </w:r>
+    </w:p>
+    <w:p>
+      <w:pPr>
+        <w:jc w:val="both"/>
+        <w:rPr>
+          <w:rFonts w:ascii="Times New Roman" w:hAnsi="Times New Roman" w:cs="Times New Roman"/>
+        </w:rPr>
+      </w:pPr>
+      <w:r>
+        <w:rPr>
+          <w:rFonts w:ascii="Times New Roman" w:hAnsi="Times New Roman" w:cs="Times New Roman"/>
+        </w:rPr>
+        <w:t>This part records the second exercise in the same repository. The work follows the lab handout on individual and team GitHub workflows. The repository was already on GitHub, so the new work was committed on main and on feature branches, then integrated with pull requests. A merge conflict was created on purpose and resolved.</w:t>
+      </w:r>
+    </w:p>
+    <w:p>
+      <w:pPr>
+        <w:pStyle w:val="Heading2"/>
+        <w:spacing w:before="200"/>
+        <w:rPr>
+          <w:rFonts w:ascii="Times New Roman" w:hAnsi="Times New Roman" w:cs="Times New Roman"/>
+          <w:b/>
+          <w:sz w:val="26"/>
+        </w:rPr>
+      </w:pPr>
+      <w:r>
+        <w:rPr>
+          <w:rFonts w:ascii="Times New Roman" w:hAnsi="Times New Roman" w:cs="Times New Roman"/>
+          <w:b/>
+          <w:sz w:val="26"/>
+        </w:rPr>
+        <w:t>What was added</w:t>
+      </w:r>
+    </w:p>
+    <w:p>
+      <w:pPr>
+        <w:jc w:val="both"/>
+        <w:rPr>
+          <w:rFonts w:ascii="Times New Roman" w:hAnsi="Times New Roman" w:cs="Times New Roman"/>
+        </w:rPr>
+      </w:pPr>
+      <w:r>
+        <w:rPr>
+          <w:rFonts w:ascii="Times New Roman" w:hAnsi="Times New Roman" w:cs="Times New Roman"/>
+        </w:rPr>
+        <w:t>README.md now contains the project overview, the learning objectives, compile instructions, and a contribution summary. src/task_tracker.cpp is a small Student Task Tracker. It stores a task id, a title, and a done flag, and it can add a task or list the tasks. docs/test-plan.md lists the checks for that program. hello.cpp is unchanged.</w:t>
+      </w:r>
+    </w:p>
+    <w:p>
+      <w:pPr>
+        <w:pStyle w:val="Heading2"/>
+        <w:spacing w:before="200"/>
+        <w:rPr>
+          <w:rFonts w:ascii="Times New Roman" w:hAnsi="Times New Roman" w:cs="Times New Roman"/>
+          <w:b/>
+          <w:sz w:val="26"/>
+        </w:rPr>
+      </w:pPr>
+      <w:r>
+        <w:rPr>
+          <w:rFonts w:ascii="Times New Roman" w:hAnsi="Times New Roman" w:cs="Times New Roman"/>
+          <w:b/>
+          <w:sz w:val="26"/>
+        </w:rPr>
+        <w:t>Issues and pull requests</w:t>
+      </w:r>
+    </w:p>
+    <w:p>
+      <w:pPr>
+        <w:jc w:val="both"/>
+        <w:rPr>
+          <w:rFonts w:ascii="Times New Roman" w:hAnsi="Times New Roman" w:cs="Times New Roman"/>
+        </w:rPr>
+      </w:pPr>
+      <w:r>
+        <w:rPr>
+          <w:rFonts w:ascii="Times New Roman" w:hAnsi="Times New Roman" w:cs="Times New Roman"/>
+        </w:rPr>
+        <w:t>Three issues were opened for the tracker. Issue 1 asked for the task record, issue 2 asked for adding a task, and issue 3 asked for listing tasks. Each issue was closed by the pull request that completed it.</w:t>
+      </w:r>
+    </w:p>
+    <w:p>
+      <w:pPr>
+        <w:jc w:val="both"/>
+        <w:rPr>
+          <w:rFonts w:ascii="Times New Roman" w:hAnsi="Times New Roman" w:cs="Times New Roman"/>
+        </w:rPr>
+      </w:pPr>
+      <w:r>
+        <w:rPr>
+          <w:rFonts w:ascii="Times New Roman" w:hAnsi="Times New Roman" w:cs="Times New Roman"/>
+        </w:rPr>
+        <w:t>Pull request 4 merged feature/add-objectives into main. Pull request 5 merged feature/task-model. Pull request 6 merged feature/add-task. Pull request 7 merged feature/list-tasks. Pull request 8 merged review/test-plan. Each tracker pull request includes a short review comment. The repository address is https://github.com/ali-ghiax/Software-Development-Contruction-Lab.</w:t>
+      </w:r>
+    </w:p>
+    <w:p>
+      <w:pPr>
+        <w:pStyle w:val="Heading1"/>
+        <w:spacing w:before="240" w:after="120"/>
+        <w:rPr>
+          <w:rFonts w:ascii="Times New Roman" w:hAnsi="Times New Roman" w:cs="Times New Roman"/>
+          <w:b/>
+          <w:sz w:val="32"/>
+        </w:rPr>
+      </w:pPr>
+      <w:r>
+        <w:rPr>
+          <w:rFonts w:ascii="Times New Roman" w:hAnsi="Times New Roman" w:cs="Times New Roman"/>
+          <w:b/>
+          <w:sz w:val="32"/>
+        </w:rPr>
+        <w:t>8. Commands used for branches and the conflict</w:t>
+      </w:r>
+    </w:p>
+    <w:p>
+      <w:pPr>
+        <w:pStyle w:val="Heading2"/>
+        <w:spacing w:before="200"/>
+        <w:rPr>
+          <w:rFonts w:ascii="Times New Roman" w:hAnsi="Times New Roman" w:cs="Times New Roman"/>
+          <w:b/>
+          <w:sz w:val="26"/>
+        </w:rPr>
+      </w:pPr>
+      <w:r>
+        <w:rPr>
+          <w:rFonts w:ascii="Times New Roman" w:hAnsi="Times New Roman" w:cs="Times New Roman"/>
+          <w:b/>
+          <w:sz w:val="26"/>
+        </w:rPr>
+        <w:t>git switch -c branch-name</w:t>
+      </w:r>
+    </w:p>
+    <w:p>
+      <w:pPr>
+        <w:jc w:val="both"/>
+        <w:rPr>
+          <w:rFonts w:ascii="Times New Roman" w:hAnsi="Times New Roman" w:cs="Times New Roman"/>
+        </w:rPr>
+      </w:pPr>
+      <w:r>
+        <w:rPr>
+          <w:rFonts w:ascii="Times New Roman" w:hAnsi="Times New Roman" w:cs="Times New Roman"/>
+        </w:rPr>
+        <w:t>Creates a new branch from the current commit and switches onto it. The new commits then stay on that branch until they are merged. This was used for feature/add-objectives, feature/task-model, feature/add-task, feature/list-tasks, review/test-plan, and conflict-practice.</w:t>
+      </w:r>
+    </w:p>
+    <w:p>
+      <w:pPr>
+        <w:pStyle w:val="Heading2"/>
+        <w:spacing w:before="200"/>
+        <w:rPr>
+          <w:rFonts w:ascii="Times New Roman" w:hAnsi="Times New Roman" w:cs="Times New Roman"/>
+          <w:b/>
+          <w:sz w:val="26"/>
+        </w:rPr>
+      </w:pPr>
+      <w:r>
+        <w:rPr>
+          <w:rFonts w:ascii="Times New Roman" w:hAnsi="Times New Roman" w:cs="Times New Roman"/>
+          <w:b/>
+          <w:sz w:val="26"/>
+        </w:rPr>
+        <w:t>git commit and git push -u origin branch-name</w:t>
+      </w:r>
+    </w:p>
+    <w:p>
+      <w:pPr>
+        <w:jc w:val="both"/>
+        <w:rPr>
+          <w:rFonts w:ascii="Times New Roman" w:hAnsi="Times New Roman" w:cs="Times New Roman"/>
+        </w:rPr>
+      </w:pPr>
+      <w:r>
+        <w:rPr>
+          <w:rFonts w:ascii="Times New Roman" w:hAnsi="Times New Roman" w:cs="Times New Roman"/>
+        </w:rPr>
+        <w:t>git commit saves the staged files on the current branch. git push -u origin branch-name uploads that branch to GitHub and remembers it as the upstream, so a later git push on the same branch does not need the branch name again. The picture below is the learning-objectives branch.</w:t>
+      </w:r>
+    </w:p>
+    <w:p>
+      <w:pPr>
+        <w:spacing w:before="120" w:after="40"/>
+        <w:jc w:val="center"/>
+        <w:rPr>
+          <w:rFonts w:ascii="Times New Roman" w:hAnsi="Times New Roman" w:cs="Times New Roman"/>
+        </w:rPr>
+      </w:pPr>
+      <w:r>
+        <w:rPr>
+          <w:rFonts w:ascii="Times New Roman" w:hAnsi="Times New Roman" w:cs="Times New Roman"/>
+          <w:noProof/>
+        </w:rPr>
+        <w:drawing>
+          <wp:inline distT="0" distB="0" distL="0" distR="0" wp14:anchorId="69B9D063" wp14:editId="4CA3F326">
+            <wp:extent cx="5715000" cy="2261577"/>
+            <wp:effectExtent l="0" t="0" r="0" b="5715"/>
+            <wp:docPr id="1398410228" name="Picture 1"/>
+            <wp:cNvGraphicFramePr>
+              <a:graphicFrameLocks xmlns:a="http://schemas.openxmlformats.org/drawingml/2006/main" noChangeAspect="1"/>
+            </wp:cNvGraphicFramePr>
+            <a:graphic xmlns:a="http://schemas.openxmlformats.org/drawingml/2006/main">
+              <a:graphicData uri="http://schemas.openxmlformats.org/drawingml/2006/picture">
+                <pic:pic xmlns:pic="http://schemas.openxmlformats.org/drawingml/2006/picture">
+                  <pic:nvPicPr>
+                    <pic:cNvPr id="1398410228" name=""/>
+                    <pic:cNvPicPr/>
+                  </pic:nvPicPr>
                   <pic:blipFill>
-                    <a:blip r:embed="rId4">
+                    <a:blip r:embed="rId18">
                       <a:extLst>
                         <a:ext uri="{28A0092B-C50C-407E-A947-70E740481C1C}">
                           <a14:useLocalDpi xmlns:a14="http://schemas.microsoft.com/office/drawing/2010/main" val="0"/>
@@ -341,7 +2338,7 @@
                   <pic:spPr>
                     <a:xfrm>
                       <a:off x="0" y="0"/>
-                      <a:ext cx="5715000" cy="841986"/>
+                      <a:ext cx="5715000" cy="2261577"/>
                     </a:xfrm>
                     <a:prstGeom prst="rect">
                       <a:avLst/>
@@ -370,7 +2367,7 @@
           <w:i/>
           <w:sz w:val="22"/>
         </w:rPr>
-        <w:t>Figure 1. Output of git --version.</w:t>
+        <w:t>Figure 11. Creating, committing, and pushing feature/add-objectives.</w:t>
       </w:r>
     </w:p>
     <w:p>
@@ -389,7 +2386,7 @@
           <w:b/>
           <w:sz w:val="26"/>
         </w:rPr>
-        <w:t>git init -b main</w:t>
+        <w:t>git switch main</w:t>
       </w:r>
     </w:p>
     <w:p>
@@ -403,7 +2400,40 @@
         <w:rPr>
           <w:rFonts w:ascii="Times New Roman" w:hAnsi="Times New Roman" w:cs="Times New Roman"/>
         </w:rPr>
-        <w:t>Creates a new local repository in the current folder and names the first branch main. After this command, a hidden .git folder holds the history. Nothing is uploaded yet.</w:t>
+        <w:t>Moves the working folder back to an existing branch. After a pull request is merged on GitHub, the local main branch is still the old commit until it is updated.</w:t>
+      </w:r>
+    </w:p>
+    <w:p>
+      <w:pPr>
+        <w:pStyle w:val="Heading2"/>
+        <w:spacing w:before="200"/>
+        <w:rPr>
+          <w:rFonts w:ascii="Times New Roman" w:hAnsi="Times New Roman" w:cs="Times New Roman"/>
+          <w:b/>
+          <w:sz w:val="26"/>
+        </w:rPr>
+      </w:pPr>
+      <w:r>
+        <w:rPr>
+          <w:rFonts w:ascii="Times New Roman" w:hAnsi="Times New Roman" w:cs="Times New Roman"/>
+          <w:b/>
+          <w:sz w:val="26"/>
+        </w:rPr>
+        <w:t>git pull</w:t>
+      </w:r>
+    </w:p>
+    <w:p>
+      <w:pPr>
+        <w:jc w:val="both"/>
+        <w:rPr>
+          <w:rFonts w:ascii="Times New Roman" w:hAnsi="Times New Roman" w:cs="Times New Roman"/>
+        </w:rPr>
+      </w:pPr>
+      <w:r>
+        <w:rPr>
+          <w:rFonts w:ascii="Times New Roman" w:hAnsi="Times New Roman" w:cs="Times New Roman"/>
+        </w:rPr>
+        <w:t>Downloads the new commits from GitHub and adds them to the current branch. After pull request 4 was merged, git pull on main brought in the learning objectives. Fast-forward means Git only had to move main forward, because main had no extra local commits.</w:t>
       </w:r>
     </w:p>
     <w:p>
@@ -420,10 +2450,10 @@
           <w:noProof/>
         </w:rPr>
         <w:drawing>
-          <wp:inline distT="0" distB="0" distL="0" distR="0" wp14:anchorId="0A17AE4B" wp14:editId="6DC13604">
-            <wp:extent cx="5715000" cy="981197"/>
-            <wp:effectExtent l="0" t="0" r="0" b="9525"/>
-            <wp:docPr id="1485042984" name="Picture 2"/>
+          <wp:inline distT="0" distB="0" distL="0" distR="0" wp14:anchorId="6B124A30" wp14:editId="51A33162">
+            <wp:extent cx="5715000" cy="1662601"/>
+            <wp:effectExtent l="0" t="0" r="0" b="0"/>
+            <wp:docPr id="229141649" name="Picture 2"/>
             <wp:cNvGraphicFramePr>
               <a:graphicFrameLocks xmlns:a="http://schemas.openxmlformats.org/drawingml/2006/main" noChangeAspect="1"/>
             </wp:cNvGraphicFramePr>
@@ -431,11 +2461,11 @@
               <a:graphicData uri="http://schemas.openxmlformats.org/drawingml/2006/picture">
                 <pic:pic xmlns:pic="http://schemas.openxmlformats.org/drawingml/2006/picture">
                   <pic:nvPicPr>
-                    <pic:cNvPr id="1485042984" name=""/>
+                    <pic:cNvPr id="229141649" name=""/>
                     <pic:cNvPicPr/>
                   </pic:nvPicPr>
                   <pic:blipFill>
-                    <a:blip r:embed="rId5">
+                    <a:blip r:embed="rId19">
                       <a:extLst>
                         <a:ext uri="{28A0092B-C50C-407E-A947-70E740481C1C}">
                           <a14:useLocalDpi xmlns:a14="http://schemas.microsoft.com/office/drawing/2010/main" val="0"/>
@@ -449,7 +2479,7 @@
                   <pic:spPr>
                     <a:xfrm>
                       <a:off x="0" y="0"/>
-                      <a:ext cx="5715000" cy="981197"/>
+                      <a:ext cx="5715000" cy="1662601"/>
                     </a:xfrm>
                     <a:prstGeom prst="rect">
                       <a:avLst/>
@@ -478,7 +2508,7 @@
           <w:i/>
           <w:sz w:val="22"/>
         </w:rPr>
-        <w:t>Figure 2. Output of git init -b main.</w:t>
+        <w:t>Figure 12. Switching back to main and pulling the merged objectives.</w:t>
       </w:r>
     </w:p>
     <w:p>
@@ -497,7 +2527,7 @@
           <w:b/>
           <w:sz w:val="26"/>
         </w:rPr>
-        <w:t>git add .</w:t>
+        <w:t>git merge conflict-practice</w:t>
       </w:r>
     </w:p>
     <w:p>
@@ -511,40 +2541,7 @@
         <w:rPr>
           <w:rFonts w:ascii="Times New Roman" w:hAnsi="Times New Roman" w:cs="Times New Roman"/>
         </w:rPr>
-        <w:t>Copies new and modified files into the staging area. The dot means the current folder. The first use staged .gitignore, README.md, and the original C++ file.</w:t>
-      </w:r>
-    </w:p>
-    <w:p>
-      <w:pPr>
-        <w:pStyle w:val="Heading2"/>
-        <w:spacing w:before="200"/>
-        <w:rPr>
-          <w:rFonts w:ascii="Times New Roman" w:hAnsi="Times New Roman" w:cs="Times New Roman"/>
-          <w:b/>
-          <w:sz w:val="26"/>
-        </w:rPr>
-      </w:pPr>
-      <w:r>
-        <w:rPr>
-          <w:rFonts w:ascii="Times New Roman" w:hAnsi="Times New Roman" w:cs="Times New Roman"/>
-          <w:b/>
-          <w:sz w:val="26"/>
-        </w:rPr>
-        <w:t>git status</w:t>
-      </w:r>
-    </w:p>
-    <w:p>
-      <w:pPr>
-        <w:jc w:val="both"/>
-        <w:rPr>
-          <w:rFonts w:ascii="Times New Roman" w:hAnsi="Times New Roman" w:cs="Times New Roman"/>
-        </w:rPr>
-      </w:pPr>
-      <w:r>
-        <w:rPr>
-          <w:rFonts w:ascii="Times New Roman" w:hAnsi="Times New Roman" w:cs="Times New Roman"/>
-        </w:rPr>
-        <w:t>Shows the current branch and lists files that are new, changed, or waiting to be committed. It only reports the state. It does not change files.</w:t>
+        <w:t>Brings the commits from conflict-practice into the current branch, which was main. Both branches had edited the same Purpose sentence in README.md, so Git stopped and marked the file as conflicted. UU in git status means the file is unmerged and needs a decision.</w:t>
       </w:r>
     </w:p>
     <w:p>
@@ -561,10 +2558,10 @@
           <w:noProof/>
         </w:rPr>
         <w:drawing>
-          <wp:inline distT="0" distB="0" distL="0" distR="0" wp14:anchorId="3D15AB75" wp14:editId="7504BD78">
-            <wp:extent cx="5715000" cy="2459404"/>
-            <wp:effectExtent l="0" t="0" r="0" b="0"/>
-            <wp:docPr id="1448779054" name="Picture 3"/>
+          <wp:inline distT="0" distB="0" distL="0" distR="0" wp14:anchorId="290F2261" wp14:editId="3CA60DFE">
+            <wp:extent cx="5715000" cy="1611313"/>
+            <wp:effectExtent l="0" t="0" r="0" b="8255"/>
+            <wp:docPr id="337855582" name="Picture 3"/>
             <wp:cNvGraphicFramePr>
               <a:graphicFrameLocks xmlns:a="http://schemas.openxmlformats.org/drawingml/2006/main" noChangeAspect="1"/>
             </wp:cNvGraphicFramePr>
@@ -572,11 +2569,11 @@
               <a:graphicData uri="http://schemas.openxmlformats.org/drawingml/2006/picture">
                 <pic:pic xmlns:pic="http://schemas.openxmlformats.org/drawingml/2006/picture">
                   <pic:nvPicPr>
-                    <pic:cNvPr id="1448779054" name=""/>
+                    <pic:cNvPr id="337855582" name=""/>
                     <pic:cNvPicPr/>
                   </pic:nvPicPr>
                   <pic:blipFill>
-                    <a:blip r:embed="rId6">
+                    <a:blip r:embed="rId20">
                       <a:extLst>
                         <a:ext uri="{28A0092B-C50C-407E-A947-70E740481C1C}">
                           <a14:useLocalDpi xmlns:a14="http://schemas.microsoft.com/office/drawing/2010/main" val="0"/>
@@ -590,7 +2587,7 @@
                   <pic:spPr>
                     <a:xfrm>
                       <a:off x="0" y="0"/>
-                      <a:ext cx="5715000" cy="2459404"/>
+                      <a:ext cx="5715000" cy="1611313"/>
                     </a:xfrm>
                     <a:prstGeom prst="rect">
                       <a:avLst/>
@@ -619,7 +2616,49 @@
           <w:i/>
           <w:sz w:val="22"/>
         </w:rPr>
-        <w:t>Figure 3. Output of git add . and git status before the first commit.</w:t>
+        <w:t>Figure 13. The merge conflict reported for README.md.</w:t>
+      </w:r>
+    </w:p>
+    <w:p>
+      <w:pPr>
+        <w:jc w:val="both"/>
+        <w:rPr>
+          <w:rFonts w:ascii="Times New Roman" w:hAnsi="Times New Roman" w:cs="Times New Roman"/>
+        </w:rPr>
+      </w:pPr>
+      <w:r>
+        <w:rPr>
+          <w:rFonts w:ascii="Times New Roman" w:hAnsi="Times New Roman" w:cs="Times New Roman"/>
+        </w:rPr>
+        <w:t>The conflicted sentence looked like this. The first block is the main version. The second block is the conflict-practice version. The lines that begin with angle brackets and the line of equals signs are markers, not part of the document.</w:t>
+      </w:r>
+    </w:p>
+    <w:p>
+      <w:pPr>
+        <w:jc w:val="both"/>
+        <w:rPr>
+          <w:rFonts w:ascii="Times New Roman" w:hAnsi="Times New Roman" w:cs="Times New Roman"/>
+        </w:rPr>
+      </w:pPr>
+      <w:r>
+        <w:rPr>
+          <w:rFonts w:ascii="Times New Roman" w:hAnsi="Times New Roman" w:cs="Times New Roman"/>
+        </w:rPr>
+        <w:t>&lt;&lt;&lt;&lt;&lt;&lt;&lt; HEAD   Purpose: Practice the individual Git cycle and a shared team workflow.   =======   Purpose: Practice branching, pull requests, and safe merge conflict resolution.   &gt;&gt;&gt;&gt;&gt;&gt;&gt; conflict-practice</w:t>
+      </w:r>
+    </w:p>
+    <w:p>
+      <w:pPr>
+        <w:jc w:val="both"/>
+        <w:rPr>
+          <w:rFonts w:ascii="Times New Roman" w:hAnsi="Times New Roman" w:cs="Times New Roman"/>
+        </w:rPr>
+      </w:pPr>
+      <w:r>
+        <w:rPr>
+          <w:rFonts w:ascii="Times New Roman" w:hAnsi="Times New Roman" w:cs="Times New Roman"/>
+        </w:rPr>
+        <w:t>The markers were deleted and the two meanings were combined into one sentence: Purpose: Practice the individual Git cycle, pull requests, and safe merge conflict resolution.</w:t>
       </w:r>
     </w:p>
     <w:p>
@@ -638,7 +2677,7 @@
           <w:b/>
           <w:sz w:val="26"/>
         </w:rPr>
-        <w:t>git commit -m "message"</w:t>
+        <w:t>git add README.md and git commit</w:t>
       </w:r>
     </w:p>
     <w:p>
@@ -652,7 +2691,7 @@
         <w:rPr>
           <w:rFonts w:ascii="Times New Roman" w:hAnsi="Times New Roman" w:cs="Times New Roman"/>
         </w:rPr>
-        <w:t>Saves the staged snapshot into the local repository and stores the message with it. The first commit id is 0bdf94b.</w:t>
+        <w:t>After the markers are removed, git add marks the file as resolved. git commit then finishes the merge. This commit has two parents: the main commit and the conflict-practice commit.</w:t>
       </w:r>
     </w:p>
     <w:p>
@@ -669,10 +2708,10 @@
           <w:noProof/>
         </w:rPr>
         <w:drawing>
-          <wp:inline distT="0" distB="0" distL="0" distR="0" wp14:anchorId="1016122D" wp14:editId="123C335B">
-            <wp:extent cx="5715000" cy="1644284"/>
-            <wp:effectExtent l="0" t="0" r="0" b="0"/>
-            <wp:docPr id="2066216469" name="Picture 4"/>
+          <wp:inline distT="0" distB="0" distL="0" distR="0" wp14:anchorId="7FD92266" wp14:editId="6D07E2B8">
+            <wp:extent cx="5715000" cy="1080721"/>
+            <wp:effectExtent l="0" t="0" r="0" b="5715"/>
+            <wp:docPr id="954777170" name="Picture 4"/>
             <wp:cNvGraphicFramePr>
               <a:graphicFrameLocks xmlns:a="http://schemas.openxmlformats.org/drawingml/2006/main" noChangeAspect="1"/>
             </wp:cNvGraphicFramePr>
@@ -680,11 +2719,11 @@
               <a:graphicData uri="http://schemas.openxmlformats.org/drawingml/2006/picture">
                 <pic:pic xmlns:pic="http://schemas.openxmlformats.org/drawingml/2006/picture">
                   <pic:nvPicPr>
-                    <pic:cNvPr id="2066216469" name=""/>
+                    <pic:cNvPr id="954777170" name=""/>
                     <pic:cNvPicPr/>
                   </pic:nvPicPr>
                   <pic:blipFill>
-                    <a:blip r:embed="rId7">
+                    <a:blip r:embed="rId21">
                       <a:extLst>
                         <a:ext uri="{28A0092B-C50C-407E-A947-70E740481C1C}">
                           <a14:useLocalDpi xmlns:a14="http://schemas.microsoft.com/office/drawing/2010/main" val="0"/>
@@ -698,7 +2737,7 @@
                   <pic:spPr>
                     <a:xfrm>
                       <a:off x="0" y="0"/>
-                      <a:ext cx="5715000" cy="1644284"/>
+                      <a:ext cx="5715000" cy="1080721"/>
                     </a:xfrm>
                     <a:prstGeom prst="rect">
                       <a:avLst/>
@@ -727,7 +2766,7 @@
           <w:i/>
           <w:sz w:val="22"/>
         </w:rPr>
-        <w:t>Figure 4. Output of the first git commit.</w:t>
+        <w:t>Figure 14. Completing the merge after the conflict was resolved.</w:t>
       </w:r>
     </w:p>
     <w:p>
@@ -746,7 +2785,7 @@
           <w:b/>
           <w:sz w:val="26"/>
         </w:rPr>
-        <w:t>git remote add origin URL</w:t>
+        <w:t>git log --oneline --decorate --graph</w:t>
       </w:r>
     </w:p>
     <w:p>
@@ -760,40 +2799,7 @@
         <w:rPr>
           <w:rFonts w:ascii="Times New Roman" w:hAnsi="Times New Roman" w:cs="Times New Roman"/>
         </w:rPr>
-        <w:t>Saves the GitHub address under the short name origin. origin is only a nickname. The address is https://github.com/ali-ghiax/Software-Development-Contruction-Lab.git.</w:t>
-      </w:r>
-    </w:p>
-    <w:p>
-      <w:pPr>
-        <w:pStyle w:val="Heading2"/>
-        <w:spacing w:before="200"/>
-        <w:rPr>
-          <w:rFonts w:ascii="Times New Roman" w:hAnsi="Times New Roman" w:cs="Times New Roman"/>
-          <w:b/>
-          <w:sz w:val="26"/>
-        </w:rPr>
-      </w:pPr>
-      <w:r>
-        <w:rPr>
-          <w:rFonts w:ascii="Times New Roman" w:hAnsi="Times New Roman" w:cs="Times New Roman"/>
-          <w:b/>
-          <w:sz w:val="26"/>
-        </w:rPr>
-        <w:t>git remote -v</w:t>
-      </w:r>
-    </w:p>
-    <w:p>
-      <w:pPr>
-        <w:jc w:val="both"/>
-        <w:rPr>
-          <w:rFonts w:ascii="Times New Roman" w:hAnsi="Times New Roman" w:cs="Times New Roman"/>
-        </w:rPr>
-      </w:pPr>
-      <w:r>
-        <w:rPr>
-          <w:rFonts w:ascii="Times New Roman" w:hAnsi="Times New Roman" w:cs="Times New Roman"/>
-        </w:rPr>
-        <w:t>Lists the fetch and push addresses. It was used to confirm that origin points at the correct repository. This command prints the addresses and does not change them.</w:t>
+        <w:t>Prints the history as one line per commit and draws the branch joins. A star is a commit. The lines between stars show where a branch split and where it merged. HEAD -&gt; main, origin/main means the local main branch and GitHub are on the same commit.</w:t>
       </w:r>
     </w:p>
     <w:p>
@@ -810,10 +2816,10 @@
           <w:noProof/>
         </w:rPr>
         <w:drawing>
-          <wp:inline distT="0" distB="0" distL="0" distR="0" wp14:anchorId="2587B48D" wp14:editId="0A51D2E6">
-            <wp:extent cx="5715000" cy="1340216"/>
+          <wp:inline distT="0" distB="0" distL="0" distR="0" wp14:anchorId="24B75553" wp14:editId="48131ABF">
+            <wp:extent cx="5715000" cy="5243024"/>
             <wp:effectExtent l="0" t="0" r="0" b="0"/>
-            <wp:docPr id="595142625" name="Picture 5"/>
+            <wp:docPr id="918950455" name="Picture 5"/>
             <wp:cNvGraphicFramePr>
               <a:graphicFrameLocks xmlns:a="http://schemas.openxmlformats.org/drawingml/2006/main" noChangeAspect="1"/>
             </wp:cNvGraphicFramePr>
@@ -821,11 +2827,11 @@
               <a:graphicData uri="http://schemas.openxmlformats.org/drawingml/2006/picture">
                 <pic:pic xmlns:pic="http://schemas.openxmlformats.org/drawingml/2006/picture">
                   <pic:nvPicPr>
-                    <pic:cNvPr id="595142625" name=""/>
+                    <pic:cNvPr id="918950455" name=""/>
                     <pic:cNvPicPr/>
                   </pic:nvPicPr>
                   <pic:blipFill>
-                    <a:blip r:embed="rId8">
+                    <a:blip r:embed="rId22">
                       <a:extLst>
                         <a:ext uri="{28A0092B-C50C-407E-A947-70E740481C1C}">
                           <a14:useLocalDpi xmlns:a14="http://schemas.microsoft.com/office/drawing/2010/main" val="0"/>
@@ -839,7 +2845,7 @@
                   <pic:spPr>
                     <a:xfrm>
                       <a:off x="0" y="0"/>
-                      <a:ext cx="5715000" cy="1340216"/>
+                      <a:ext cx="5715000" cy="5243024"/>
                     </a:xfrm>
                     <a:prstGeom prst="rect">
                       <a:avLst/>
@@ -868,7 +2874,7 @@
           <w:i/>
           <w:sz w:val="22"/>
         </w:rPr>
-        <w:t>Figure 5. Output of git remote add origin and git remote -v.</w:t>
+        <w:t>Figure 15. Commit graph after the pull requests and the conflict resolution.</w:t>
       </w:r>
     </w:p>
     <w:p>
@@ -887,7 +2893,7 @@
           <w:b/>
           <w:sz w:val="26"/>
         </w:rPr>
-        <w:t>git push -u origin main</w:t>
+        <w:t>git branch -vv</w:t>
       </w:r>
     </w:p>
     <w:p>
@@ -901,40 +2907,7 @@
         <w:rPr>
           <w:rFonts w:ascii="Times New Roman" w:hAnsi="Times New Roman" w:cs="Times New Roman"/>
         </w:rPr>
-        <w:t>Uploads the local main branch to origin. The -u flag remembers that main tracks origin/main, so later uploads can use git push. The first attempt failed because the PC could not open a connection to github.com on port 443.</w:t>
-      </w:r>
-    </w:p>
-    <w:p>
-      <w:pPr>
-        <w:pStyle w:val="Heading2"/>
-        <w:spacing w:before="200"/>
-        <w:rPr>
-          <w:rFonts w:ascii="Times New Roman" w:hAnsi="Times New Roman" w:cs="Times New Roman"/>
-          <w:b/>
-          <w:sz w:val="26"/>
-        </w:rPr>
-      </w:pPr>
-      <w:r>
-        <w:rPr>
-          <w:rFonts w:ascii="Times New Roman" w:hAnsi="Times New Roman" w:cs="Times New Roman"/>
-          <w:b/>
-          <w:sz w:val="26"/>
-        </w:rPr>
-        <w:t>git -c http.version=HTTP/1.1 push -u origin main</w:t>
-      </w:r>
-    </w:p>
-    <w:p>
-      <w:pPr>
-        <w:jc w:val="both"/>
-        <w:rPr>
-          <w:rFonts w:ascii="Times New Roman" w:hAnsi="Times New Roman" w:cs="Times New Roman"/>
-        </w:rPr>
-      </w:pPr>
-      <w:r>
-        <w:rPr>
-          <w:rFonts w:ascii="Times New Roman" w:hAnsi="Times New Roman" w:cs="Times New Roman"/>
-        </w:rPr>
-        <w:t>The same upload, with one temporary setting: use HTTP version 1.1 for this command only. The -c flag does not change the saved Git settings. This attempt succeeded. Git created main on GitHub and set the local branch to track it.</w:t>
+        <w:t>Lists the local branches. The star marks the branch that is checked out. The text in brackets is the matching branch on GitHub. -vv also shows the latest commit message on each branch.</w:t>
       </w:r>
     </w:p>
     <w:p>
@@ -951,10 +2924,10 @@
           <w:noProof/>
         </w:rPr>
         <w:drawing>
-          <wp:inline distT="0" distB="0" distL="0" distR="0" wp14:anchorId="0FC4A1C0" wp14:editId="04E391E4">
-            <wp:extent cx="5715000" cy="2307981"/>
+          <wp:inline distT="0" distB="0" distL="0" distR="0" wp14:anchorId="730DFCDB" wp14:editId="7FCED06B">
+            <wp:extent cx="5715000" cy="1809750"/>
             <wp:effectExtent l="0" t="0" r="0" b="0"/>
-            <wp:docPr id="128006745" name="Picture 6"/>
+            <wp:docPr id="107450034" name="Picture 6"/>
             <wp:cNvGraphicFramePr>
               <a:graphicFrameLocks xmlns:a="http://schemas.openxmlformats.org/drawingml/2006/main" noChangeAspect="1"/>
             </wp:cNvGraphicFramePr>
@@ -962,11 +2935,11 @@
               <a:graphicData uri="http://schemas.openxmlformats.org/drawingml/2006/picture">
                 <pic:pic xmlns:pic="http://schemas.openxmlformats.org/drawingml/2006/picture">
                   <pic:nvPicPr>
-                    <pic:cNvPr id="128006745" name=""/>
+                    <pic:cNvPr id="107450034" name=""/>
                     <pic:cNvPicPr/>
                   </pic:nvPicPr>
                   <pic:blipFill>
-                    <a:blip r:embed="rId9">
+                    <a:blip r:embed="rId23">
                       <a:extLst>
                         <a:ext uri="{28A0092B-C50C-407E-A947-70E740481C1C}">
                           <a14:useLocalDpi xmlns:a14="http://schemas.microsoft.com/office/drawing/2010/main" val="0"/>
@@ -980,7 +2953,7 @@
                   <pic:spPr>
                     <a:xfrm>
                       <a:off x="0" y="0"/>
-                      <a:ext cx="5715000" cy="2307981"/>
+                      <a:ext cx="5715000" cy="1809750"/>
                     </a:xfrm>
                     <a:prstGeom prst="rect">
                       <a:avLst/>
@@ -1009,472 +2982,7 @@
           <w:i/>
           <w:sz w:val="22"/>
         </w:rPr>
-        <w:t>Figure 6. The failed push, then the successful push with HTTP/1.1.</w:t>
-      </w:r>
-    </w:p>
-    <w:p>
-      <w:pPr>
-        <w:pStyle w:val="Heading2"/>
-        <w:spacing w:before="200"/>
-        <w:rPr>
-          <w:rFonts w:ascii="Times New Roman" w:hAnsi="Times New Roman" w:cs="Times New Roman"/>
-          <w:b/>
-          <w:sz w:val="26"/>
-        </w:rPr>
-      </w:pPr>
-      <w:r>
-        <w:rPr>
-          <w:rFonts w:ascii="Times New Roman" w:hAnsi="Times New Roman" w:cs="Times New Roman"/>
-          <w:b/>
-          <w:sz w:val="26"/>
-        </w:rPr>
-        <w:t>git add -A</w:t>
-      </w:r>
-    </w:p>
-    <w:p>
-      <w:pPr>
-        <w:jc w:val="both"/>
-        <w:rPr>
-          <w:rFonts w:ascii="Times New Roman" w:hAnsi="Times New Roman" w:cs="Times New Roman"/>
-        </w:rPr>
-      </w:pPr>
-      <w:r>
-        <w:rPr>
-          <w:rFonts w:ascii="Times New Roman" w:hAnsi="Times New Roman" w:cs="Times New Roman"/>
-        </w:rPr>
-        <w:t>Stages every change, including deleted files. This was required when the program was simplified, because student_result.cpp was removed and hello.cpp was added.</w:t>
-      </w:r>
-    </w:p>
-    <w:p>
-      <w:pPr>
-        <w:pStyle w:val="Heading2"/>
-        <w:spacing w:before="200"/>
-        <w:rPr>
-          <w:rFonts w:ascii="Times New Roman" w:hAnsi="Times New Roman" w:cs="Times New Roman"/>
-          <w:b/>
-          <w:sz w:val="26"/>
-        </w:rPr>
-      </w:pPr>
-      <w:r>
-        <w:rPr>
-          <w:rFonts w:ascii="Times New Roman" w:hAnsi="Times New Roman" w:cs="Times New Roman"/>
-          <w:b/>
-          <w:sz w:val="26"/>
-        </w:rPr>
-        <w:t>Second git commit</w:t>
-      </w:r>
-    </w:p>
-    <w:p>
-      <w:pPr>
-        <w:jc w:val="both"/>
-        <w:rPr>
-          <w:rFonts w:ascii="Times New Roman" w:hAnsi="Times New Roman" w:cs="Times New Roman"/>
-        </w:rPr>
-      </w:pPr>
-      <w:r>
-        <w:rPr>
-          <w:rFonts w:ascii="Times New Roman" w:hAnsi="Times New Roman" w:cs="Times New Roman"/>
-        </w:rPr>
-        <w:t>The second commit, d725f0c, replaced the calculator with the cout program and updated README.md. git diff --cached --stat was used before the commit to review the size of the change: 12 lines added and 169 lines removed.</w:t>
-      </w:r>
-    </w:p>
-    <w:p>
-      <w:pPr>
-        <w:spacing w:before="120" w:after="40"/>
-        <w:jc w:val="center"/>
-        <w:rPr>
-          <w:rFonts w:ascii="Times New Roman" w:hAnsi="Times New Roman" w:cs="Times New Roman"/>
-        </w:rPr>
-      </w:pPr>
-      <w:r>
-        <w:rPr>
-          <w:rFonts w:ascii="Times New Roman" w:hAnsi="Times New Roman" w:cs="Times New Roman"/>
-          <w:noProof/>
-        </w:rPr>
-        <w:drawing>
-          <wp:inline distT="0" distB="0" distL="0" distR="0" wp14:anchorId="54779A97" wp14:editId="6113C20D">
-            <wp:extent cx="5715000" cy="3239111"/>
-            <wp:effectExtent l="0" t="0" r="0" b="0"/>
-            <wp:docPr id="206292167" name="Picture 7"/>
-            <wp:cNvGraphicFramePr>
-              <a:graphicFrameLocks xmlns:a="http://schemas.openxmlformats.org/drawingml/2006/main" noChangeAspect="1"/>
-            </wp:cNvGraphicFramePr>
-            <a:graphic xmlns:a="http://schemas.openxmlformats.org/drawingml/2006/main">
-              <a:graphicData uri="http://schemas.openxmlformats.org/drawingml/2006/picture">
-                <pic:pic xmlns:pic="http://schemas.openxmlformats.org/drawingml/2006/picture">
-                  <pic:nvPicPr>
-                    <pic:cNvPr id="206292167" name=""/>
-                    <pic:cNvPicPr/>
-                  </pic:nvPicPr>
-                  <pic:blipFill>
-                    <a:blip r:embed="rId10">
-                      <a:extLst>
-                        <a:ext uri="{28A0092B-C50C-407E-A947-70E740481C1C}">
-                          <a14:useLocalDpi xmlns:a14="http://schemas.microsoft.com/office/drawing/2010/main" val="0"/>
-                        </a:ext>
-                      </a:extLst>
-                    </a:blip>
-                    <a:stretch>
-                      <a:fillRect/>
-                    </a:stretch>
-                  </pic:blipFill>
-                  <pic:spPr>
-                    <a:xfrm>
-                      <a:off x="0" y="0"/>
-                      <a:ext cx="5715000" cy="3239111"/>
-                    </a:xfrm>
-                    <a:prstGeom prst="rect">
-                      <a:avLst/>
-                    </a:prstGeom>
-                  </pic:spPr>
-                </pic:pic>
-              </a:graphicData>
-            </a:graphic>
-          </wp:inline>
-        </w:drawing>
-      </w:r>
-    </w:p>
-    <w:p>
-      <w:pPr>
-        <w:spacing w:after="200"/>
-        <w:jc w:val="center"/>
-        <w:rPr>
-          <w:rFonts w:ascii="Times New Roman" w:hAnsi="Times New Roman" w:cs="Times New Roman"/>
-          <w:i/>
-          <w:sz w:val="22"/>
-        </w:rPr>
-      </w:pPr>
-      <w:r>
-        <w:rPr>
-          <w:rFonts w:ascii="Times New Roman" w:hAnsi="Times New Roman" w:cs="Times New Roman"/>
-          <w:i/>
-          <w:sz w:val="22"/>
-        </w:rPr>
-        <w:t>Figure 7. Output of git add -A, git status, and the commit that added hello.cpp.</w:t>
-      </w:r>
-    </w:p>
-    <w:p>
-      <w:pPr>
-        <w:pStyle w:val="Heading2"/>
-        <w:spacing w:before="200"/>
-        <w:rPr>
-          <w:rFonts w:ascii="Times New Roman" w:hAnsi="Times New Roman" w:cs="Times New Roman"/>
-          <w:b/>
-          <w:sz w:val="26"/>
-        </w:rPr>
-      </w:pPr>
-      <w:r>
-        <w:rPr>
-          <w:rFonts w:ascii="Times New Roman" w:hAnsi="Times New Roman" w:cs="Times New Roman"/>
-          <w:b/>
-          <w:sz w:val="26"/>
-        </w:rPr>
-        <w:t>git log --oneline --decorate</w:t>
-      </w:r>
-    </w:p>
-    <w:p>
-      <w:pPr>
-        <w:jc w:val="both"/>
-        <w:rPr>
-          <w:rFonts w:ascii="Times New Roman" w:hAnsi="Times New Roman" w:cs="Times New Roman"/>
-        </w:rPr>
-      </w:pPr>
-      <w:r>
-        <w:rPr>
-          <w:rFonts w:ascii="Times New Roman" w:hAnsi="Times New Roman" w:cs="Times New Roman"/>
-        </w:rPr>
-        <w:t>Prints the commit history, one line per commit. --decorate also shows the branch names. HEAD is the current commit. origin/main is the commit GitHub has.</w:t>
-      </w:r>
-    </w:p>
-    <w:p>
-      <w:pPr>
-        <w:spacing w:before="120" w:after="40"/>
-        <w:jc w:val="center"/>
-        <w:rPr>
-          <w:rFonts w:ascii="Times New Roman" w:hAnsi="Times New Roman" w:cs="Times New Roman"/>
-        </w:rPr>
-      </w:pPr>
-      <w:r>
-        <w:rPr>
-          <w:rFonts w:ascii="Times New Roman" w:hAnsi="Times New Roman" w:cs="Times New Roman"/>
-          <w:noProof/>
-        </w:rPr>
-        <w:drawing>
-          <wp:inline distT="0" distB="0" distL="0" distR="0" wp14:anchorId="22B62DFB" wp14:editId="5BDA53EB">
-            <wp:extent cx="5715000" cy="1300529"/>
-            <wp:effectExtent l="0" t="0" r="0" b="0"/>
-            <wp:docPr id="1596266226" name="Picture 8"/>
-            <wp:cNvGraphicFramePr>
-              <a:graphicFrameLocks xmlns:a="http://schemas.openxmlformats.org/drawingml/2006/main" noChangeAspect="1"/>
-            </wp:cNvGraphicFramePr>
-            <a:graphic xmlns:a="http://schemas.openxmlformats.org/drawingml/2006/main">
-              <a:graphicData uri="http://schemas.openxmlformats.org/drawingml/2006/picture">
-                <pic:pic xmlns:pic="http://schemas.openxmlformats.org/drawingml/2006/picture">
-                  <pic:nvPicPr>
-                    <pic:cNvPr id="1596266226" name=""/>
-                    <pic:cNvPicPr/>
-                  </pic:nvPicPr>
-                  <pic:blipFill>
-                    <a:blip r:embed="rId11">
-                      <a:extLst>
-                        <a:ext uri="{28A0092B-C50C-407E-A947-70E740481C1C}">
-                          <a14:useLocalDpi xmlns:a14="http://schemas.microsoft.com/office/drawing/2010/main" val="0"/>
-                        </a:ext>
-                      </a:extLst>
-                    </a:blip>
-                    <a:stretch>
-                      <a:fillRect/>
-                    </a:stretch>
-                  </pic:blipFill>
-                  <pic:spPr>
-                    <a:xfrm>
-                      <a:off x="0" y="0"/>
-                      <a:ext cx="5715000" cy="1300529"/>
-                    </a:xfrm>
-                    <a:prstGeom prst="rect">
-                      <a:avLst/>
-                    </a:prstGeom>
-                  </pic:spPr>
-                </pic:pic>
-              </a:graphicData>
-            </a:graphic>
-          </wp:inline>
-        </w:drawing>
-      </w:r>
-    </w:p>
-    <w:p>
-      <w:pPr>
-        <w:spacing w:after="200"/>
-        <w:jc w:val="center"/>
-        <w:rPr>
-          <w:rFonts w:ascii="Times New Roman" w:hAnsi="Times New Roman" w:cs="Times New Roman"/>
-          <w:i/>
-          <w:sz w:val="22"/>
-        </w:rPr>
-      </w:pPr>
-      <w:r>
-        <w:rPr>
-          <w:rFonts w:ascii="Times New Roman" w:hAnsi="Times New Roman" w:cs="Times New Roman"/>
-          <w:i/>
-          <w:sz w:val="22"/>
-        </w:rPr>
-        <w:t>Figure 8. Output of git log --oneline --decorate.</w:t>
-      </w:r>
-    </w:p>
-    <w:p>
-      <w:pPr>
-        <w:pStyle w:val="Heading2"/>
-        <w:spacing w:before="200"/>
-        <w:rPr>
-          <w:rFonts w:ascii="Times New Roman" w:hAnsi="Times New Roman" w:cs="Times New Roman"/>
-          <w:b/>
-          <w:sz w:val="26"/>
-        </w:rPr>
-      </w:pPr>
-      <w:r>
-        <w:rPr>
-          <w:rFonts w:ascii="Times New Roman" w:hAnsi="Times New Roman" w:cs="Times New Roman"/>
-          <w:b/>
-          <w:sz w:val="26"/>
-        </w:rPr>
-        <w:t>git status after the upload</w:t>
-      </w:r>
-    </w:p>
-    <w:p>
-      <w:pPr>
-        <w:jc w:val="both"/>
-        <w:rPr>
-          <w:rFonts w:ascii="Times New Roman" w:hAnsi="Times New Roman" w:cs="Times New Roman"/>
-        </w:rPr>
-      </w:pPr>
-      <w:r>
-        <w:rPr>
-          <w:rFonts w:ascii="Times New Roman" w:hAnsi="Times New Roman" w:cs="Times New Roman"/>
-        </w:rPr>
-        <w:t>After the report was pushed, git status showed that main matches origin/main and that the working tree is clean. A clean tree means every saved change has already been committed.</w:t>
-      </w:r>
-    </w:p>
-    <w:p>
-      <w:pPr>
-        <w:spacing w:before="120" w:after="40"/>
-        <w:jc w:val="center"/>
-        <w:rPr>
-          <w:rFonts w:ascii="Times New Roman" w:hAnsi="Times New Roman" w:cs="Times New Roman"/>
-        </w:rPr>
-      </w:pPr>
-      <w:r>
-        <w:rPr>
-          <w:rFonts w:ascii="Times New Roman" w:hAnsi="Times New Roman" w:cs="Times New Roman"/>
-          <w:noProof/>
-        </w:rPr>
-        <w:drawing>
-          <wp:inline distT="0" distB="0" distL="0" distR="0" wp14:anchorId="77BE0262" wp14:editId="1B7E24A1">
-            <wp:extent cx="5715000" cy="1399442"/>
-            <wp:effectExtent l="0" t="0" r="0" b="0"/>
-            <wp:docPr id="236343653" name="Picture 9"/>
-            <wp:cNvGraphicFramePr>
-              <a:graphicFrameLocks xmlns:a="http://schemas.openxmlformats.org/drawingml/2006/main" noChangeAspect="1"/>
-            </wp:cNvGraphicFramePr>
-            <a:graphic xmlns:a="http://schemas.openxmlformats.org/drawingml/2006/main">
-              <a:graphicData uri="http://schemas.openxmlformats.org/drawingml/2006/picture">
-                <pic:pic xmlns:pic="http://schemas.openxmlformats.org/drawingml/2006/picture">
-                  <pic:nvPicPr>
-                    <pic:cNvPr id="236343653" name=""/>
-                    <pic:cNvPicPr/>
-                  </pic:nvPicPr>
-                  <pic:blipFill>
-                    <a:blip r:embed="rId12">
-                      <a:extLst>
-                        <a:ext uri="{28A0092B-C50C-407E-A947-70E740481C1C}">
-                          <a14:useLocalDpi xmlns:a14="http://schemas.microsoft.com/office/drawing/2010/main" val="0"/>
-                        </a:ext>
-                      </a:extLst>
-                    </a:blip>
-                    <a:stretch>
-                      <a:fillRect/>
-                    </a:stretch>
-                  </pic:blipFill>
-                  <pic:spPr>
-                    <a:xfrm>
-                      <a:off x="0" y="0"/>
-                      <a:ext cx="5715000" cy="1399442"/>
-                    </a:xfrm>
-                    <a:prstGeom prst="rect">
-                      <a:avLst/>
-                    </a:prstGeom>
-                  </pic:spPr>
-                </pic:pic>
-              </a:graphicData>
-            </a:graphic>
-          </wp:inline>
-        </w:drawing>
-      </w:r>
-    </w:p>
-    <w:p>
-      <w:pPr>
-        <w:spacing w:after="200"/>
-        <w:jc w:val="center"/>
-        <w:rPr>
-          <w:rFonts w:ascii="Times New Roman" w:hAnsi="Times New Roman" w:cs="Times New Roman"/>
-          <w:i/>
-          <w:sz w:val="22"/>
-        </w:rPr>
-      </w:pPr>
-      <w:r>
-        <w:rPr>
-          <w:rFonts w:ascii="Times New Roman" w:hAnsi="Times New Roman" w:cs="Times New Roman"/>
-          <w:i/>
-          <w:sz w:val="22"/>
-        </w:rPr>
-        <w:t>Figure 9. Output of git status after the repository was uploaded.</w:t>
-      </w:r>
-    </w:p>
-    <w:p>
-      <w:pPr>
-        <w:pStyle w:val="Heading2"/>
-        <w:spacing w:before="200"/>
-        <w:rPr>
-          <w:rFonts w:ascii="Times New Roman" w:hAnsi="Times New Roman" w:cs="Times New Roman"/>
-          <w:b/>
-          <w:sz w:val="26"/>
-        </w:rPr>
-      </w:pPr>
-      <w:r>
-        <w:rPr>
-          <w:rFonts w:ascii="Times New Roman" w:hAnsi="Times New Roman" w:cs="Times New Roman"/>
-          <w:b/>
-          <w:sz w:val="26"/>
-        </w:rPr>
-        <w:t>git ls-files</w:t>
-      </w:r>
-    </w:p>
-    <w:p>
-      <w:pPr>
-        <w:jc w:val="both"/>
-        <w:rPr>
-          <w:rFonts w:ascii="Times New Roman" w:hAnsi="Times New Roman" w:cs="Times New Roman"/>
-        </w:rPr>
-      </w:pPr>
-      <w:r>
-        <w:rPr>
-          <w:rFonts w:ascii="Times New Roman" w:hAnsi="Times New Roman" w:cs="Times New Roman"/>
-        </w:rPr>
-        <w:t>Lists the files that Git is tracking. These are the files that were uploaded. Compiled programs are left out because .gitignore tells Git to skip .exe, .o, and .obj files.</w:t>
-      </w:r>
-    </w:p>
-    <w:p>
-      <w:pPr>
-        <w:spacing w:before="120" w:after="40"/>
-        <w:jc w:val="center"/>
-        <w:rPr>
-          <w:rFonts w:ascii="Times New Roman" w:hAnsi="Times New Roman" w:cs="Times New Roman"/>
-        </w:rPr>
-      </w:pPr>
-      <w:r>
-        <w:rPr>
-          <w:rFonts w:ascii="Times New Roman" w:hAnsi="Times New Roman" w:cs="Times New Roman"/>
-          <w:noProof/>
-        </w:rPr>
-        <w:drawing>
-          <wp:inline distT="0" distB="0" distL="0" distR="0" wp14:anchorId="147D0A33" wp14:editId="45CA5AFA">
-            <wp:extent cx="5715000" cy="1368913"/>
-            <wp:effectExtent l="0" t="0" r="0" b="3175"/>
-            <wp:docPr id="45232272" name="Picture 10"/>
-            <wp:cNvGraphicFramePr>
-              <a:graphicFrameLocks xmlns:a="http://schemas.openxmlformats.org/drawingml/2006/main" noChangeAspect="1"/>
-            </wp:cNvGraphicFramePr>
-            <a:graphic xmlns:a="http://schemas.openxmlformats.org/drawingml/2006/main">
-              <a:graphicData uri="http://schemas.openxmlformats.org/drawingml/2006/picture">
-                <pic:pic xmlns:pic="http://schemas.openxmlformats.org/drawingml/2006/picture">
-                  <pic:nvPicPr>
-                    <pic:cNvPr id="45232272" name=""/>
-                    <pic:cNvPicPr/>
-                  </pic:nvPicPr>
-                  <pic:blipFill>
-                    <a:blip r:embed="rId13">
-                      <a:extLst>
-                        <a:ext uri="{28A0092B-C50C-407E-A947-70E740481C1C}">
-                          <a14:useLocalDpi xmlns:a14="http://schemas.microsoft.com/office/drawing/2010/main" val="0"/>
-                        </a:ext>
-                      </a:extLst>
-                    </a:blip>
-                    <a:stretch>
-                      <a:fillRect/>
-                    </a:stretch>
-                  </pic:blipFill>
-                  <pic:spPr>
-                    <a:xfrm>
-                      <a:off x="0" y="0"/>
-                      <a:ext cx="5715000" cy="1368913"/>
-                    </a:xfrm>
-                    <a:prstGeom prst="rect">
-                      <a:avLst/>
-                    </a:prstGeom>
-                  </pic:spPr>
-                </pic:pic>
-              </a:graphicData>
-            </a:graphic>
-          </wp:inline>
-        </w:drawing>
-      </w:r>
-    </w:p>
-    <w:p>
-      <w:pPr>
-        <w:spacing w:after="200"/>
-        <w:jc w:val="center"/>
-        <w:rPr>
-          <w:rFonts w:ascii="Times New Roman" w:hAnsi="Times New Roman" w:cs="Times New Roman"/>
-          <w:i/>
-          <w:sz w:val="22"/>
-        </w:rPr>
-      </w:pPr>
-      <w:r>
-        <w:rPr>
-          <w:rFonts w:ascii="Times New Roman" w:hAnsi="Times New Roman" w:cs="Times New Roman"/>
-          <w:i/>
-          <w:sz w:val="22"/>
-        </w:rPr>
-        <w:t>Figure 10. Output of git ls-files.</w:t>
+        <w:t>Figure 16. Local branches and the GitHub branch each one tracks.</w:t>
       </w:r>
     </w:p>
     <w:p>
@@ -1493,7 +3001,7 @@
           <w:b/>
           <w:sz w:val="32"/>
         </w:rPr>
-        <w:t>5. Files in the repository</w:t>
+        <w:t>9. Conclusion for the workflow lab</w:t>
       </w:r>
     </w:p>
     <w:p>
@@ -1507,40 +3015,7 @@
         <w:rPr>
           <w:rFonts w:ascii="Times New Roman" w:hAnsi="Times New Roman" w:cs="Times New Roman"/>
         </w:rPr>
-        <w:t>hello.cpp is the program. README.md explains what it prints and how to compile it. .gitignore keeps compiled files out of GitHub. This report explains the commands and includes a picture of each command's output.</w:t>
-      </w:r>
-    </w:p>
-    <w:p>
-      <w:pPr>
-        <w:pStyle w:val="Heading1"/>
-        <w:spacing w:before="240" w:after="120"/>
-        <w:rPr>
-          <w:rFonts w:ascii="Times New Roman" w:hAnsi="Times New Roman" w:cs="Times New Roman"/>
-          <w:b/>
-          <w:sz w:val="32"/>
-        </w:rPr>
-      </w:pPr>
-      <w:r>
-        <w:rPr>
-          <w:rFonts w:ascii="Times New Roman" w:hAnsi="Times New Roman" w:cs="Times New Roman"/>
-          <w:b/>
-          <w:sz w:val="32"/>
-        </w:rPr>
-        <w:t>6. Conclusion</w:t>
-      </w:r>
-    </w:p>
-    <w:p>
-      <w:pPr>
-        <w:jc w:val="both"/>
-        <w:rPr>
-          <w:rFonts w:ascii="Times New Roman" w:hAnsi="Times New Roman" w:cs="Times New Roman"/>
-        </w:rPr>
-      </w:pPr>
-      <w:r>
-        <w:rPr>
-          <w:rFonts w:ascii="Times New Roman" w:hAnsi="Times New Roman" w:cs="Times New Roman"/>
-        </w:rPr>
-        <w:t>A simple C++ program that prints two lines with cout is stored in hello.cpp. Git was used to create a local repository, review the files, save the commits, connect the folder to GitHub, and upload the main branch. The first push failed on the network connection. The retry with HTTP/1.1 completed the upload. Each command in this report is shown with the terminal picture of the output it produced. The repository address is https://github.com/ali-ghiax/Software-Development-Contruction-Lab.</w:t>
+        <w:t>The same repository now contains the simple cout program and the Student Task Tracker. Changes for each task were made on a separate branch, pushed, reviewed, and merged with a pull request. The Purpose line in README.md was then changed in two different ways, the merge conflict was resolved by hand, and the result was pushed to main. Working directory means the files currently open for editing. The staging area is what git add prepares. The repository history is the set of commits shown by git log.</w:t>
       </w:r>
     </w:p>
     <w:p>
@@ -1559,6 +3034,56 @@
     </w:sectPr>
   </w:body>
 </w:document>
+</file>
+
+<file path=word/endnotes.xml><?xml version="1.0" encoding="utf-8"?>
+<w:endnotes xmlns:wpc="http://schemas.microsoft.com/office/word/2010/wordprocessingCanvas" xmlns:cx="http://schemas.microsoft.com/office/drawing/2014/chartex" xmlns:cx1="http://schemas.microsoft.com/office/drawing/2015/9/8/chartex" xmlns:cx2="http://schemas.microsoft.com/office/drawing/2015/10/21/chartex" xmlns:cx3="http://schemas.microsoft.com/office/drawing/2016/5/9/chartex" xmlns:cx4="http://schemas.microsoft.com/office/drawing/2016/5/10/chartex" xmlns:cx5="http://schemas.microsoft.com/office/drawing/2016/5/11/chartex" xmlns:cx6="http://schemas.microsoft.com/office/drawing/2016/5/12/chartex" xmlns:cx7="http://schemas.microsoft.com/office/drawing/2016/5/13/chartex" xmlns:cx8="http://schemas.microsoft.com/office/drawing/2016/5/14/chartex" xmlns:mc="http://schemas.openxmlformats.org/markup-compatibility/2006" xmlns:aink="http://schemas.microsoft.com/office/drawing/2016/ink" xmlns:am3d="http://schemas.microsoft.com/office/drawing/2017/model3d" xmlns:o="urn:schemas-microsoft-com:office:office" xmlns:oel="http://schemas.microsoft.com/office/2019/extlst" xmlns:r="http://schemas.openxmlformats.org/officeDocument/2006/relationships" xmlns:m="http://schemas.openxmlformats.org/officeDocument/2006/math" xmlns:v="urn:schemas-microsoft-com:vml" xmlns:wp14="http://schemas.microsoft.com/office/word/2010/wordprocessingDrawing" xmlns:wp="http://schemas.openxmlformats.org/drawingml/2006/wordprocessingDrawing" xmlns:w10="urn:schemas-microsoft-com:office:word" xmlns:w="http://schemas.openxmlformats.org/wordprocessingml/2006/main" xmlns:w14="http://schemas.microsoft.com/office/word/2010/wordml" xmlns:w15="http://schemas.microsoft.com/office/word/2012/wordml" xmlns:w16cex="http://schemas.microsoft.com/office/word/2018/wordml/cex" xmlns:w16cid="http://schemas.microsoft.com/office/word/2016/wordml/cid" xmlns:w16="http://schemas.microsoft.com/office/word/2018/wordml" xmlns:w16du="http://schemas.microsoft.com/office/word/2023/wordml/word16du" xmlns:w16sdtdh="http://schemas.microsoft.com/office/word/2020/wordml/sdtdatahash" xmlns:w16sdtfl="http://schemas.microsoft.com/office/word/2024/wordml/sdtformatlock" xmlns:w16se="http://schemas.microsoft.com/office/word/2015/wordml/symex" xmlns:wpg="http://schemas.microsoft.com/office/word/2010/wordprocessingGroup" xmlns:wpi="http://schemas.microsoft.com/office/word/2010/wordprocessingInk" xmlns:wne="http://schemas.microsoft.com/office/word/2006/wordml" xmlns:wps="http://schemas.microsoft.com/office/word/2010/wordprocessingShape" mc:Ignorable="w14 w15 w16se w16cid w16 w16cex w16sdtdh w16sdtfl w16du wp14">
+  <w:endnote w:type="separator" w:id="-1">
+    <w:p>
+      <w:pPr>
+        <w:spacing w:after="0" w:line="240" w:lineRule="auto"/>
+      </w:pPr>
+      <w:r>
+        <w:separator/>
+      </w:r>
+    </w:p>
+  </w:endnote>
+  <w:endnote w:type="continuationSeparator" w:id="0">
+    <w:p>
+      <w:pPr>
+        <w:spacing w:after="0" w:line="240" w:lineRule="auto"/>
+      </w:pPr>
+      <w:r>
+        <w:continuationSeparator/>
+      </w:r>
+    </w:p>
+  </w:endnote>
+</w:endnotes>
+</file>
+
+<file path=word/footnotes.xml><?xml version="1.0" encoding="utf-8"?>
+<w:footnotes xmlns:wpc="http://schemas.microsoft.com/office/word/2010/wordprocessingCanvas" xmlns:cx="http://schemas.microsoft.com/office/drawing/2014/chartex" xmlns:cx1="http://schemas.microsoft.com/office/drawing/2015/9/8/chartex" xmlns:cx2="http://schemas.microsoft.com/office/drawing/2015/10/21/chartex" xmlns:cx3="http://schemas.microsoft.com/office/drawing/2016/5/9/chartex" xmlns:cx4="http://schemas.microsoft.com/office/drawing/2016/5/10/chartex" xmlns:cx5="http://schemas.microsoft.com/office/drawing/2016/5/11/chartex" xmlns:cx6="http://schemas.microsoft.com/office/drawing/2016/5/12/chartex" xmlns:cx7="http://schemas.microsoft.com/office/drawing/2016/5/13/chartex" xmlns:cx8="http://schemas.microsoft.com/office/drawing/2016/5/14/chartex" xmlns:mc="http://schemas.openxmlformats.org/markup-compatibility/2006" xmlns:aink="http://schemas.microsoft.com/office/drawing/2016/ink" xmlns:am3d="http://schemas.microsoft.com/office/drawing/2017/model3d" xmlns:o="urn:schemas-microsoft-com:office:office" xmlns:oel="http://schemas.microsoft.com/office/2019/extlst" xmlns:r="http://schemas.openxmlformats.org/officeDocument/2006/relationships" xmlns:m="http://schemas.openxmlformats.org/officeDocument/2006/math" xmlns:v="urn:schemas-microsoft-com:vml" xmlns:wp14="http://schemas.microsoft.com/office/word/2010/wordprocessingDrawing" xmlns:wp="http://schemas.openxmlformats.org/drawingml/2006/wordprocessingDrawing" xmlns:w10="urn:schemas-microsoft-com:office:word" xmlns:w="http://schemas.openxmlformats.org/wordprocessingml/2006/main" xmlns:w14="http://schemas.microsoft.com/office/word/2010/wordml" xmlns:w15="http://schemas.microsoft.com/office/word/2012/wordml" xmlns:w16cex="http://schemas.microsoft.com/office/word/2018/wordml/cex" xmlns:w16cid="http://schemas.microsoft.com/office/word/2016/wordml/cid" xmlns:w16="http://schemas.microsoft.com/office/word/2018/wordml" xmlns:w16du="http://schemas.microsoft.com/office/word/2023/wordml/word16du" xmlns:w16sdtdh="http://schemas.microsoft.com/office/word/2020/wordml/sdtdatahash" xmlns:w16sdtfl="http://schemas.microsoft.com/office/word/2024/wordml/sdtformatlock" xmlns:w16se="http://schemas.microsoft.com/office/word/2015/wordml/symex" xmlns:wpg="http://schemas.microsoft.com/office/word/2010/wordprocessingGroup" xmlns:wpi="http://schemas.microsoft.com/office/word/2010/wordprocessingInk" xmlns:wne="http://schemas.microsoft.com/office/word/2006/wordml" xmlns:wps="http://schemas.microsoft.com/office/word/2010/wordprocessingShape" mc:Ignorable="w14 w15 w16se w16cid w16 w16cex w16sdtdh w16sdtfl w16du wp14">
+  <w:footnote w:type="separator" w:id="-1">
+    <w:p>
+      <w:pPr>
+        <w:spacing w:after="0" w:line="240" w:lineRule="auto"/>
+      </w:pPr>
+      <w:r>
+        <w:separator/>
+      </w:r>
+    </w:p>
+  </w:footnote>
+  <w:footnote w:type="continuationSeparator" w:id="0">
+    <w:p>
+      <w:pPr>
+        <w:spacing w:after="0" w:line="240" w:lineRule="auto"/>
+      </w:pPr>
+      <w:r>
+        <w:continuationSeparator/>
+      </w:r>
+    </w:p>
+  </w:footnote>
+</w:footnotes>
 </file>
 
 <file path=word/styles.xml><?xml version="1.0" encoding="utf-8"?>
@@ -2476,6 +4001,121 @@
       <w:spacing w:val="5"/>
     </w:rPr>
   </w:style>
+  <w:style w:type="paragraph" w:styleId="TOCHeading">
+    <w:name w:val="TOC Heading"/>
+    <w:basedOn w:val="Heading1"/>
+    <w:next w:val="Normal"/>
+    <w:uiPriority w:val="39"/>
+    <w:unhideWhenUsed/>
+    <w:qFormat/>
+    <w:rsid w:val="0004369E"/>
+    <w:pPr>
+      <w:spacing w:before="240" w:after="0" w:line="259" w:lineRule="auto"/>
+      <w:outlineLvl w:val="9"/>
+    </w:pPr>
+    <w:rPr>
+      <w:kern w:val="0"/>
+      <w:sz w:val="32"/>
+      <w:szCs w:val="32"/>
+      <w14:ligatures w14:val="none"/>
+    </w:rPr>
+  </w:style>
+  <w:style w:type="paragraph" w:styleId="TOC1">
+    <w:name w:val="toc 1"/>
+    <w:basedOn w:val="Normal"/>
+    <w:next w:val="Normal"/>
+    <w:autoRedefine/>
+    <w:uiPriority w:val="39"/>
+    <w:unhideWhenUsed/>
+    <w:rsid w:val="0004369E"/>
+    <w:pPr>
+      <w:spacing w:after="100"/>
+    </w:pPr>
+  </w:style>
+  <w:style w:type="paragraph" w:styleId="TOC2">
+    <w:name w:val="toc 2"/>
+    <w:basedOn w:val="Normal"/>
+    <w:next w:val="Normal"/>
+    <w:autoRedefine/>
+    <w:uiPriority w:val="39"/>
+    <w:unhideWhenUsed/>
+    <w:rsid w:val="0004369E"/>
+    <w:pPr>
+      <w:spacing w:after="100"/>
+      <w:ind w:left="240"/>
+    </w:pPr>
+  </w:style>
+  <w:style w:type="character" w:styleId="Hyperlink">
+    <w:name w:val="Hyperlink"/>
+    <w:basedOn w:val="DefaultParagraphFont"/>
+    <w:uiPriority w:val="99"/>
+    <w:unhideWhenUsed/>
+    <w:rsid w:val="0004369E"/>
+    <w:rPr>
+      <w:color w:val="467886" w:themeColor="hyperlink"/>
+      <w:u w:val="single"/>
+    </w:rPr>
+  </w:style>
+  <w:style w:type="paragraph" w:styleId="Header">
+    <w:name w:val="header"/>
+    <w:basedOn w:val="Normal"/>
+    <w:link w:val="HeaderChar"/>
+    <w:uiPriority w:val="99"/>
+    <w:unhideWhenUsed/>
+    <w:rsid w:val="0004369E"/>
+    <w:pPr>
+      <w:tabs>
+        <w:tab w:val="center" w:pos="4680"/>
+        <w:tab w:val="right" w:pos="9360"/>
+      </w:tabs>
+      <w:spacing w:after="0" w:line="240" w:lineRule="auto"/>
+    </w:pPr>
+  </w:style>
+  <w:style w:type="character" w:customStyle="1" w:styleId="HeaderChar">
+    <w:name w:val="Header Char"/>
+    <w:basedOn w:val="DefaultParagraphFont"/>
+    <w:link w:val="Header"/>
+    <w:uiPriority w:val="99"/>
+    <w:rsid w:val="0004369E"/>
+  </w:style>
+  <w:style w:type="paragraph" w:styleId="Footer">
+    <w:name w:val="footer"/>
+    <w:basedOn w:val="Normal"/>
+    <w:link w:val="FooterChar"/>
+    <w:uiPriority w:val="99"/>
+    <w:unhideWhenUsed/>
+    <w:rsid w:val="0004369E"/>
+    <w:pPr>
+      <w:tabs>
+        <w:tab w:val="center" w:pos="4680"/>
+        <w:tab w:val="right" w:pos="9360"/>
+      </w:tabs>
+      <w:spacing w:after="0" w:line="240" w:lineRule="auto"/>
+    </w:pPr>
+  </w:style>
+  <w:style w:type="character" w:customStyle="1" w:styleId="FooterChar">
+    <w:name w:val="Footer Char"/>
+    <w:basedOn w:val="DefaultParagraphFont"/>
+    <w:link w:val="Footer"/>
+    <w:uiPriority w:val="99"/>
+    <w:rsid w:val="0004369E"/>
+  </w:style>
+  <w:style w:type="paragraph" w:customStyle="1" w:styleId="StyleCentered">
+    <w:name w:val="Style Centered"/>
+    <w:basedOn w:val="Normal"/>
+    <w:rsid w:val="0004369E"/>
+    <w:pPr>
+      <w:spacing w:after="0" w:line="480" w:lineRule="auto"/>
+      <w:jc w:val="center"/>
+    </w:pPr>
+    <w:rPr>
+      <w:rFonts w:ascii="Palatino Linotype" w:eastAsia="Times New Roman" w:hAnsi="Palatino Linotype" w:cs="Times New Roman"/>
+      <w:kern w:val="0"/>
+      <w:sz w:val="22"/>
+      <w:szCs w:val="20"/>
+      <w14:ligatures w14:val="none"/>
+    </w:rPr>
+  </w:style>
 </w:styles>
 </file>
 
@@ -2792,4 +4432,16 @@
     </a:ext>
   </a:extLst>
 </a:theme>
+</file>
+
+<file path=customXml/item1.xml><?xml version="1.0" encoding="utf-8"?>
+<b:Sources xmlns:b="http://schemas.openxmlformats.org/officeDocument/2006/bibliography" xmlns="http://schemas.openxmlformats.org/officeDocument/2006/bibliography" SelectedStyle="\APASixthEditionOfficeOnline.xsl" StyleName="APA" Version="6"/>
+</file>
+
+<file path=customXml/itemProps1.xml><?xml version="1.0" encoding="utf-8"?>
+<ds:datastoreItem xmlns:ds="http://schemas.openxmlformats.org/officeDocument/2006/customXml" ds:itemID="{085CD90F-BEF2-4E4A-8230-D7F25AFA0A47}">
+  <ds:schemaRefs>
+    <ds:schemaRef ds:uri="http://schemas.openxmlformats.org/officeDocument/2006/bibliography"/>
+  </ds:schemaRefs>
+</ds:datastoreItem>
 </file>
</xml_diff>